<commit_message>
chore: update gitignore and database exclusions, general updates
</commit_message>
<xml_diff>
--- a/frontend/templates/template_prapurna.docx
+++ b/frontend/templates/template_prapurna.docx
@@ -457,6 +457,11 @@
     </w:p>
     <w:p>
       <w:pPr>
+        <w:p>
+          <w:r>
+            <w:t>{#Alamat_Domisili}</w:t>
+          </w:r>
+        </w:p>
         <w:pStyle w:val="6"/>
         <w:numPr>
           <w:ilvl w:val="0"/>
@@ -480,6 +485,11 @@
           <w:szCs w:val="20"/>
         </w:rPr>
         <w:t>Alamat Domisili di {{ alamat_domisili_pemohon | default('', true) }}.{% endif %}</w:t>
+      </w:r>
+    </w:p>
+    <w:p>
+      <w:r>
+        <w:t>{/Alamat_Domisili}</w:t>
       </w:r>
     </w:p>
     <w:p>

</xml_diff>

<commit_message>
feat: update document service and templates, remove db logs
</commit_message>
<xml_diff>
--- a/frontend/templates/template_prapurna.docx
+++ b/frontend/templates/template_prapurna.docx
@@ -5761,12 +5761,15 @@
       <w:r>
         <w:rPr>
           <w:rFonts w:hint="default" w:ascii="Kalinga" w:hAnsi="Kalinga"/>
-          <w:sz w:val="20"/>
-          <w:szCs w:val="20"/>
-          <w:u w:val="single"/>
-        </w:rPr>
-        <w:t>{{ rpc_penghasilan }}</w:t>
-      </w:r>
+          <w:color w:val="auto"/>
+          <w:sz w:val="20"/>
+          <w:szCs w:val="20"/>
+          <w:lang w:val="en-US"/>
+        </w:rPr>
+        <w:t>{{rpc_penghasilan}}</w:t>
+      </w:r>
+      <w:bookmarkStart w:id="52" w:name="_GoBack"/>
+      <w:bookmarkEnd w:id="52"/>
       <w:r>
         <w:rPr>
           <w:rFonts w:hint="default" w:ascii="Kalinga" w:hAnsi="Kalinga"/>
@@ -5874,7 +5877,7 @@
           <w:sz w:val="20"/>
           <w:szCs w:val="20"/>
         </w:rPr>
-        <w:t>{{ rpc_dsc_90 }}</w:t>
+        <w:t>{{rpc_dsc_90}}</w:t>
       </w:r>
       <w:r>
         <w:rPr>
@@ -6593,7 +6596,7 @@
           <w:sz w:val="20"/>
           <w:szCs w:val="20"/>
         </w:rPr>
-        <w:t>{{ rpc_total_angsuran_eksisting }}</w:t>
+        <w:t>{{rpc_total_angsuran_eksisting}}</w:t>
       </w:r>
       <w:r>
         <w:rPr>
@@ -6676,7 +6679,7 @@
           <w:sz w:val="20"/>
           <w:szCs w:val="20"/>
         </w:rPr>
-        <w:t>{{ rpc_maksimal_angsuran }}</w:t>
+        <w:t>{{rpc_maksimal_angsuran}}</w:t>
       </w:r>
       <w:r>
         <w:rPr>
@@ -6877,7 +6880,7 @@
           <w:sz w:val="20"/>
           <w:szCs w:val="20"/>
         </w:rPr>
-        <w:t>{{ rpc_total_angsuran_baru }}</w:t>
+        <w:t>{{rpc_total_angsuran_baru}}</w:t>
       </w:r>
       <w:r>
         <w:rPr>
@@ -6926,7 +6929,7 @@
           <w:sz w:val="20"/>
           <w:szCs w:val="20"/>
         </w:rPr>
-        <w:t>DSR  : {{ rpc_dsr }}%</w:t>
+        <w:t>DSR  : {{rpc_dsr}}%</w:t>
       </w:r>
     </w:p>
     <w:p>
@@ -7432,19 +7435,7 @@
           <w:sz w:val="20"/>
           <w:szCs w:val="20"/>
         </w:rPr>
-        <w:t xml:space="preserve">Syarat </w:t>
-      </w:r>
-      <w:bookmarkStart w:id="52" w:name="_GoBack"/>
-      <w:bookmarkEnd w:id="52"/>
-      <w:r>
-        <w:rPr>
-          <w:rFonts w:ascii="Kalinga" w:hAnsi="Kalinga" w:cs="Kalinga"/>
-          <w:b/>
-          <w:bCs/>
-          <w:sz w:val="20"/>
-          <w:szCs w:val="20"/>
-        </w:rPr>
-        <w:t>Penandatanganan :</w:t>
+        <w:t>Syarat Penandatanganan :</w:t>
       </w:r>
       <w:bookmarkEnd w:id="40"/>
       <w:bookmarkEnd w:id="41"/>

</xml_diff>

<commit_message>
feat: update form tabs, document service, and templates
</commit_message>
<xml_diff>
--- a/frontend/templates/template_prapurna.docx
+++ b/frontend/templates/template_prapurna.docx
@@ -15,25 +15,25 @@
           <w:u w:val="single"/>
         </w:rPr>
       </w:pPr>
-      <w:bookmarkStart w:id="0" w:name="OLE_LINK28"/>
-      <w:bookmarkStart w:id="1" w:name="OLE_LINK55"/>
-      <w:bookmarkStart w:id="2" w:name="OLE_LINK62"/>
+      <w:bookmarkStart w:id="0" w:name="OLE_LINK55"/>
+      <w:bookmarkStart w:id="1" w:name="OLE_LINK66"/>
+      <w:bookmarkStart w:id="2" w:name="OLE_LINK5"/>
       <w:bookmarkStart w:id="3" w:name="OLE_LINK51"/>
-      <w:bookmarkStart w:id="4" w:name="OLE_LINK38"/>
-      <w:bookmarkStart w:id="5" w:name="OLE_LINK5"/>
-      <w:bookmarkStart w:id="6" w:name="OLE_LINK66"/>
-      <w:bookmarkStart w:id="7" w:name="OLE_LINK29"/>
-      <w:bookmarkStart w:id="8" w:name="OLE_LINK7"/>
-      <w:bookmarkStart w:id="9" w:name="OLE_LINK37"/>
-      <w:bookmarkStart w:id="10" w:name="OLE_LINK67"/>
-      <w:bookmarkStart w:id="11" w:name="OLE_LINK8"/>
-      <w:bookmarkStart w:id="12" w:name="OLE_LINK48"/>
-      <w:bookmarkStart w:id="13" w:name="OLE_LINK56"/>
-      <w:bookmarkStart w:id="14" w:name="OLE_LINK87"/>
-      <w:bookmarkStart w:id="15" w:name="OLE_LINK89"/>
-      <w:bookmarkStart w:id="16" w:name="OLE_LINK49"/>
-      <w:bookmarkStart w:id="17" w:name="OLE_LINK36"/>
-      <w:bookmarkStart w:id="18" w:name="OLE_LINK3"/>
+      <w:bookmarkStart w:id="4" w:name="OLE_LINK28"/>
+      <w:bookmarkStart w:id="5" w:name="OLE_LINK29"/>
+      <w:bookmarkStart w:id="6" w:name="OLE_LINK62"/>
+      <w:bookmarkStart w:id="7" w:name="OLE_LINK38"/>
+      <w:bookmarkStart w:id="8" w:name="OLE_LINK89"/>
+      <w:bookmarkStart w:id="9" w:name="OLE_LINK56"/>
+      <w:bookmarkStart w:id="10" w:name="OLE_LINK3"/>
+      <w:bookmarkStart w:id="11" w:name="OLE_LINK67"/>
+      <w:bookmarkStart w:id="12" w:name="OLE_LINK36"/>
+      <w:bookmarkStart w:id="13" w:name="OLE_LINK48"/>
+      <w:bookmarkStart w:id="14" w:name="OLE_LINK8"/>
+      <w:bookmarkStart w:id="15" w:name="OLE_LINK49"/>
+      <w:bookmarkStart w:id="16" w:name="OLE_LINK7"/>
+      <w:bookmarkStart w:id="17" w:name="OLE_LINK37"/>
+      <w:bookmarkStart w:id="18" w:name="OLE_LINK87"/>
       <w:bookmarkStart w:id="19" w:name="OLE_LINK44"/>
       <w:bookmarkStart w:id="20" w:name="OLE_LINK17"/>
       <w:r>
@@ -765,7 +765,7 @@
           <w:szCs w:val="20"/>
           <w:lang w:val="en-US"/>
         </w:rPr>
-        <w:t xml:space="preserve">merupakan Calon Pensiunan </w:t>
+        <w:t xml:space="preserve">merupakan Calon Pensiunan PNS </w:t>
       </w:r>
       <w:r>
         <w:rPr>
@@ -1976,17 +1976,17 @@
       </w:pPr>
       <w:bookmarkStart w:id="21" w:name="OLE_LINK71"/>
       <w:bookmarkStart w:id="22" w:name="OLE_LINK73"/>
-      <w:bookmarkStart w:id="23" w:name="OLE_LINK39"/>
-      <w:bookmarkStart w:id="24" w:name="OLE_LINK68"/>
-      <w:bookmarkStart w:id="25" w:name="OLE_LINK20"/>
-      <w:bookmarkStart w:id="26" w:name="OLE_LINK88"/>
-      <w:bookmarkStart w:id="27" w:name="OLE_LINK45"/>
-      <w:bookmarkStart w:id="28" w:name="OLE_LINK63"/>
-      <w:bookmarkStart w:id="29" w:name="OLE_LINK52"/>
-      <w:bookmarkStart w:id="30" w:name="OLE_LINK21"/>
-      <w:bookmarkStart w:id="31" w:name="OLE_LINK61"/>
-      <w:bookmarkStart w:id="32" w:name="OLE_LINK90"/>
-      <w:bookmarkStart w:id="33" w:name="OLE_LINK10"/>
+      <w:bookmarkStart w:id="23" w:name="OLE_LINK68"/>
+      <w:bookmarkStart w:id="24" w:name="OLE_LINK20"/>
+      <w:bookmarkStart w:id="25" w:name="OLE_LINK21"/>
+      <w:bookmarkStart w:id="26" w:name="OLE_LINK63"/>
+      <w:bookmarkStart w:id="27" w:name="OLE_LINK61"/>
+      <w:bookmarkStart w:id="28" w:name="OLE_LINK10"/>
+      <w:bookmarkStart w:id="29" w:name="OLE_LINK88"/>
+      <w:bookmarkStart w:id="30" w:name="OLE_LINK45"/>
+      <w:bookmarkStart w:id="31" w:name="OLE_LINK52"/>
+      <w:bookmarkStart w:id="32" w:name="OLE_LINK39"/>
+      <w:bookmarkStart w:id="33" w:name="OLE_LINK90"/>
       <w:bookmarkStart w:id="34" w:name="OLE_LINK54"/>
       <w:r>
         <w:rPr>
@@ -3265,16 +3265,6 @@
           <w:szCs w:val="20"/>
           <w:lang w:val="en-US"/>
         </w:rPr>
-        <w:tab/>
-      </w:r>
-      <w:r>
-        <w:rPr>
-          <w:rFonts w:hint="default" w:ascii="Kalinga" w:hAnsi="Kalinga"/>
-          <w:color w:val="auto"/>
-          <w:sz w:val="20"/>
-          <w:szCs w:val="20"/>
-          <w:lang w:val="en-US"/>
-        </w:rPr>
         <w:t>{{jabatan}}.</w:t>
       </w:r>
     </w:p>
@@ -4138,16 +4128,6 @@
           <w:szCs w:val="20"/>
           <w:lang w:val="en-US"/>
         </w:rPr>
-        <w:tab/>
-      </w:r>
-      <w:r>
-        <w:rPr>
-          <w:rFonts w:hint="default" w:ascii="Kalinga" w:hAnsi="Kalinga"/>
-          <w:color w:val="auto"/>
-          <w:sz w:val="20"/>
-          <w:szCs w:val="20"/>
-          <w:lang w:val="en-US"/>
-        </w:rPr>
         <w:t>{{jabatan}}.</w:t>
       </w:r>
     </w:p>
@@ -4500,28 +4480,7 @@
           <w:sz w:val="20"/>
           <w:szCs w:val="20"/>
         </w:rPr>
-        <w:t>{% if segmentasi == 'asabri' %}</w:t>
-      </w:r>
-      <w:r>
-        <w:rPr>
-          <w:rFonts w:hint="default" w:ascii="Kalinga" w:hAnsi="Kalinga"/>
-          <w:b/>
-          <w:bCs/>
-          <w:sz w:val="20"/>
-          <w:szCs w:val="20"/>
-          <w:lang w:val="en-US"/>
-        </w:rPr>
-        <w:t>Aplikasi ASABRI Mobile</w:t>
-      </w:r>
-      <w:r>
-        <w:rPr>
-          <w:rFonts w:hint="default" w:ascii="Kalinga" w:hAnsi="Kalinga"/>
-          <w:b/>
-          <w:bCs/>
-          <w:sz w:val="20"/>
-          <w:szCs w:val="20"/>
-        </w:rPr>
-        <w:t>{% else %}Browsing Internet di alamat www.flagging.taspen.co.id{% endif %}</w:t>
+        <w:t>Browsing Internet di alamat www.flagging.taspen.co.id</w:t>
       </w:r>
       <w:r>
         <w:rPr>
@@ -4630,59 +4589,12 @@
       </w:pPr>
       <w:r>
         <w:rPr>
-          <w:rFonts w:hint="default" w:ascii="Kalinga" w:hAnsi="Kalinga"/>
-          <w:color w:val="auto"/>
-          <w:sz w:val="20"/>
-          <w:szCs w:val="20"/>
-        </w:rPr>
-        <w:t>{% if segmentasi == 'asabri' %}</w:t>
-      </w:r>
-      <w:r>
-        <w:rPr>
-          <w:rFonts w:hint="default" w:ascii="Kalinga" w:hAnsi="Kalinga"/>
-          <w:color w:val="auto"/>
-          <w:sz w:val="20"/>
-          <w:szCs w:val="20"/>
-          <w:lang w:val="en-US"/>
-        </w:rPr>
-        <w:t>Aplikasi ASABRI Mobile</w:t>
-      </w:r>
-      <w:r>
-        <w:rPr>
-          <w:rFonts w:hint="default" w:ascii="Kalinga" w:hAnsi="Kalinga"/>
-          <w:color w:val="auto"/>
-          <w:sz w:val="20"/>
-          <w:szCs w:val="20"/>
-        </w:rPr>
-        <w:t>{% else %}</w:t>
-      </w:r>
-      <w:r>
-        <w:rPr>
           <w:rFonts w:ascii="Kalinga" w:hAnsi="Kalinga" w:cs="Kalinga"/>
           <w:color w:val="auto"/>
           <w:sz w:val="20"/>
           <w:szCs w:val="20"/>
         </w:rPr>
         <w:t>Estimasi Hak Tabungan Hari Tua dan Pensiun Pokok</w:t>
-      </w:r>
-      <w:r>
-        <w:rPr>
-          <w:rFonts w:hint="default" w:ascii="Kalinga" w:hAnsi="Kalinga"/>
-          <w:color w:val="auto"/>
-          <w:sz w:val="20"/>
-          <w:szCs w:val="20"/>
-        </w:rPr>
-        <w:t>{% endif %}</w:t>
-      </w:r>
-      <w:r>
-        <w:rPr>
-          <w:rFonts w:hint="default" w:ascii="Kalinga" w:hAnsi="Kalinga" w:cs="Kalinga"/>
-          <w:color w:val="auto"/>
-          <w:sz w:val="20"/>
-          <w:szCs w:val="20"/>
-          <w:lang w:val="en-US"/>
-        </w:rPr>
-        <w:t>.</w:t>
       </w:r>
     </w:p>
     <w:p>
@@ -4751,7 +4663,27 @@
           <w:szCs w:val="20"/>
           <w:lang w:val="en-US"/>
         </w:rPr>
-        <w:t>THT +/- Rp. {{taspen_tht}},-.</w:t>
+        <w:t xml:space="preserve">THT +/- Rp. </w:t>
+      </w:r>
+      <w:r>
+        <w:rPr>
+          <w:rFonts w:hint="default" w:ascii="Kalinga" w:hAnsi="Kalinga"/>
+          <w:color w:val="auto"/>
+          <w:sz w:val="20"/>
+          <w:szCs w:val="20"/>
+          <w:lang w:val="en-US"/>
+        </w:rPr>
+        <w:t>{{estimasi_tht}}</w:t>
+      </w:r>
+      <w:r>
+        <w:rPr>
+          <w:rFonts w:hint="default" w:ascii="Kalinga" w:hAnsi="Kalinga" w:cs="Kalinga"/>
+          <w:color w:val="auto"/>
+          <w:sz w:val="20"/>
+          <w:szCs w:val="20"/>
+          <w:lang w:val="en-US"/>
+        </w:rPr>
+        <w:t>,-.</w:t>
       </w:r>
     </w:p>
     <w:p>
@@ -4800,6 +4732,7 @@
       <w:r>
         <w:rPr>
           <w:rFonts w:hint="default" w:ascii="Kalinga" w:hAnsi="Kalinga"/>
+          <w:color w:val="auto"/>
           <w:sz w:val="20"/>
           <w:szCs w:val="20"/>
           <w:lang w:val="en-US"/>
@@ -4809,14 +4742,16 @@
       <w:r>
         <w:rPr>
           <w:rFonts w:hint="default" w:ascii="Kalinga" w:hAnsi="Kalinga"/>
-          <w:sz w:val="20"/>
-          <w:szCs w:val="20"/>
-        </w:rPr>
-        <w:t>taspen_hak_pensiun</w:t>
-      </w:r>
-      <w:r>
-        <w:rPr>
-          <w:rFonts w:hint="default" w:ascii="Kalinga" w:hAnsi="Kalinga"/>
+          <w:color w:val="auto"/>
+          <w:sz w:val="20"/>
+          <w:szCs w:val="20"/>
+        </w:rPr>
+        <w:t>estimasi_hak_pensiun</w:t>
+      </w:r>
+      <w:r>
+        <w:rPr>
+          <w:rFonts w:hint="default" w:ascii="Kalinga" w:hAnsi="Kalinga"/>
+          <w:color w:val="auto"/>
           <w:sz w:val="20"/>
           <w:szCs w:val="20"/>
           <w:lang w:val="en-US"/>
@@ -5129,28 +5064,7 @@
           <w:szCs w:val="20"/>
           <w:lang w:val="en-US"/>
         </w:rPr>
-        <w:t>{{</w:t>
-      </w:r>
-      <w:r>
-        <w:rPr>
-          <w:rFonts w:hint="default" w:ascii="Kalinga" w:hAnsi="Kalinga"/>
-          <w:b/>
-          <w:bCs/>
-          <w:sz w:val="20"/>
-          <w:szCs w:val="20"/>
-        </w:rPr>
-        <w:t>no_telp_kerabat</w:t>
-      </w:r>
-      <w:r>
-        <w:rPr>
-          <w:rFonts w:hint="default" w:ascii="Kalinga" w:hAnsi="Kalinga"/>
-          <w:b/>
-          <w:bCs/>
-          <w:sz w:val="20"/>
-          <w:szCs w:val="20"/>
-          <w:lang w:val="en-US"/>
-        </w:rPr>
-        <w:t>}}</w:t>
+        <w:t>{{no_telepon_kerabat}}</w:t>
       </w:r>
       <w:r>
         <w:rPr>
@@ -5304,17 +5218,36 @@
           <w:szCs w:val="20"/>
           <w:lang w:val="en-US"/>
         </w:rPr>
-        <w:t>{% if segmentasi == 'asabri' %}Calon Pensiunan Anggota{% else %}Calon Pensiunan PNS{% endif %}</w:t>
-      </w:r>
-      <w:r>
-        <w:rPr>
-          <w:rFonts w:hint="default" w:ascii="Kalinga" w:hAnsi="Kalinga" w:cs="Kalinga"/>
-          <w:color w:val="auto"/>
-          <w:sz w:val="20"/>
-          <w:szCs w:val="20"/>
-          <w:lang w:val="en-US"/>
-        </w:rPr>
-        <w:t xml:space="preserve"> di {{nama_instansi_pemohon}}.</w:t>
+        <w:t>Calon Pensiunan PNS</w:t>
+      </w:r>
+      <w:r>
+        <w:rPr>
+          <w:rFonts w:hint="default" w:ascii="Kalinga" w:hAnsi="Kalinga" w:cs="Kalinga"/>
+          <w:color w:val="auto"/>
+          <w:sz w:val="20"/>
+          <w:szCs w:val="20"/>
+          <w:lang w:val="en-US"/>
+        </w:rPr>
+        <w:t xml:space="preserve"> di </w:t>
+      </w:r>
+      <w:r>
+        <w:rPr>
+          <w:rFonts w:hint="default" w:ascii="Kalinga" w:hAnsi="Kalinga"/>
+          <w:color w:val="auto"/>
+          <w:sz w:val="20"/>
+          <w:szCs w:val="20"/>
+        </w:rPr>
+        <w:t>{{instansi}}</w:t>
+      </w:r>
+      <w:r>
+        <w:rPr>
+          <w:rFonts w:hint="default" w:ascii="Kalinga" w:hAnsi="Kalinga" w:cs="Kalinga"/>
+          <w:color w:val="auto"/>
+          <w:sz w:val="20"/>
+          <w:szCs w:val="20"/>
+          <w:lang w:val="en-US"/>
+        </w:rPr>
+        <w:t>.</w:t>
       </w:r>
     </w:p>
     <w:p>
@@ -5343,7 +5276,26 @@
           <w:szCs w:val="20"/>
           <w:lang w:val="en-US"/>
         </w:rPr>
-        <w:t>Menurut Ybs. rumah yang di tempati Pemohon saat ini adalah Rumah {{status_rumah_pemohon}}.</w:t>
+        <w:t xml:space="preserve">Menurut Ybs. rumah yang di tempati Pemohon saat ini adalah Rumah </w:t>
+      </w:r>
+      <w:r>
+        <w:rPr>
+          <w:rFonts w:hint="default" w:ascii="Kalinga" w:hAnsi="Kalinga"/>
+          <w:color w:val="auto"/>
+          <w:sz w:val="20"/>
+          <w:szCs w:val="20"/>
+        </w:rPr>
+        <w:t>{{status_rumah}}</w:t>
+      </w:r>
+      <w:r>
+        <w:rPr>
+          <w:rFonts w:hint="default" w:ascii="Kalinga" w:hAnsi="Kalinga" w:cs="Kalinga"/>
+          <w:color w:val="auto"/>
+          <w:sz w:val="20"/>
+          <w:szCs w:val="20"/>
+          <w:lang w:val="en-US"/>
+        </w:rPr>
+        <w:t>.</w:t>
       </w:r>
     </w:p>
     <w:p>
@@ -5768,8 +5720,6 @@
         </w:rPr>
         <w:t>{{rpc_penghasilan}}</w:t>
       </w:r>
-      <w:bookmarkStart w:id="52" w:name="_GoBack"/>
-      <w:bookmarkEnd w:id="52"/>
       <w:r>
         <w:rPr>
           <w:rFonts w:hint="default" w:ascii="Kalinga" w:hAnsi="Kalinga"/>
@@ -6422,6 +6372,7 @@
       <w:pPr>
         <w:pStyle w:val="6"/>
         <w:numPr>
+          <w:ilvl w:val="0"/>
           <w:numId w:val="0"/>
         </w:numPr>
         <w:spacing w:line="240" w:lineRule="auto"/>
@@ -6474,6 +6425,7 @@
       <w:pPr>
         <w:pStyle w:val="6"/>
         <w:numPr>
+          <w:ilvl w:val="0"/>
           <w:numId w:val="0"/>
         </w:numPr>
         <w:spacing w:line="240" w:lineRule="auto"/>
@@ -7052,39 +7004,13 @@
           <w:rFonts w:hint="default" w:ascii="Kalinga" w:hAnsi="Kalinga"/>
           <w:b/>
           <w:bCs/>
-          <w:color w:val="auto"/>
-          <w:sz w:val="20"/>
-          <w:szCs w:val="20"/>
-          <w:u w:val="none"/>
-          <w:lang w:val="en-US"/>
-        </w:rPr>
-        <w:t>{{</w:t>
-      </w:r>
-      <w:r>
-        <w:rPr>
-          <w:rFonts w:hint="default" w:ascii="Kalinga" w:hAnsi="Kalinga"/>
-          <w:b/>
-          <w:bCs/>
-          <w:color w:val="auto"/>
-          <w:sz w:val="20"/>
-          <w:szCs w:val="20"/>
-          <w:u w:val="none"/>
-        </w:rPr>
-        <w:t>dsr_pemohon</w:t>
-      </w:r>
-      <w:r>
-        <w:rPr>
-          <w:rFonts w:hint="default" w:ascii="Kalinga" w:hAnsi="Kalinga"/>
-          <w:b/>
-          <w:bCs/>
-          <w:color w:val="auto"/>
-          <w:sz w:val="20"/>
-          <w:szCs w:val="20"/>
-          <w:u w:val="none"/>
-          <w:lang w:val="en-US"/>
-        </w:rPr>
-        <w:t>}}</w:t>
-      </w:r>
+          <w:sz w:val="20"/>
+          <w:szCs w:val="20"/>
+        </w:rPr>
+        <w:t>{{rpc_dsr}}</w:t>
+      </w:r>
+      <w:bookmarkStart w:id="52" w:name="_GoBack"/>
+      <w:bookmarkEnd w:id="52"/>
       <w:r>
         <w:rPr>
           <w:rFonts w:hint="default" w:ascii="Kalinga" w:hAnsi="Kalinga"/>
@@ -7501,13 +7427,13 @@
           <w:szCs w:val="20"/>
         </w:rPr>
       </w:pPr>
-      <w:bookmarkStart w:id="45" w:name="OLE_LINK58"/>
-      <w:bookmarkStart w:id="46" w:name="OLE_LINK64"/>
-      <w:bookmarkStart w:id="47" w:name="OLE_LINK24"/>
-      <w:bookmarkStart w:id="48" w:name="OLE_LINK13"/>
-      <w:bookmarkStart w:id="49" w:name="OLE_LINK70"/>
-      <w:bookmarkStart w:id="50" w:name="OLE_LINK23"/>
-      <w:bookmarkStart w:id="51" w:name="OLE_LINK40"/>
+      <w:bookmarkStart w:id="45" w:name="OLE_LINK13"/>
+      <w:bookmarkStart w:id="46" w:name="OLE_LINK40"/>
+      <w:bookmarkStart w:id="47" w:name="OLE_LINK70"/>
+      <w:bookmarkStart w:id="48" w:name="OLE_LINK58"/>
+      <w:bookmarkStart w:id="49" w:name="OLE_LINK24"/>
+      <w:bookmarkStart w:id="50" w:name="OLE_LINK64"/>
+      <w:bookmarkStart w:id="51" w:name="OLE_LINK23"/>
       <w:r>
         <w:rPr>
           <w:rFonts w:ascii="Kalinga" w:hAnsi="Kalinga" w:cs="Kalinga"/>

</xml_diff>

<commit_message>
Enhance document generation: dynamic lists, optimized SLIK mapping, and template updates
</commit_message>
<xml_diff>
--- a/frontend/templates/template_prapurna.docx
+++ b/frontend/templates/template_prapurna.docx
@@ -15,27 +15,27 @@
           <w:u w:val="single"/>
         </w:rPr>
       </w:pPr>
-      <w:bookmarkStart w:id="0" w:name="OLE_LINK38"/>
-      <w:bookmarkStart w:id="1" w:name="OLE_LINK62"/>
-      <w:bookmarkStart w:id="2" w:name="OLE_LINK28"/>
+      <w:bookmarkStart w:id="0" w:name="OLE_LINK66"/>
+      <w:bookmarkStart w:id="1" w:name="OLE_LINK38"/>
+      <w:bookmarkStart w:id="2" w:name="OLE_LINK62"/>
       <w:bookmarkStart w:id="3" w:name="OLE_LINK55"/>
       <w:bookmarkStart w:id="4" w:name="OLE_LINK29"/>
-      <w:bookmarkStart w:id="5" w:name="OLE_LINK5"/>
-      <w:bookmarkStart w:id="6" w:name="OLE_LINK51"/>
-      <w:bookmarkStart w:id="7" w:name="OLE_LINK66"/>
+      <w:bookmarkStart w:id="5" w:name="OLE_LINK28"/>
+      <w:bookmarkStart w:id="6" w:name="OLE_LINK5"/>
+      <w:bookmarkStart w:id="7" w:name="OLE_LINK51"/>
       <w:bookmarkStart w:id="8" w:name="OLE_LINK3"/>
-      <w:bookmarkStart w:id="9" w:name="OLE_LINK36"/>
-      <w:bookmarkStart w:id="10" w:name="OLE_LINK37"/>
-      <w:bookmarkStart w:id="11" w:name="OLE_LINK89"/>
-      <w:bookmarkStart w:id="12" w:name="OLE_LINK56"/>
-      <w:bookmarkStart w:id="13" w:name="OLE_LINK49"/>
-      <w:bookmarkStart w:id="14" w:name="OLE_LINK87"/>
-      <w:bookmarkStart w:id="15" w:name="OLE_LINK48"/>
-      <w:bookmarkStart w:id="16" w:name="OLE_LINK44"/>
-      <w:bookmarkStart w:id="17" w:name="OLE_LINK17"/>
-      <w:bookmarkStart w:id="18" w:name="OLE_LINK67"/>
+      <w:bookmarkStart w:id="9" w:name="OLE_LINK56"/>
+      <w:bookmarkStart w:id="10" w:name="OLE_LINK87"/>
+      <w:bookmarkStart w:id="11" w:name="OLE_LINK36"/>
+      <w:bookmarkStart w:id="12" w:name="OLE_LINK44"/>
+      <w:bookmarkStart w:id="13" w:name="OLE_LINK37"/>
+      <w:bookmarkStart w:id="14" w:name="OLE_LINK17"/>
+      <w:bookmarkStart w:id="15" w:name="OLE_LINK89"/>
+      <w:bookmarkStart w:id="16" w:name="OLE_LINK48"/>
+      <w:bookmarkStart w:id="17" w:name="OLE_LINK7"/>
+      <w:bookmarkStart w:id="18" w:name="OLE_LINK49"/>
       <w:bookmarkStart w:id="19" w:name="OLE_LINK8"/>
-      <w:bookmarkStart w:id="20" w:name="OLE_LINK7"/>
+      <w:bookmarkStart w:id="20" w:name="OLE_LINK67"/>
       <w:r>
         <w:rPr>
           <w:rFonts w:hint="default" w:ascii="Kalinga" w:hAnsi="Kalinga"/>
@@ -401,25 +401,28 @@
     </w:p>
     <w:p>
       <w:pPr>
-        <w:pStyle w:val="6"/>
-        <w:spacing w:line="240" w:lineRule="auto"/>
-        <w:ind w:right="160"/>
-        <w:jc w:val="both"/>
-        <w:rPr>
-          <w:rFonts w:hint="default" w:ascii="Kalinga" w:hAnsi="Kalinga"/>
-          <w:color w:val="auto"/>
-          <w:sz w:val="20"/>
-          <w:szCs w:val="20"/>
-        </w:rPr>
-      </w:pPr>
-      <w:r>
-        <w:rPr>
-          <w:rFonts w:hint="default" w:ascii="Kalinga" w:hAnsi="Kalinga"/>
-          <w:color w:val="auto"/>
-          <w:sz w:val="20"/>
-          <w:szCs w:val="20"/>
-        </w:rPr>
-        <w:t>-{{text}}</w:t>
+        <w:numPr>
+          <w:ilvl w:val="0"/>
+          <w:numId w:val="1"/>
+        </w:numPr>
+        <w:spacing w:after="0" w:line="240" w:lineRule="auto"/>
+        <w:ind w:left="440" w:leftChars="0" w:hanging="360" w:firstLineChars="0"/>
+        <w:jc w:val="both"/>
+        <w:rPr>
+          <w:rFonts w:hint="default" w:ascii="Kalinga" w:hAnsi="Kalinga"/>
+          <w:color w:val="auto"/>
+          <w:sz w:val="20"/>
+          <w:szCs w:val="20"/>
+        </w:rPr>
+      </w:pPr>
+      <w:r>
+        <w:rPr>
+          <w:rFonts w:hint="default" w:ascii="Kalinga" w:hAnsi="Kalinga"/>
+          <w:color w:val="auto"/>
+          <w:sz w:val="20"/>
+          <w:szCs w:val="20"/>
+        </w:rPr>
+        <w:t>{{text}}</w:t>
       </w:r>
     </w:p>
     <w:p>
@@ -572,6 +575,36 @@
     </w:p>
     <w:p>
       <w:pPr>
+        <w:numPr>
+          <w:ilvl w:val="0"/>
+          <w:numId w:val="1"/>
+        </w:numPr>
+        <w:spacing w:after="0" w:line="240" w:lineRule="auto"/>
+        <w:ind w:left="440" w:leftChars="0" w:hanging="360" w:firstLineChars="0"/>
+        <w:jc w:val="both"/>
+        <w:rPr>
+          <w:rFonts w:hint="default" w:ascii="Kalinga" w:hAnsi="Kalinga"/>
+          <w:b w:val="0"/>
+          <w:bCs w:val="0"/>
+          <w:color w:val="auto"/>
+          <w:sz w:val="20"/>
+          <w:szCs w:val="20"/>
+        </w:rPr>
+      </w:pPr>
+      <w:r>
+        <w:rPr>
+          <w:rFonts w:hint="default" w:ascii="Kalinga" w:hAnsi="Kalinga"/>
+          <w:b w:val="0"/>
+          <w:bCs w:val="0"/>
+          <w:color w:val="auto"/>
+          <w:sz w:val="20"/>
+          <w:szCs w:val="20"/>
+        </w:rPr>
+        <w:t>Fasilitas Kredit {{jenis_kredit}} di {{nama_bank}} maks Rp. {{plafon_maks}} outs Rp. {{outstanding}} angsuran Rp. {{angsuran}} Coll {{kolektibilitas}}. {{alasan}}</w:t>
+      </w:r>
+    </w:p>
+    <w:p>
+      <w:pPr>
         <w:spacing w:after="0" w:line="240" w:lineRule="auto"/>
         <w:ind w:left="0" w:leftChars="0" w:firstLine="0" w:firstLineChars="0"/>
         <w:jc w:val="both"/>
@@ -593,7 +626,7 @@
           <w:sz w:val="20"/>
           <w:szCs w:val="20"/>
         </w:rPr>
-        <w:t>-Fasilitas Kredit {{jenis_kredit}} di {{nama_bank}} maks Rp. {{plafon_maks}} outs Rp. {{outstanding}} angsuran Rp. {{angsuran}} Coll {{kolektibilitas}}. {{alasan}}</w:t>
+        <w:t>{{/list_fasilitas_kredit}}</w:t>
       </w:r>
     </w:p>
     <w:p>
@@ -619,59 +652,37 @@
           <w:sz w:val="20"/>
           <w:szCs w:val="20"/>
         </w:rPr>
-        <w:t>{{/list_fasilitas_kredit}}</w:t>
-      </w:r>
-    </w:p>
-    <w:p>
-      <w:pPr>
-        <w:spacing w:after="0" w:line="240" w:lineRule="auto"/>
-        <w:ind w:left="0" w:leftChars="0" w:firstLine="0" w:firstLineChars="0"/>
-        <w:jc w:val="both"/>
-        <w:rPr>
-          <w:rFonts w:hint="default" w:ascii="Kalinga" w:hAnsi="Kalinga"/>
-          <w:b w:val="0"/>
-          <w:bCs w:val="0"/>
-          <w:color w:val="auto"/>
-          <w:sz w:val="20"/>
-          <w:szCs w:val="20"/>
-        </w:rPr>
-      </w:pPr>
-      <w:r>
-        <w:rPr>
-          <w:rFonts w:hint="default" w:ascii="Kalinga" w:hAnsi="Kalinga"/>
-          <w:b w:val="0"/>
-          <w:bCs w:val="0"/>
-          <w:color w:val="auto"/>
-          <w:sz w:val="20"/>
-          <w:szCs w:val="20"/>
-        </w:rPr>
         <w:t>{{^list_fasilitas_kredit}}</w:t>
       </w:r>
     </w:p>
     <w:p>
       <w:pPr>
-        <w:spacing w:after="0" w:line="240" w:lineRule="auto"/>
-        <w:ind w:left="0" w:leftChars="0" w:firstLine="0" w:firstLineChars="0"/>
-        <w:jc w:val="both"/>
-        <w:rPr>
-          <w:rFonts w:hint="default" w:ascii="Kalinga" w:hAnsi="Kalinga"/>
-          <w:b w:val="0"/>
-          <w:bCs w:val="0"/>
-          <w:color w:val="auto"/>
-          <w:sz w:val="20"/>
-          <w:szCs w:val="20"/>
-        </w:rPr>
-      </w:pPr>
-      <w:r>
-        <w:rPr>
-          <w:rFonts w:hint="default" w:ascii="Kalinga" w:hAnsi="Kalinga"/>
-          <w:b w:val="0"/>
-          <w:bCs w:val="0"/>
-          <w:color w:val="auto"/>
-          <w:sz w:val="20"/>
-          <w:szCs w:val="20"/>
-        </w:rPr>
-        <w:t>-Nihil - Tidak ada fasilitas kredit</w:t>
+        <w:numPr>
+          <w:ilvl w:val="0"/>
+          <w:numId w:val="1"/>
+        </w:numPr>
+        <w:spacing w:after="0" w:line="240" w:lineRule="auto"/>
+        <w:ind w:left="440" w:leftChars="0" w:hanging="360" w:firstLineChars="0"/>
+        <w:jc w:val="both"/>
+        <w:rPr>
+          <w:rFonts w:hint="default" w:ascii="Kalinga" w:hAnsi="Kalinga"/>
+          <w:b w:val="0"/>
+          <w:bCs w:val="0"/>
+          <w:color w:val="auto"/>
+          <w:sz w:val="20"/>
+          <w:szCs w:val="20"/>
+        </w:rPr>
+      </w:pPr>
+      <w:r>
+        <w:rPr>
+          <w:rFonts w:hint="default" w:ascii="Kalinga" w:hAnsi="Kalinga"/>
+          <w:b w:val="0"/>
+          <w:bCs w:val="0"/>
+          <w:color w:val="auto"/>
+          <w:sz w:val="20"/>
+          <w:szCs w:val="20"/>
+        </w:rPr>
+        <w:t>Nihil - Tidak ada fasilitas kredit</w:t>
       </w:r>
     </w:p>
     <w:p>
@@ -779,17 +790,17 @@
       <w:bookmarkStart w:id="21" w:name="OLE_LINK71"/>
       <w:bookmarkStart w:id="22" w:name="OLE_LINK10"/>
       <w:bookmarkStart w:id="23" w:name="OLE_LINK21"/>
-      <w:bookmarkStart w:id="24" w:name="OLE_LINK39"/>
-      <w:bookmarkStart w:id="25" w:name="OLE_LINK73"/>
-      <w:bookmarkStart w:id="26" w:name="OLE_LINK68"/>
-      <w:bookmarkStart w:id="27" w:name="OLE_LINK20"/>
+      <w:bookmarkStart w:id="24" w:name="OLE_LINK73"/>
+      <w:bookmarkStart w:id="25" w:name="OLE_LINK39"/>
+      <w:bookmarkStart w:id="26" w:name="OLE_LINK20"/>
+      <w:bookmarkStart w:id="27" w:name="OLE_LINK68"/>
       <w:bookmarkStart w:id="28" w:name="OLE_LINK63"/>
       <w:bookmarkStart w:id="29" w:name="OLE_LINK88"/>
       <w:bookmarkStart w:id="30" w:name="OLE_LINK45"/>
       <w:bookmarkStart w:id="31" w:name="OLE_LINK61"/>
-      <w:bookmarkStart w:id="32" w:name="OLE_LINK52"/>
-      <w:bookmarkStart w:id="33" w:name="OLE_LINK90"/>
-      <w:bookmarkStart w:id="34" w:name="OLE_LINK54"/>
+      <w:bookmarkStart w:id="32" w:name="OLE_LINK90"/>
+      <w:bookmarkStart w:id="33" w:name="OLE_LINK54"/>
+      <w:bookmarkStart w:id="34" w:name="OLE_LINK52"/>
       <w:r>
         <w:rPr>
           <w:rFonts w:hint="default" w:ascii="Kalinga" w:hAnsi="Kalinga"/>
@@ -815,52 +826,334 @@
     <w:p>
       <w:pPr>
         <w:pStyle w:val="6"/>
+        <w:numPr>
+          <w:ilvl w:val="0"/>
+          <w:numId w:val="2"/>
+        </w:numPr>
+        <w:spacing w:line="240" w:lineRule="auto"/>
+        <w:ind w:left="360" w:leftChars="0" w:right="160" w:rightChars="0" w:hanging="280" w:firstLineChars="0"/>
+        <w:jc w:val="both"/>
+        <w:rPr>
+          <w:rFonts w:hint="default" w:ascii="Kalinga" w:hAnsi="Kalinga"/>
+          <w:color w:val="auto"/>
+          <w:sz w:val="20"/>
+          <w:szCs w:val="20"/>
+          <w:lang w:val="en-US"/>
+        </w:rPr>
+      </w:pPr>
+      <w:r>
+        <w:rPr>
+          <w:rFonts w:hint="default" w:ascii="Kalinga" w:hAnsi="Kalinga"/>
+          <w:color w:val="auto"/>
+          <w:sz w:val="20"/>
+          <w:szCs w:val="20"/>
+        </w:rPr>
+        <w:t>Cfm. Estimasi Hak Tabungan Hari Tua dan Pensiun Pokok</w:t>
+      </w:r>
+      <w:r>
+        <w:rPr>
+          <w:rFonts w:hint="default" w:ascii="Kalinga" w:hAnsi="Kalinga"/>
+          <w:color w:val="auto"/>
+          <w:sz w:val="20"/>
+          <w:szCs w:val="20"/>
+          <w:lang w:val="en-US"/>
+        </w:rPr>
+        <w:t xml:space="preserve"> NIP </w:t>
+      </w:r>
+      <w:r>
+        <w:rPr>
+          <w:rFonts w:hint="default" w:ascii="Kalinga" w:hAnsi="Kalinga"/>
+          <w:color w:val="auto"/>
+          <w:sz w:val="20"/>
+          <w:szCs w:val="20"/>
+        </w:rPr>
+        <w:t xml:space="preserve">{{nip}} atas nama </w:t>
+      </w:r>
+      <w:r>
+        <w:rPr>
+          <w:rFonts w:hint="default" w:ascii="Kalinga" w:hAnsi="Kalinga"/>
+          <w:color w:val="auto"/>
+          <w:sz w:val="20"/>
+          <w:szCs w:val="20"/>
+          <w:lang w:val="en-US"/>
+        </w:rPr>
+        <w:t>{{</w:t>
+      </w:r>
+      <w:r>
+        <w:rPr>
+          <w:rFonts w:hint="default" w:ascii="Kalinga" w:hAnsi="Kalinga"/>
+          <w:color w:val="auto"/>
+          <w:sz w:val="20"/>
+          <w:szCs w:val="20"/>
+        </w:rPr>
+        <w:t>nama_pemohon</w:t>
+      </w:r>
+      <w:r>
+        <w:rPr>
+          <w:rFonts w:hint="default" w:ascii="Kalinga" w:hAnsi="Kalinga"/>
+          <w:color w:val="auto"/>
+          <w:sz w:val="20"/>
+          <w:szCs w:val="20"/>
+          <w:lang w:val="en-US"/>
+        </w:rPr>
+        <w:t>}}</w:t>
+      </w:r>
+      <w:r>
+        <w:rPr>
+          <w:rFonts w:hint="default" w:ascii="Kalinga" w:hAnsi="Kalinga"/>
+          <w:color w:val="auto"/>
+          <w:sz w:val="20"/>
+          <w:szCs w:val="20"/>
+        </w:rPr>
+        <w:t xml:space="preserve"> dengan Hak Pensiun yang akan diterima +/- Rp. </w:t>
+      </w:r>
+      <w:r>
+        <w:rPr>
+          <w:rFonts w:hint="default" w:ascii="Kalinga" w:hAnsi="Kalinga"/>
+          <w:color w:val="auto"/>
+          <w:sz w:val="20"/>
+          <w:szCs w:val="20"/>
+          <w:lang w:val="en-US"/>
+        </w:rPr>
+        <w:t>{{</w:t>
+      </w:r>
+      <w:r>
+        <w:rPr>
+          <w:rFonts w:hint="default" w:ascii="Kalinga" w:hAnsi="Kalinga"/>
+          <w:color w:val="auto"/>
+          <w:sz w:val="20"/>
+          <w:szCs w:val="20"/>
+        </w:rPr>
+        <w:t>estimasi_hak_pensiun</w:t>
+      </w:r>
+      <w:r>
+        <w:rPr>
+          <w:rFonts w:hint="default" w:ascii="Kalinga" w:hAnsi="Kalinga"/>
+          <w:color w:val="auto"/>
+          <w:sz w:val="20"/>
+          <w:szCs w:val="20"/>
+          <w:lang w:val="en-US"/>
+        </w:rPr>
+        <w:t>}}</w:t>
+      </w:r>
+      <w:r>
+        <w:rPr>
+          <w:rFonts w:hint="default" w:ascii="Kalinga" w:hAnsi="Kalinga"/>
+          <w:color w:val="auto"/>
+          <w:sz w:val="20"/>
+          <w:szCs w:val="20"/>
+        </w:rPr>
+        <w:t>,-</w:t>
+      </w:r>
+      <w:r>
+        <w:rPr>
+          <w:rFonts w:hint="default" w:ascii="Kalinga" w:hAnsi="Kalinga"/>
+          <w:color w:val="auto"/>
+          <w:sz w:val="20"/>
+          <w:szCs w:val="20"/>
+          <w:lang w:val="en-US"/>
+        </w:rPr>
+        <w:t>.</w:t>
+      </w:r>
+    </w:p>
+    <w:p>
+      <w:pPr>
+        <w:pStyle w:val="6"/>
+        <w:numPr>
+          <w:ilvl w:val="0"/>
+          <w:numId w:val="2"/>
+        </w:numPr>
+        <w:spacing w:line="240" w:lineRule="auto"/>
+        <w:ind w:left="360" w:leftChars="0" w:right="160" w:rightChars="0" w:hanging="280" w:firstLineChars="0"/>
+        <w:jc w:val="both"/>
+        <w:rPr>
+          <w:rFonts w:hint="default" w:ascii="Kalinga" w:hAnsi="Kalinga"/>
+          <w:b w:val="0"/>
+          <w:bCs w:val="0"/>
+          <w:sz w:val="20"/>
+          <w:szCs w:val="20"/>
+        </w:rPr>
+      </w:pPr>
+      <w:r>
+        <w:rPr>
+          <w:rFonts w:hint="default" w:ascii="Kalinga" w:hAnsi="Kalinga"/>
+          <w:color w:val="auto"/>
+          <w:sz w:val="20"/>
+          <w:szCs w:val="20"/>
+        </w:rPr>
+        <w:t>Cf</w:t>
+      </w:r>
+      <w:r>
+        <w:rPr>
+          <w:rFonts w:hint="default" w:ascii="Kalinga" w:hAnsi="Kalinga"/>
+          <w:b w:val="0"/>
+          <w:bCs w:val="0"/>
+          <w:sz w:val="20"/>
+          <w:szCs w:val="20"/>
+        </w:rPr>
+        <w:t xml:space="preserve">m. Payrol Gaji di </w:t>
+      </w:r>
+      <w:r>
+        <w:rPr>
+          <w:rFonts w:hint="default" w:ascii="Kalinga" w:hAnsi="Kalinga"/>
+          <w:b w:val="0"/>
+          <w:bCs w:val="0"/>
+          <w:sz w:val="20"/>
+          <w:szCs w:val="20"/>
+          <w:lang w:val="en-US"/>
+        </w:rPr>
+        <w:t>{{</w:t>
+      </w:r>
+      <w:r>
+        <w:rPr>
+          <w:rFonts w:hint="default" w:ascii="Kalinga" w:hAnsi="Kalinga"/>
+          <w:b w:val="0"/>
+          <w:bCs w:val="0"/>
+          <w:sz w:val="20"/>
+          <w:szCs w:val="20"/>
+        </w:rPr>
+        <w:t>payroll_bank</w:t>
+      </w:r>
+      <w:r>
+        <w:rPr>
+          <w:rFonts w:hint="default" w:ascii="Kalinga" w:hAnsi="Kalinga"/>
+          <w:b w:val="0"/>
+          <w:bCs w:val="0"/>
+          <w:sz w:val="20"/>
+          <w:szCs w:val="20"/>
+          <w:lang w:val="en-US"/>
+        </w:rPr>
+        <w:t>}}</w:t>
+      </w:r>
+      <w:r>
+        <w:rPr>
+          <w:rFonts w:hint="default" w:ascii="Kalinga" w:hAnsi="Kalinga"/>
+          <w:b w:val="0"/>
+          <w:bCs w:val="0"/>
+          <w:sz w:val="20"/>
+          <w:szCs w:val="20"/>
+        </w:rPr>
+        <w:t xml:space="preserve"> nomor </w:t>
+      </w:r>
+      <w:r>
+        <w:rPr>
+          <w:rFonts w:hint="default" w:ascii="Kalinga" w:hAnsi="Kalinga"/>
+          <w:b w:val="0"/>
+          <w:bCs w:val="0"/>
+          <w:sz w:val="20"/>
+          <w:szCs w:val="20"/>
+          <w:lang w:val="en-US"/>
+        </w:rPr>
+        <w:t>{{</w:t>
+      </w:r>
+      <w:r>
+        <w:rPr>
+          <w:rFonts w:hint="default" w:ascii="Kalinga" w:hAnsi="Kalinga"/>
+          <w:b w:val="0"/>
+          <w:bCs w:val="0"/>
+          <w:sz w:val="20"/>
+          <w:szCs w:val="20"/>
+        </w:rPr>
+        <w:t>payroll_no_rek</w:t>
+      </w:r>
+      <w:r>
+        <w:rPr>
+          <w:rFonts w:hint="default" w:ascii="Kalinga" w:hAnsi="Kalinga"/>
+          <w:b w:val="0"/>
+          <w:bCs w:val="0"/>
+          <w:sz w:val="20"/>
+          <w:szCs w:val="20"/>
+          <w:lang w:val="en-US"/>
+        </w:rPr>
+        <w:t>}}</w:t>
+      </w:r>
+      <w:r>
+        <w:rPr>
+          <w:rFonts w:hint="default" w:ascii="Kalinga" w:hAnsi="Kalinga"/>
+          <w:b w:val="0"/>
+          <w:bCs w:val="0"/>
+          <w:sz w:val="20"/>
+          <w:szCs w:val="20"/>
+        </w:rPr>
+        <w:t xml:space="preserve"> atas nama </w:t>
+      </w:r>
+      <w:r>
+        <w:rPr>
+          <w:rFonts w:hint="default" w:ascii="Kalinga" w:hAnsi="Kalinga"/>
+          <w:b w:val="0"/>
+          <w:bCs w:val="0"/>
+          <w:sz w:val="20"/>
+          <w:szCs w:val="20"/>
+          <w:lang w:val="en-US"/>
+        </w:rPr>
+        <w:t>{{</w:t>
+      </w:r>
+      <w:r>
+        <w:rPr>
+          <w:rFonts w:hint="default" w:ascii="Kalinga" w:hAnsi="Kalinga"/>
+          <w:b w:val="0"/>
+          <w:bCs w:val="0"/>
+          <w:sz w:val="20"/>
+          <w:szCs w:val="20"/>
+        </w:rPr>
+        <w:t>nama_pemohon</w:t>
+      </w:r>
+      <w:r>
+        <w:rPr>
+          <w:rFonts w:hint="default" w:ascii="Kalinga" w:hAnsi="Kalinga"/>
+          <w:b w:val="0"/>
+          <w:bCs w:val="0"/>
+          <w:sz w:val="20"/>
+          <w:szCs w:val="20"/>
+          <w:lang w:val="en-US"/>
+        </w:rPr>
+        <w:t>}}</w:t>
+      </w:r>
+      <w:r>
+        <w:rPr>
+          <w:rFonts w:hint="default" w:ascii="Kalinga" w:hAnsi="Kalinga"/>
+          <w:b w:val="0"/>
+          <w:bCs w:val="0"/>
+          <w:sz w:val="20"/>
+          <w:szCs w:val="20"/>
+        </w:rPr>
+        <w:t xml:space="preserve"> data sebagai berikut :</w:t>
+      </w:r>
+    </w:p>
+    <w:p>
+      <w:pPr>
         <w:numPr>
           <w:ilvl w:val="0"/>
           <w:numId w:val="1"/>
         </w:numPr>
-        <w:spacing w:line="240" w:lineRule="auto"/>
-        <w:ind w:left="360" w:leftChars="0" w:right="160" w:rightChars="0" w:hanging="280" w:firstLineChars="0"/>
-        <w:jc w:val="both"/>
-        <w:rPr>
-          <w:rFonts w:hint="default" w:ascii="Kalinga" w:hAnsi="Kalinga"/>
-          <w:color w:val="auto"/>
-          <w:sz w:val="20"/>
-          <w:szCs w:val="20"/>
-          <w:lang w:val="en-US"/>
-        </w:rPr>
-      </w:pPr>
-      <w:r>
-        <w:rPr>
-          <w:rFonts w:hint="default" w:ascii="Kalinga" w:hAnsi="Kalinga"/>
-          <w:color w:val="auto"/>
-          <w:sz w:val="20"/>
-          <w:szCs w:val="20"/>
-        </w:rPr>
-        <w:t>Cfm. Estimasi Hak Tabungan Hari Tua dan Pensiun Pokok</w:t>
-      </w:r>
-      <w:r>
-        <w:rPr>
-          <w:rFonts w:hint="default" w:ascii="Kalinga" w:hAnsi="Kalinga"/>
-          <w:color w:val="auto"/>
-          <w:sz w:val="20"/>
-          <w:szCs w:val="20"/>
-          <w:lang w:val="en-US"/>
-        </w:rPr>
-        <w:t xml:space="preserve"> NIP </w:t>
-      </w:r>
-      <w:r>
-        <w:rPr>
-          <w:rFonts w:hint="default" w:ascii="Kalinga" w:hAnsi="Kalinga"/>
-          <w:color w:val="auto"/>
-          <w:sz w:val="20"/>
-          <w:szCs w:val="20"/>
-        </w:rPr>
-        <w:t xml:space="preserve">{{nip}} atas nama </w:t>
-      </w:r>
-      <w:r>
-        <w:rPr>
-          <w:rFonts w:hint="default" w:ascii="Kalinga" w:hAnsi="Kalinga"/>
+        <w:spacing w:after="0" w:line="240" w:lineRule="auto"/>
+        <w:ind w:left="440" w:leftChars="0" w:hanging="360" w:firstLineChars="0"/>
+        <w:jc w:val="both"/>
+        <w:rPr>
+          <w:rFonts w:hint="default" w:ascii="Kalinga" w:hAnsi="Kalinga"/>
+          <w:b w:val="0"/>
+          <w:bCs w:val="0"/>
+          <w:color w:val="auto"/>
+          <w:sz w:val="20"/>
+          <w:szCs w:val="20"/>
+        </w:rPr>
+      </w:pPr>
+      <w:r>
+        <w:rPr>
+          <w:rFonts w:hint="default" w:ascii="Kalinga" w:hAnsi="Kalinga"/>
+          <w:b w:val="0"/>
+          <w:bCs w:val="0"/>
+          <w:color w:val="auto"/>
+          <w:sz w:val="20"/>
+          <w:szCs w:val="20"/>
+        </w:rPr>
+        <w:t xml:space="preserve">Gaji Bulan </w:t>
+      </w:r>
+      <w:r>
+        <w:rPr>
+          <w:rFonts w:hint="default" w:ascii="Kalinga" w:hAnsi="Kalinga"/>
+          <w:b w:val="0"/>
+          <w:bCs w:val="0"/>
           <w:color w:val="auto"/>
           <w:sz w:val="20"/>
           <w:szCs w:val="20"/>
@@ -871,15 +1164,19 @@
       <w:r>
         <w:rPr>
           <w:rFonts w:hint="default" w:ascii="Kalinga" w:hAnsi="Kalinga"/>
-          <w:color w:val="auto"/>
-          <w:sz w:val="20"/>
-          <w:szCs w:val="20"/>
-        </w:rPr>
-        <w:t>nama_pemohon</w:t>
-      </w:r>
-      <w:r>
-        <w:rPr>
-          <w:rFonts w:hint="default" w:ascii="Kalinga" w:hAnsi="Kalinga"/>
+          <w:b w:val="0"/>
+          <w:bCs w:val="0"/>
+          <w:color w:val="auto"/>
+          <w:sz w:val="20"/>
+          <w:szCs w:val="20"/>
+        </w:rPr>
+        <w:t>gaji_bulan_1_nama</w:t>
+      </w:r>
+      <w:r>
+        <w:rPr>
+          <w:rFonts w:hint="default" w:ascii="Kalinga" w:hAnsi="Kalinga"/>
+          <w:b w:val="0"/>
+          <w:bCs w:val="0"/>
           <w:color w:val="auto"/>
           <w:sz w:val="20"/>
           <w:szCs w:val="20"/>
@@ -890,44 +1187,67 @@
       <w:r>
         <w:rPr>
           <w:rFonts w:hint="default" w:ascii="Kalinga" w:hAnsi="Kalinga"/>
-          <w:color w:val="auto"/>
-          <w:sz w:val="20"/>
-          <w:szCs w:val="20"/>
-        </w:rPr>
-        <w:t xml:space="preserve"> dengan Hak Pensiun yang akan diterima +/- Rp. </w:t>
-      </w:r>
-      <w:r>
-        <w:rPr>
-          <w:rFonts w:hint="default" w:ascii="Kalinga" w:hAnsi="Kalinga"/>
-          <w:color w:val="auto"/>
-          <w:sz w:val="20"/>
-          <w:szCs w:val="20"/>
-          <w:lang w:val="en-US"/>
-        </w:rPr>
-        <w:t>{{</w:t>
-      </w:r>
-      <w:r>
-        <w:rPr>
-          <w:rFonts w:hint="default" w:ascii="Kalinga" w:hAnsi="Kalinga"/>
-          <w:color w:val="auto"/>
-          <w:sz w:val="20"/>
-          <w:szCs w:val="20"/>
-        </w:rPr>
-        <w:t>estimasi_hak_pensiun</w:t>
-      </w:r>
-      <w:r>
-        <w:rPr>
-          <w:rFonts w:hint="default" w:ascii="Kalinga" w:hAnsi="Kalinga"/>
-          <w:color w:val="auto"/>
-          <w:sz w:val="20"/>
-          <w:szCs w:val="20"/>
-          <w:lang w:val="en-US"/>
-        </w:rPr>
-        <w:t>}}</w:t>
-      </w:r>
-      <w:r>
-        <w:rPr>
-          <w:rFonts w:hint="default" w:ascii="Kalinga" w:hAnsi="Kalinga"/>
+          <w:b w:val="0"/>
+          <w:bCs w:val="0"/>
+          <w:color w:val="auto"/>
+          <w:sz w:val="20"/>
+          <w:szCs w:val="20"/>
+          <w:lang w:val="en-US"/>
+        </w:rPr>
+        <w:tab/>
+      </w:r>
+      <w:r>
+        <w:rPr>
+          <w:rFonts w:hint="default" w:ascii="Kalinga" w:hAnsi="Kalinga"/>
+          <w:b w:val="0"/>
+          <w:bCs w:val="0"/>
+          <w:color w:val="auto"/>
+          <w:sz w:val="20"/>
+          <w:szCs w:val="20"/>
+          <w:lang w:val="en-US"/>
+        </w:rPr>
+        <w:tab/>
+      </w:r>
+      <w:r>
+        <w:rPr>
+          <w:rFonts w:hint="default" w:ascii="Kalinga" w:hAnsi="Kalinga"/>
+          <w:b w:val="0"/>
+          <w:bCs w:val="0"/>
+          <w:color w:val="auto"/>
+          <w:sz w:val="20"/>
+          <w:szCs w:val="20"/>
+          <w:lang w:val="en-US"/>
+        </w:rPr>
+        <w:tab/>
+      </w:r>
+      <w:r>
+        <w:rPr>
+          <w:rFonts w:hint="default" w:ascii="Kalinga" w:hAnsi="Kalinga"/>
+          <w:b w:val="0"/>
+          <w:bCs w:val="0"/>
+          <w:color w:val="auto"/>
+          <w:sz w:val="20"/>
+          <w:szCs w:val="20"/>
+        </w:rPr>
+        <w:t xml:space="preserve">Rp. </w:t>
+      </w:r>
+      <w:r>
+        <w:rPr>
+          <w:rFonts w:hint="default" w:ascii="Kalinga" w:hAnsi="Kalinga"/>
+          <w:b w:val="0"/>
+          <w:bCs w:val="0"/>
+          <w:color w:val="auto"/>
+          <w:sz w:val="20"/>
+          <w:szCs w:val="20"/>
+          <w:lang w:val="en-US"/>
+        </w:rPr>
+        <w:t>{{gaji_bulan_1}}</w:t>
+      </w:r>
+      <w:r>
+        <w:rPr>
+          <w:rFonts w:hint="default" w:ascii="Kalinga" w:hAnsi="Kalinga"/>
+          <w:b w:val="0"/>
+          <w:bCs w:val="0"/>
           <w:color w:val="auto"/>
           <w:sz w:val="20"/>
           <w:szCs w:val="20"/>
@@ -937,6 +1257,8 @@
       <w:r>
         <w:rPr>
           <w:rFonts w:hint="default" w:ascii="Kalinga" w:hAnsi="Kalinga"/>
+          <w:b w:val="0"/>
+          <w:bCs w:val="0"/>
           <w:color w:val="auto"/>
           <w:sz w:val="20"/>
           <w:szCs w:val="20"/>
@@ -947,46 +1269,39 @@
     </w:p>
     <w:p>
       <w:pPr>
-        <w:pStyle w:val="6"/>
         <w:numPr>
           <w:ilvl w:val="0"/>
           <w:numId w:val="1"/>
         </w:numPr>
-        <w:spacing w:line="240" w:lineRule="auto"/>
-        <w:ind w:left="360" w:leftChars="0" w:right="160" w:rightChars="0" w:hanging="280" w:firstLineChars="0"/>
-        <w:jc w:val="both"/>
-        <w:rPr>
-          <w:rFonts w:hint="default" w:ascii="Kalinga" w:hAnsi="Kalinga"/>
-          <w:b w:val="0"/>
-          <w:bCs w:val="0"/>
-          <w:sz w:val="20"/>
-          <w:szCs w:val="20"/>
-        </w:rPr>
-      </w:pPr>
-      <w:r>
-        <w:rPr>
-          <w:rFonts w:hint="default" w:ascii="Kalinga" w:hAnsi="Kalinga"/>
-          <w:color w:val="auto"/>
-          <w:sz w:val="20"/>
-          <w:szCs w:val="20"/>
-        </w:rPr>
-        <w:t>Cf</w:t>
-      </w:r>
-      <w:r>
-        <w:rPr>
-          <w:rFonts w:hint="default" w:ascii="Kalinga" w:hAnsi="Kalinga"/>
-          <w:b w:val="0"/>
-          <w:bCs w:val="0"/>
-          <w:sz w:val="20"/>
-          <w:szCs w:val="20"/>
-        </w:rPr>
-        <w:t xml:space="preserve">m. Payrol Gaji di </w:t>
-      </w:r>
-      <w:r>
-        <w:rPr>
-          <w:rFonts w:hint="default" w:ascii="Kalinga" w:hAnsi="Kalinga"/>
-          <w:b w:val="0"/>
-          <w:bCs w:val="0"/>
+        <w:spacing w:after="0" w:line="240" w:lineRule="auto"/>
+        <w:ind w:left="440" w:leftChars="0" w:hanging="360" w:firstLineChars="0"/>
+        <w:jc w:val="both"/>
+        <w:rPr>
+          <w:rFonts w:hint="default" w:ascii="Kalinga" w:hAnsi="Kalinga"/>
+          <w:b w:val="0"/>
+          <w:bCs w:val="0"/>
+          <w:color w:val="auto"/>
+          <w:sz w:val="20"/>
+          <w:szCs w:val="20"/>
+        </w:rPr>
+      </w:pPr>
+      <w:r>
+        <w:rPr>
+          <w:rFonts w:hint="default" w:ascii="Kalinga" w:hAnsi="Kalinga"/>
+          <w:b w:val="0"/>
+          <w:bCs w:val="0"/>
+          <w:color w:val="auto"/>
+          <w:sz w:val="20"/>
+          <w:szCs w:val="20"/>
+        </w:rPr>
+        <w:t xml:space="preserve">Gaji Bulan </w:t>
+      </w:r>
+      <w:r>
+        <w:rPr>
+          <w:rFonts w:hint="default" w:ascii="Kalinga" w:hAnsi="Kalinga"/>
+          <w:b w:val="0"/>
+          <w:bCs w:val="0"/>
+          <w:color w:val="auto"/>
           <w:sz w:val="20"/>
           <w:szCs w:val="20"/>
           <w:lang w:val="en-US"/>
@@ -998,16 +1313,18 @@
           <w:rFonts w:hint="default" w:ascii="Kalinga" w:hAnsi="Kalinga"/>
           <w:b w:val="0"/>
           <w:bCs w:val="0"/>
-          <w:sz w:val="20"/>
-          <w:szCs w:val="20"/>
-        </w:rPr>
-        <w:t>payroll_bank</w:t>
-      </w:r>
-      <w:r>
-        <w:rPr>
-          <w:rFonts w:hint="default" w:ascii="Kalinga" w:hAnsi="Kalinga"/>
-          <w:b w:val="0"/>
-          <w:bCs w:val="0"/>
+          <w:color w:val="auto"/>
+          <w:sz w:val="20"/>
+          <w:szCs w:val="20"/>
+        </w:rPr>
+        <w:t>gaji_bulan_2_nama</w:t>
+      </w:r>
+      <w:r>
+        <w:rPr>
+          <w:rFonts w:hint="default" w:ascii="Kalinga" w:hAnsi="Kalinga"/>
+          <w:b w:val="0"/>
+          <w:bCs w:val="0"/>
+          <w:color w:val="auto"/>
           <w:sz w:val="20"/>
           <w:szCs w:val="20"/>
           <w:lang w:val="en-US"/>
@@ -1019,119 +1336,106 @@
           <w:rFonts w:hint="default" w:ascii="Kalinga" w:hAnsi="Kalinga"/>
           <w:b w:val="0"/>
           <w:bCs w:val="0"/>
-          <w:sz w:val="20"/>
-          <w:szCs w:val="20"/>
-        </w:rPr>
-        <w:t xml:space="preserve"> nomor </w:t>
-      </w:r>
-      <w:r>
-        <w:rPr>
-          <w:rFonts w:hint="default" w:ascii="Kalinga" w:hAnsi="Kalinga"/>
-          <w:b w:val="0"/>
-          <w:bCs w:val="0"/>
-          <w:sz w:val="20"/>
-          <w:szCs w:val="20"/>
-          <w:lang w:val="en-US"/>
-        </w:rPr>
-        <w:t>{{</w:t>
-      </w:r>
-      <w:r>
-        <w:rPr>
-          <w:rFonts w:hint="default" w:ascii="Kalinga" w:hAnsi="Kalinga"/>
-          <w:b w:val="0"/>
-          <w:bCs w:val="0"/>
-          <w:sz w:val="20"/>
-          <w:szCs w:val="20"/>
-        </w:rPr>
-        <w:t>payroll_no_rek</w:t>
-      </w:r>
-      <w:r>
-        <w:rPr>
-          <w:rFonts w:hint="default" w:ascii="Kalinga" w:hAnsi="Kalinga"/>
-          <w:b w:val="0"/>
-          <w:bCs w:val="0"/>
-          <w:sz w:val="20"/>
-          <w:szCs w:val="20"/>
-          <w:lang w:val="en-US"/>
-        </w:rPr>
-        <w:t>}}</w:t>
-      </w:r>
-      <w:r>
-        <w:rPr>
-          <w:rFonts w:hint="default" w:ascii="Kalinga" w:hAnsi="Kalinga"/>
-          <w:b w:val="0"/>
-          <w:bCs w:val="0"/>
-          <w:sz w:val="20"/>
-          <w:szCs w:val="20"/>
-        </w:rPr>
-        <w:t xml:space="preserve"> atas nama </w:t>
-      </w:r>
-      <w:r>
-        <w:rPr>
-          <w:rFonts w:hint="default" w:ascii="Kalinga" w:hAnsi="Kalinga"/>
-          <w:b w:val="0"/>
-          <w:bCs w:val="0"/>
-          <w:sz w:val="20"/>
-          <w:szCs w:val="20"/>
-          <w:lang w:val="en-US"/>
-        </w:rPr>
-        <w:t>{{</w:t>
-      </w:r>
-      <w:r>
-        <w:rPr>
-          <w:rFonts w:hint="default" w:ascii="Kalinga" w:hAnsi="Kalinga"/>
-          <w:b w:val="0"/>
-          <w:bCs w:val="0"/>
-          <w:sz w:val="20"/>
-          <w:szCs w:val="20"/>
-        </w:rPr>
-        <w:t>nama_pemohon</w:t>
-      </w:r>
-      <w:r>
-        <w:rPr>
-          <w:rFonts w:hint="default" w:ascii="Kalinga" w:hAnsi="Kalinga"/>
-          <w:b w:val="0"/>
-          <w:bCs w:val="0"/>
-          <w:sz w:val="20"/>
-          <w:szCs w:val="20"/>
-          <w:lang w:val="en-US"/>
-        </w:rPr>
-        <w:t>}}</w:t>
-      </w:r>
-      <w:r>
-        <w:rPr>
-          <w:rFonts w:hint="default" w:ascii="Kalinga" w:hAnsi="Kalinga"/>
-          <w:b w:val="0"/>
-          <w:bCs w:val="0"/>
-          <w:sz w:val="20"/>
-          <w:szCs w:val="20"/>
-        </w:rPr>
-        <w:t xml:space="preserve"> data sebagai berikut :</w:t>
-      </w:r>
-    </w:p>
-    <w:p>
-      <w:pPr>
-        <w:pStyle w:val="6"/>
+          <w:color w:val="auto"/>
+          <w:sz w:val="20"/>
+          <w:szCs w:val="20"/>
+        </w:rPr>
+        <w:tab/>
+      </w:r>
+      <w:r>
+        <w:rPr>
+          <w:rFonts w:hint="default" w:ascii="Kalinga" w:hAnsi="Kalinga"/>
+          <w:b w:val="0"/>
+          <w:bCs w:val="0"/>
+          <w:color w:val="auto"/>
+          <w:sz w:val="20"/>
+          <w:szCs w:val="20"/>
+        </w:rPr>
+        <w:tab/>
+      </w:r>
+      <w:r>
+        <w:rPr>
+          <w:rFonts w:hint="default" w:ascii="Kalinga" w:hAnsi="Kalinga"/>
+          <w:b w:val="0"/>
+          <w:bCs w:val="0"/>
+          <w:color w:val="auto"/>
+          <w:sz w:val="20"/>
+          <w:szCs w:val="20"/>
+          <w:lang w:val="en-US"/>
+        </w:rPr>
+        <w:tab/>
+      </w:r>
+      <w:r>
+        <w:rPr>
+          <w:rFonts w:hint="default" w:ascii="Kalinga" w:hAnsi="Kalinga"/>
+          <w:b w:val="0"/>
+          <w:bCs w:val="0"/>
+          <w:color w:val="auto"/>
+          <w:sz w:val="20"/>
+          <w:szCs w:val="20"/>
+        </w:rPr>
+        <w:t xml:space="preserve">Rp. </w:t>
+      </w:r>
+      <w:r>
+        <w:rPr>
+          <w:rFonts w:hint="default" w:ascii="Kalinga" w:hAnsi="Kalinga"/>
+          <w:b w:val="0"/>
+          <w:bCs w:val="0"/>
+          <w:color w:val="auto"/>
+          <w:sz w:val="20"/>
+          <w:szCs w:val="20"/>
+          <w:lang w:val="en-US"/>
+        </w:rPr>
+        <w:t>{{gaji_bulan_2}}</w:t>
+      </w:r>
+      <w:r>
+        <w:rPr>
+          <w:rFonts w:hint="default" w:ascii="Kalinga" w:hAnsi="Kalinga"/>
+          <w:b w:val="0"/>
+          <w:bCs w:val="0"/>
+          <w:color w:val="auto"/>
+          <w:sz w:val="20"/>
+          <w:szCs w:val="20"/>
+        </w:rPr>
+        <w:t>,-</w:t>
+      </w:r>
+      <w:r>
+        <w:rPr>
+          <w:rFonts w:hint="default" w:ascii="Kalinga" w:hAnsi="Kalinga"/>
+          <w:b w:val="0"/>
+          <w:bCs w:val="0"/>
+          <w:color w:val="auto"/>
+          <w:sz w:val="20"/>
+          <w:szCs w:val="20"/>
+          <w:lang w:val="en-US"/>
+        </w:rPr>
+        <w:t>.</w:t>
+      </w:r>
+    </w:p>
+    <w:p>
+      <w:pPr>
         <w:numPr>
           <w:ilvl w:val="0"/>
           <w:numId w:val="1"/>
         </w:numPr>
-        <w:spacing w:line="240" w:lineRule="auto"/>
-        <w:ind w:left="660" w:leftChars="0" w:right="160" w:rightChars="0" w:hanging="280" w:firstLineChars="0"/>
-        <w:jc w:val="both"/>
-        <w:rPr>
-          <w:rFonts w:hint="default" w:ascii="Kalinga" w:hAnsi="Kalinga"/>
-          <w:b w:val="0"/>
-          <w:bCs w:val="0"/>
-          <w:sz w:val="20"/>
-          <w:szCs w:val="20"/>
-        </w:rPr>
-      </w:pPr>
-      <w:r>
-        <w:rPr>
-          <w:rFonts w:hint="default" w:ascii="Kalinga" w:hAnsi="Kalinga"/>
-          <w:b w:val="0"/>
-          <w:bCs w:val="0"/>
+        <w:spacing w:after="0" w:line="240" w:lineRule="auto"/>
+        <w:ind w:left="440" w:leftChars="0" w:hanging="360" w:firstLineChars="0"/>
+        <w:jc w:val="both"/>
+        <w:rPr>
+          <w:rFonts w:hint="default" w:ascii="Kalinga" w:hAnsi="Kalinga"/>
+          <w:b w:val="0"/>
+          <w:bCs w:val="0"/>
+          <w:color w:val="auto"/>
+          <w:sz w:val="20"/>
+          <w:szCs w:val="20"/>
+        </w:rPr>
+      </w:pPr>
+      <w:r>
+        <w:rPr>
+          <w:rFonts w:hint="default" w:ascii="Kalinga" w:hAnsi="Kalinga"/>
+          <w:b w:val="0"/>
+          <w:bCs w:val="0"/>
+          <w:color w:val="auto"/>
           <w:sz w:val="20"/>
           <w:szCs w:val="20"/>
         </w:rPr>
@@ -1142,6 +1446,7 @@
           <w:rFonts w:hint="default" w:ascii="Kalinga" w:hAnsi="Kalinga"/>
           <w:b w:val="0"/>
           <w:bCs w:val="0"/>
+          <w:color w:val="auto"/>
           <w:sz w:val="20"/>
           <w:szCs w:val="20"/>
           <w:lang w:val="en-US"/>
@@ -1153,16 +1458,18 @@
           <w:rFonts w:hint="default" w:ascii="Kalinga" w:hAnsi="Kalinga"/>
           <w:b w:val="0"/>
           <w:bCs w:val="0"/>
-          <w:sz w:val="20"/>
-          <w:szCs w:val="20"/>
-        </w:rPr>
-        <w:t>gaji_bulan_1_nama</w:t>
-      </w:r>
-      <w:r>
-        <w:rPr>
-          <w:rFonts w:hint="default" w:ascii="Kalinga" w:hAnsi="Kalinga"/>
-          <w:b w:val="0"/>
-          <w:bCs w:val="0"/>
+          <w:color w:val="auto"/>
+          <w:sz w:val="20"/>
+          <w:szCs w:val="20"/>
+        </w:rPr>
+        <w:t>gaji_bulan_3_nama</w:t>
+      </w:r>
+      <w:r>
+        <w:rPr>
+          <w:rFonts w:hint="default" w:ascii="Kalinga" w:hAnsi="Kalinga"/>
+          <w:b w:val="0"/>
+          <w:bCs w:val="0"/>
+          <w:color w:val="auto"/>
           <w:sz w:val="20"/>
           <w:szCs w:val="20"/>
           <w:lang w:val="en-US"/>
@@ -1174,39 +1481,41 @@
           <w:rFonts w:hint="default" w:ascii="Kalinga" w:hAnsi="Kalinga"/>
           <w:b w:val="0"/>
           <w:bCs w:val="0"/>
-          <w:sz w:val="20"/>
-          <w:szCs w:val="20"/>
-          <w:lang w:val="en-US"/>
-        </w:rPr>
-        <w:tab/>
-      </w:r>
-      <w:r>
-        <w:rPr>
-          <w:rFonts w:hint="default" w:ascii="Kalinga" w:hAnsi="Kalinga"/>
-          <w:b w:val="0"/>
-          <w:bCs w:val="0"/>
-          <w:sz w:val="20"/>
-          <w:szCs w:val="20"/>
-          <w:lang w:val="en-US"/>
-        </w:rPr>
-        <w:tab/>
-      </w:r>
-      <w:r>
-        <w:rPr>
-          <w:rFonts w:hint="default" w:ascii="Kalinga" w:hAnsi="Kalinga"/>
-          <w:b w:val="0"/>
-          <w:bCs w:val="0"/>
-          <w:sz w:val="20"/>
-          <w:szCs w:val="20"/>
-          <w:lang w:val="en-US"/>
-        </w:rPr>
-        <w:tab/>
-      </w:r>
-      <w:r>
-        <w:rPr>
-          <w:rFonts w:hint="default" w:ascii="Kalinga" w:hAnsi="Kalinga"/>
-          <w:b w:val="0"/>
-          <w:bCs w:val="0"/>
+          <w:color w:val="auto"/>
+          <w:sz w:val="20"/>
+          <w:szCs w:val="20"/>
+        </w:rPr>
+        <w:tab/>
+      </w:r>
+      <w:r>
+        <w:rPr>
+          <w:rFonts w:hint="default" w:ascii="Kalinga" w:hAnsi="Kalinga"/>
+          <w:b w:val="0"/>
+          <w:bCs w:val="0"/>
+          <w:color w:val="auto"/>
+          <w:sz w:val="20"/>
+          <w:szCs w:val="20"/>
+        </w:rPr>
+        <w:tab/>
+      </w:r>
+      <w:r>
+        <w:rPr>
+          <w:rFonts w:hint="default" w:ascii="Kalinga" w:hAnsi="Kalinga"/>
+          <w:b w:val="0"/>
+          <w:bCs w:val="0"/>
+          <w:color w:val="auto"/>
+          <w:sz w:val="20"/>
+          <w:szCs w:val="20"/>
+          <w:lang w:val="en-US"/>
+        </w:rPr>
+        <w:tab/>
+      </w:r>
+      <w:r>
+        <w:rPr>
+          <w:rFonts w:hint="default" w:ascii="Kalinga" w:hAnsi="Kalinga"/>
+          <w:b w:val="0"/>
+          <w:bCs w:val="0"/>
+          <w:color w:val="auto"/>
           <w:sz w:val="20"/>
           <w:szCs w:val="20"/>
         </w:rPr>
@@ -1217,17 +1526,19 @@
           <w:rFonts w:hint="default" w:ascii="Kalinga" w:hAnsi="Kalinga"/>
           <w:b w:val="0"/>
           <w:bCs w:val="0"/>
-          <w:sz w:val="20"/>
-          <w:szCs w:val="20"/>
-          <w:lang w:val="en-US"/>
-        </w:rPr>
-        <w:t>{{gaji_bulan_1}}</w:t>
-      </w:r>
-      <w:r>
-        <w:rPr>
-          <w:rFonts w:hint="default" w:ascii="Kalinga" w:hAnsi="Kalinga"/>
-          <w:b w:val="0"/>
-          <w:bCs w:val="0"/>
+          <w:color w:val="auto"/>
+          <w:sz w:val="20"/>
+          <w:szCs w:val="20"/>
+          <w:lang w:val="en-US"/>
+        </w:rPr>
+        <w:t>{{gaji_bulan_3}}</w:t>
+      </w:r>
+      <w:r>
+        <w:rPr>
+          <w:rFonts w:hint="default" w:ascii="Kalinga" w:hAnsi="Kalinga"/>
+          <w:b w:val="0"/>
+          <w:bCs w:val="0"/>
+          <w:color w:val="auto"/>
           <w:sz w:val="20"/>
           <w:szCs w:val="20"/>
         </w:rPr>
@@ -1238,6 +1549,7 @@
           <w:rFonts w:hint="default" w:ascii="Kalinga" w:hAnsi="Kalinga"/>
           <w:b w:val="0"/>
           <w:bCs w:val="0"/>
+          <w:color w:val="auto"/>
           <w:sz w:val="20"/>
           <w:szCs w:val="20"/>
           <w:lang w:val="en-US"/>
@@ -1247,37 +1559,642 @@
     </w:p>
     <w:p>
       <w:pPr>
-        <w:pStyle w:val="6"/>
+        <w:numPr>
+          <w:numId w:val="0"/>
+        </w:numPr>
+        <w:spacing w:after="0" w:line="240" w:lineRule="auto"/>
+        <w:ind w:left="80" w:leftChars="0"/>
+        <w:jc w:val="both"/>
+        <w:rPr>
+          <w:rFonts w:hint="default" w:ascii="Kalinga" w:hAnsi="Kalinga"/>
+          <w:b w:val="0"/>
+          <w:bCs w:val="0"/>
+          <w:color w:val="auto"/>
+          <w:sz w:val="20"/>
+          <w:szCs w:val="20"/>
+        </w:rPr>
+      </w:pPr>
+    </w:p>
+    <w:p>
+      <w:pPr>
+        <w:spacing w:after="0" w:line="240" w:lineRule="auto"/>
+        <w:jc w:val="both"/>
+        <w:rPr>
+          <w:rFonts w:hint="default" w:ascii="Kalinga" w:hAnsi="Kalinga"/>
+          <w:b/>
+          <w:bCs/>
+          <w:sz w:val="20"/>
+          <w:szCs w:val="20"/>
+          <w:u w:val="single"/>
+          <w:lang w:val="en-US"/>
+        </w:rPr>
+      </w:pPr>
+      <w:r>
+        <w:rPr>
+          <w:rFonts w:hint="default" w:ascii="Kalinga" w:hAnsi="Kalinga"/>
+          <w:b/>
+          <w:bCs/>
+          <w:sz w:val="20"/>
+          <w:szCs w:val="20"/>
+          <w:u w:val="single"/>
+          <w:lang w:val="en-US"/>
+        </w:rPr>
+        <w:t>Verifikasi Pihak Ketiga</w:t>
+      </w:r>
+    </w:p>
+    <w:bookmarkEnd w:id="21"/>
+    <w:p>
+      <w:pPr>
+        <w:spacing w:after="0" w:line="240" w:lineRule="auto"/>
+        <w:jc w:val="both"/>
+        <w:rPr>
+          <w:rFonts w:hint="default" w:ascii="Kalinga" w:hAnsi="Kalinga" w:cs="Kalinga"/>
+          <w:b/>
+          <w:bCs/>
+          <w:color w:val="auto"/>
+          <w:sz w:val="20"/>
+          <w:szCs w:val="20"/>
+          <w:lang w:val="en-US"/>
+        </w:rPr>
+      </w:pPr>
+      <w:bookmarkStart w:id="35" w:name="OLE_LINK25"/>
+      <w:bookmarkStart w:id="36" w:name="OLE_LINK18"/>
+      <w:bookmarkStart w:id="37" w:name="OLE_LINK9"/>
+      <w:r>
+        <w:rPr>
+          <w:rFonts w:hint="default" w:ascii="Kalinga" w:hAnsi="Kalinga"/>
+          <w:b/>
+          <w:bCs/>
+          <w:sz w:val="20"/>
+          <w:szCs w:val="20"/>
+        </w:rPr>
+        <w:t>Tg</w:t>
+      </w:r>
+      <w:r>
+        <w:rPr>
+          <w:rFonts w:hint="default" w:ascii="Kalinga" w:hAnsi="Kalinga" w:cs="Kalinga"/>
+          <w:b/>
+          <w:bCs/>
+          <w:color w:val="auto"/>
+          <w:sz w:val="20"/>
+          <w:szCs w:val="20"/>
+        </w:rPr>
+        <w:t xml:space="preserve">l. Call Memo </w:t>
+      </w:r>
+      <w:r>
+        <w:rPr>
+          <w:rFonts w:hint="default" w:ascii="Kalinga" w:hAnsi="Kalinga" w:cs="Kalinga"/>
+          <w:b/>
+          <w:bCs/>
+          <w:color w:val="auto"/>
+          <w:sz w:val="20"/>
+          <w:szCs w:val="20"/>
+        </w:rPr>
+        <w:tab/>
+      </w:r>
+      <w:r>
+        <w:rPr>
+          <w:rFonts w:hint="default" w:ascii="Kalinga" w:hAnsi="Kalinga" w:cs="Kalinga"/>
+          <w:b/>
+          <w:bCs/>
+          <w:color w:val="auto"/>
+          <w:sz w:val="20"/>
+          <w:szCs w:val="20"/>
+        </w:rPr>
+        <w:tab/>
+      </w:r>
+      <w:r>
+        <w:rPr>
+          <w:rFonts w:hint="default" w:ascii="Kalinga" w:hAnsi="Kalinga" w:cs="Kalinga"/>
+          <w:b/>
+          <w:bCs/>
+          <w:color w:val="auto"/>
+          <w:sz w:val="20"/>
+          <w:szCs w:val="20"/>
+        </w:rPr>
+        <w:t xml:space="preserve">: </w:t>
+      </w:r>
+      <w:r>
+        <w:rPr>
+          <w:rFonts w:hint="default" w:ascii="Kalinga" w:hAnsi="Kalinga" w:cs="Kalinga"/>
+          <w:b/>
+          <w:bCs/>
+          <w:color w:val="auto"/>
+          <w:sz w:val="20"/>
+          <w:szCs w:val="20"/>
+          <w:lang w:val="en-US"/>
+        </w:rPr>
+        <w:t>{{</w:t>
+      </w:r>
+      <w:r>
+        <w:rPr>
+          <w:rFonts w:hint="default" w:ascii="Kalinga" w:hAnsi="Kalinga" w:cs="Kalinga"/>
+          <w:b/>
+          <w:bCs/>
+          <w:color w:val="auto"/>
+          <w:sz w:val="20"/>
+          <w:szCs w:val="20"/>
+        </w:rPr>
+        <w:t>tgl_call_memo</w:t>
+      </w:r>
+      <w:r>
+        <w:rPr>
+          <w:rFonts w:hint="default" w:ascii="Kalinga" w:hAnsi="Kalinga" w:cs="Kalinga"/>
+          <w:b/>
+          <w:bCs/>
+          <w:color w:val="auto"/>
+          <w:sz w:val="20"/>
+          <w:szCs w:val="20"/>
+          <w:lang w:val="en-US"/>
+        </w:rPr>
+        <w:t>}}</w:t>
+      </w:r>
+    </w:p>
+    <w:p>
+      <w:pPr>
+        <w:spacing w:after="0" w:line="240" w:lineRule="auto"/>
+        <w:jc w:val="both"/>
+        <w:rPr>
+          <w:rFonts w:hint="default" w:ascii="Kalinga" w:hAnsi="Kalinga" w:cs="Kalinga"/>
+          <w:b/>
+          <w:bCs/>
+          <w:color w:val="auto"/>
+          <w:sz w:val="20"/>
+          <w:szCs w:val="20"/>
+        </w:rPr>
+      </w:pPr>
+      <w:r>
+        <w:rPr>
+          <w:rFonts w:hint="default" w:ascii="Kalinga" w:hAnsi="Kalinga" w:cs="Kalinga"/>
+          <w:b/>
+          <w:bCs/>
+          <w:color w:val="auto"/>
+          <w:sz w:val="20"/>
+          <w:szCs w:val="20"/>
+        </w:rPr>
+        <w:t xml:space="preserve">Yang diverifikasi </w:t>
+      </w:r>
+      <w:r>
+        <w:rPr>
+          <w:rFonts w:hint="default" w:ascii="Kalinga" w:hAnsi="Kalinga" w:cs="Kalinga"/>
+          <w:b/>
+          <w:bCs/>
+          <w:color w:val="auto"/>
+          <w:sz w:val="20"/>
+          <w:szCs w:val="20"/>
+        </w:rPr>
+        <w:tab/>
+      </w:r>
+      <w:r>
+        <w:rPr>
+          <w:rFonts w:hint="default" w:ascii="Kalinga" w:hAnsi="Kalinga" w:cs="Kalinga"/>
+          <w:b/>
+          <w:bCs/>
+          <w:color w:val="auto"/>
+          <w:sz w:val="20"/>
+          <w:szCs w:val="20"/>
+        </w:rPr>
+        <w:t xml:space="preserve">: </w:t>
+      </w:r>
+      <w:r>
+        <w:rPr>
+          <w:rFonts w:hint="default" w:ascii="Kalinga" w:hAnsi="Kalinga" w:cs="Kalinga"/>
+          <w:b/>
+          <w:bCs/>
+          <w:color w:val="auto"/>
+          <w:sz w:val="20"/>
+          <w:szCs w:val="20"/>
+          <w:lang w:val="en-US"/>
+        </w:rPr>
+        <w:t>{{</w:t>
+      </w:r>
+      <w:r>
+        <w:rPr>
+          <w:rFonts w:hint="default" w:ascii="Kalinga" w:hAnsi="Kalinga" w:cs="Kalinga"/>
+          <w:b/>
+          <w:bCs/>
+          <w:color w:val="auto"/>
+          <w:sz w:val="20"/>
+          <w:szCs w:val="20"/>
+        </w:rPr>
+        <w:t>nama_bendahara</w:t>
+      </w:r>
+      <w:r>
+        <w:rPr>
+          <w:rFonts w:hint="default" w:ascii="Kalinga" w:hAnsi="Kalinga" w:cs="Kalinga"/>
+          <w:b/>
+          <w:bCs/>
+          <w:color w:val="auto"/>
+          <w:sz w:val="20"/>
+          <w:szCs w:val="20"/>
+          <w:lang w:val="en-US"/>
+        </w:rPr>
+        <w:t>}}</w:t>
+      </w:r>
+      <w:r>
+        <w:rPr>
+          <w:rFonts w:hint="default" w:ascii="Kalinga" w:hAnsi="Kalinga" w:cs="Kalinga"/>
+          <w:b/>
+          <w:bCs/>
+          <w:color w:val="auto"/>
+          <w:sz w:val="20"/>
+          <w:szCs w:val="20"/>
+        </w:rPr>
+        <w:t xml:space="preserve"> (Bendahara)</w:t>
+      </w:r>
+    </w:p>
+    <w:p>
+      <w:pPr>
+        <w:spacing w:after="0" w:line="240" w:lineRule="auto"/>
+        <w:jc w:val="both"/>
+        <w:rPr>
+          <w:rFonts w:hint="default" w:ascii="Kalinga" w:hAnsi="Kalinga" w:cs="Kalinga"/>
+          <w:b/>
+          <w:bCs/>
+          <w:color w:val="auto"/>
+          <w:sz w:val="20"/>
+          <w:szCs w:val="20"/>
+        </w:rPr>
+      </w:pPr>
+      <w:r>
+        <w:rPr>
+          <w:rFonts w:hint="default" w:ascii="Kalinga" w:hAnsi="Kalinga" w:cs="Kalinga"/>
+          <w:b/>
+          <w:bCs/>
+          <w:color w:val="auto"/>
+          <w:sz w:val="20"/>
+          <w:szCs w:val="20"/>
+        </w:rPr>
+        <w:t xml:space="preserve">Bentuk Call </w:t>
+      </w:r>
+      <w:r>
+        <w:rPr>
+          <w:rFonts w:hint="default" w:ascii="Kalinga" w:hAnsi="Kalinga" w:cs="Kalinga"/>
+          <w:b/>
+          <w:bCs/>
+          <w:color w:val="auto"/>
+          <w:sz w:val="20"/>
+          <w:szCs w:val="20"/>
+        </w:rPr>
+        <w:tab/>
+      </w:r>
+      <w:r>
+        <w:rPr>
+          <w:rFonts w:hint="default" w:ascii="Kalinga" w:hAnsi="Kalinga" w:cs="Kalinga"/>
+          <w:b/>
+          <w:bCs/>
+          <w:color w:val="auto"/>
+          <w:sz w:val="20"/>
+          <w:szCs w:val="20"/>
+        </w:rPr>
+        <w:tab/>
+      </w:r>
+      <w:r>
+        <w:rPr>
+          <w:rFonts w:hint="default" w:ascii="Kalinga" w:hAnsi="Kalinga" w:cs="Kalinga"/>
+          <w:b/>
+          <w:bCs/>
+          <w:color w:val="auto"/>
+          <w:sz w:val="20"/>
+          <w:szCs w:val="20"/>
+        </w:rPr>
+        <w:t>: Wawancara via Telepon (</w:t>
+      </w:r>
+      <w:r>
+        <w:rPr>
+          <w:rFonts w:hint="default" w:ascii="Kalinga" w:hAnsi="Kalinga" w:cs="Kalinga"/>
+          <w:b/>
+          <w:bCs/>
+          <w:color w:val="auto"/>
+          <w:sz w:val="20"/>
+          <w:szCs w:val="20"/>
+          <w:lang w:val="en-US"/>
+        </w:rPr>
+        <w:t>{{</w:t>
+      </w:r>
+      <w:r>
+        <w:rPr>
+          <w:rFonts w:hint="default" w:ascii="Kalinga" w:hAnsi="Kalinga" w:cs="Kalinga"/>
+          <w:b/>
+          <w:bCs/>
+          <w:color w:val="auto"/>
+          <w:sz w:val="20"/>
+          <w:szCs w:val="20"/>
+        </w:rPr>
+        <w:t>no_</w:t>
+      </w:r>
+      <w:r>
+        <w:rPr>
+          <w:rFonts w:hint="default" w:ascii="Kalinga" w:hAnsi="Kalinga" w:cs="Kalinga"/>
+          <w:b/>
+          <w:bCs/>
+          <w:color w:val="auto"/>
+          <w:sz w:val="20"/>
+          <w:szCs w:val="20"/>
+          <w:lang w:val="en-US"/>
+        </w:rPr>
+        <w:t>hp</w:t>
+      </w:r>
+      <w:r>
+        <w:rPr>
+          <w:rFonts w:hint="default" w:ascii="Kalinga" w:hAnsi="Kalinga" w:cs="Kalinga"/>
+          <w:b/>
+          <w:bCs/>
+          <w:color w:val="auto"/>
+          <w:sz w:val="20"/>
+          <w:szCs w:val="20"/>
+        </w:rPr>
+        <w:t>_bendahara</w:t>
+      </w:r>
+      <w:r>
+        <w:rPr>
+          <w:rFonts w:hint="default" w:ascii="Kalinga" w:hAnsi="Kalinga" w:cs="Kalinga"/>
+          <w:b/>
+          <w:bCs/>
+          <w:color w:val="auto"/>
+          <w:sz w:val="20"/>
+          <w:szCs w:val="20"/>
+          <w:lang w:val="en-US"/>
+        </w:rPr>
+        <w:t>}}</w:t>
+      </w:r>
+      <w:r>
+        <w:rPr>
+          <w:rFonts w:hint="default" w:ascii="Kalinga" w:hAnsi="Kalinga" w:cs="Kalinga"/>
+          <w:b/>
+          <w:bCs/>
+          <w:color w:val="auto"/>
+          <w:sz w:val="20"/>
+          <w:szCs w:val="20"/>
+        </w:rPr>
+        <w:t>)</w:t>
+      </w:r>
+    </w:p>
+    <w:p>
+      <w:pPr>
+        <w:spacing w:after="0" w:line="240" w:lineRule="auto"/>
+        <w:jc w:val="both"/>
+        <w:rPr>
+          <w:rFonts w:hint="default" w:ascii="Kalinga" w:hAnsi="Kalinga" w:cs="Kalinga"/>
+          <w:b/>
+          <w:bCs/>
+          <w:color w:val="auto"/>
+          <w:sz w:val="20"/>
+          <w:szCs w:val="20"/>
+        </w:rPr>
+      </w:pPr>
+      <w:r>
+        <w:rPr>
+          <w:rFonts w:hint="default" w:ascii="Kalinga" w:hAnsi="Kalinga" w:cs="Kalinga"/>
+          <w:b/>
+          <w:bCs/>
+          <w:color w:val="auto"/>
+          <w:sz w:val="20"/>
+          <w:szCs w:val="20"/>
+        </w:rPr>
+        <w:t xml:space="preserve">Tujuan Call </w:t>
+      </w:r>
+      <w:r>
+        <w:rPr>
+          <w:rFonts w:hint="default" w:ascii="Kalinga" w:hAnsi="Kalinga" w:cs="Kalinga"/>
+          <w:b/>
+          <w:bCs/>
+          <w:color w:val="auto"/>
+          <w:sz w:val="20"/>
+          <w:szCs w:val="20"/>
+        </w:rPr>
+        <w:tab/>
+      </w:r>
+      <w:r>
+        <w:rPr>
+          <w:rFonts w:hint="default" w:ascii="Kalinga" w:hAnsi="Kalinga" w:cs="Kalinga"/>
+          <w:b/>
+          <w:bCs/>
+          <w:color w:val="auto"/>
+          <w:sz w:val="20"/>
+          <w:szCs w:val="20"/>
+        </w:rPr>
+        <w:tab/>
+      </w:r>
+      <w:r>
+        <w:rPr>
+          <w:rFonts w:hint="default" w:ascii="Kalinga" w:hAnsi="Kalinga" w:cs="Kalinga"/>
+          <w:b/>
+          <w:bCs/>
+          <w:color w:val="auto"/>
+          <w:sz w:val="20"/>
+          <w:szCs w:val="20"/>
+        </w:rPr>
+        <w:t>: Konfirmasi Gaji Pemohon</w:t>
+      </w:r>
+    </w:p>
+    <w:p>
+      <w:pPr>
+        <w:spacing w:after="0" w:line="240" w:lineRule="auto"/>
+        <w:jc w:val="both"/>
+        <w:rPr>
+          <w:rFonts w:hint="default" w:ascii="Kalinga" w:hAnsi="Kalinga"/>
+          <w:b/>
+          <w:bCs/>
+          <w:sz w:val="20"/>
+          <w:szCs w:val="20"/>
+        </w:rPr>
+      </w:pPr>
+      <w:r>
+        <w:rPr>
+          <w:rFonts w:hint="default" w:ascii="Kalinga" w:hAnsi="Kalinga" w:cs="Kalinga"/>
+          <w:b/>
+          <w:bCs/>
+          <w:color w:val="auto"/>
+          <w:sz w:val="20"/>
+          <w:szCs w:val="20"/>
+        </w:rPr>
+        <w:t>Inform</w:t>
+      </w:r>
+      <w:r>
+        <w:rPr>
+          <w:rFonts w:hint="default" w:ascii="Kalinga" w:hAnsi="Kalinga"/>
+          <w:b/>
+          <w:bCs/>
+          <w:sz w:val="20"/>
+          <w:szCs w:val="20"/>
+        </w:rPr>
+        <w:t>asi yang diberikan:</w:t>
+      </w:r>
+    </w:p>
+    <w:bookmarkEnd w:id="35"/>
+    <w:bookmarkEnd w:id="36"/>
+    <w:bookmarkEnd w:id="37"/>
+    <w:p>
+      <w:pPr>
+        <w:spacing w:after="0" w:line="240" w:lineRule="auto"/>
+        <w:jc w:val="both"/>
+        <w:rPr>
+          <w:rFonts w:hint="default" w:ascii="Kalinga" w:hAnsi="Kalinga"/>
+          <w:b w:val="0"/>
+          <w:bCs w:val="0"/>
+          <w:color w:val="auto"/>
+          <w:sz w:val="20"/>
+          <w:szCs w:val="20"/>
+        </w:rPr>
+      </w:pPr>
+      <w:r>
+        <w:rPr>
+          <w:rFonts w:hint="default" w:ascii="Kalinga" w:hAnsi="Kalinga"/>
+          <w:b w:val="0"/>
+          <w:bCs w:val="0"/>
+          <w:color w:val="auto"/>
+          <w:sz w:val="20"/>
+          <w:szCs w:val="20"/>
+        </w:rPr>
+        <w:t>{{#list_verifikasi_bendahara}}</w:t>
+      </w:r>
+    </w:p>
+    <w:p>
+      <w:pPr>
         <w:numPr>
           <w:ilvl w:val="0"/>
           <w:numId w:val="1"/>
         </w:numPr>
-        <w:spacing w:line="240" w:lineRule="auto"/>
-        <w:ind w:left="660" w:leftChars="0" w:right="160" w:rightChars="0" w:hanging="280" w:firstLineChars="0"/>
-        <w:jc w:val="both"/>
-        <w:rPr>
-          <w:rFonts w:hint="default" w:ascii="Kalinga" w:hAnsi="Kalinga"/>
-          <w:b w:val="0"/>
-          <w:bCs w:val="0"/>
-          <w:sz w:val="20"/>
-          <w:szCs w:val="20"/>
-        </w:rPr>
-      </w:pPr>
-      <w:r>
-        <w:rPr>
-          <w:rFonts w:hint="default" w:ascii="Kalinga" w:hAnsi="Kalinga"/>
-          <w:b w:val="0"/>
-          <w:bCs w:val="0"/>
-          <w:sz w:val="20"/>
-          <w:szCs w:val="20"/>
-        </w:rPr>
-        <w:t xml:space="preserve">Gaji Bulan </w:t>
-      </w:r>
-      <w:r>
-        <w:rPr>
-          <w:rFonts w:hint="default" w:ascii="Kalinga" w:hAnsi="Kalinga"/>
-          <w:b w:val="0"/>
-          <w:bCs w:val="0"/>
+        <w:spacing w:after="0" w:line="240" w:lineRule="auto"/>
+        <w:ind w:left="440" w:leftChars="0" w:hanging="360" w:firstLineChars="0"/>
+        <w:jc w:val="both"/>
+        <w:rPr>
+          <w:rFonts w:hint="default" w:ascii="Kalinga" w:hAnsi="Kalinga"/>
+          <w:b w:val="0"/>
+          <w:bCs w:val="0"/>
+          <w:color w:val="auto"/>
+          <w:sz w:val="20"/>
+          <w:szCs w:val="20"/>
+        </w:rPr>
+      </w:pPr>
+      <w:r>
+        <w:rPr>
+          <w:rFonts w:hint="default" w:ascii="Kalinga" w:hAnsi="Kalinga"/>
+          <w:b w:val="0"/>
+          <w:bCs w:val="0"/>
+          <w:color w:val="auto"/>
+          <w:sz w:val="20"/>
+          <w:szCs w:val="20"/>
+        </w:rPr>
+        <w:t>{{text}}</w:t>
+      </w:r>
+    </w:p>
+    <w:p>
+      <w:pPr>
+        <w:spacing w:after="0" w:line="240" w:lineRule="auto"/>
+        <w:jc w:val="both"/>
+        <w:rPr>
+          <w:rFonts w:ascii="Kalinga" w:hAnsi="Kalinga" w:cs="Kalinga"/>
+          <w:b w:val="0"/>
+          <w:bCs w:val="0"/>
+          <w:color w:val="auto"/>
+          <w:sz w:val="20"/>
+          <w:szCs w:val="20"/>
+        </w:rPr>
+      </w:pPr>
+      <w:r>
+        <w:rPr>
+          <w:rFonts w:hint="default" w:ascii="Kalinga" w:hAnsi="Kalinga"/>
+          <w:b w:val="0"/>
+          <w:bCs w:val="0"/>
+          <w:color w:val="auto"/>
+          <w:sz w:val="20"/>
+          <w:szCs w:val="20"/>
+        </w:rPr>
+        <w:t>{{/list_verifikasi_bendahara}}</w:t>
+      </w:r>
+    </w:p>
+    <w:p>
+      <w:pPr>
+        <w:spacing w:after="0" w:line="240" w:lineRule="auto"/>
+        <w:jc w:val="both"/>
+        <w:rPr>
+          <w:rFonts w:ascii="Kalinga" w:hAnsi="Kalinga" w:cs="Kalinga"/>
+          <w:b/>
+          <w:bCs/>
+          <w:color w:val="auto"/>
+          <w:sz w:val="20"/>
+          <w:szCs w:val="20"/>
+        </w:rPr>
+      </w:pPr>
+    </w:p>
+    <w:p>
+      <w:pPr>
+        <w:spacing w:after="0" w:line="240" w:lineRule="auto"/>
+        <w:jc w:val="both"/>
+        <w:rPr>
+          <w:rFonts w:hint="default" w:ascii="Kalinga" w:hAnsi="Kalinga" w:cs="Kalinga"/>
+          <w:b/>
+          <w:bCs/>
+          <w:color w:val="auto"/>
+          <w:sz w:val="20"/>
+          <w:szCs w:val="20"/>
+          <w:lang w:val="en-US"/>
+        </w:rPr>
+      </w:pPr>
+      <w:bookmarkStart w:id="38" w:name="OLE_LINK59"/>
+      <w:r>
+        <w:rPr>
+          <w:rFonts w:hint="default" w:ascii="Kalinga" w:hAnsi="Kalinga"/>
+          <w:b/>
+          <w:bCs/>
+          <w:color w:val="auto"/>
+          <w:sz w:val="20"/>
+          <w:szCs w:val="20"/>
+        </w:rPr>
+        <w:t>T</w:t>
+      </w:r>
+      <w:r>
+        <w:rPr>
+          <w:rFonts w:hint="default" w:ascii="Kalinga" w:hAnsi="Kalinga" w:cs="Kalinga"/>
+          <w:b/>
+          <w:bCs/>
+          <w:color w:val="auto"/>
+          <w:sz w:val="20"/>
+          <w:szCs w:val="20"/>
+        </w:rPr>
+        <w:t xml:space="preserve">gl. Call Memo </w:t>
+      </w:r>
+      <w:r>
+        <w:rPr>
+          <w:rFonts w:hint="default" w:ascii="Kalinga" w:hAnsi="Kalinga" w:cs="Kalinga"/>
+          <w:b/>
+          <w:bCs/>
+          <w:color w:val="auto"/>
+          <w:sz w:val="20"/>
+          <w:szCs w:val="20"/>
+        </w:rPr>
+        <w:tab/>
+      </w:r>
+      <w:r>
+        <w:rPr>
+          <w:rFonts w:hint="default" w:ascii="Kalinga" w:hAnsi="Kalinga" w:cs="Kalinga"/>
+          <w:b/>
+          <w:bCs/>
+          <w:color w:val="auto"/>
+          <w:sz w:val="20"/>
+          <w:szCs w:val="20"/>
+        </w:rPr>
+        <w:tab/>
+      </w:r>
+      <w:r>
+        <w:rPr>
+          <w:rFonts w:hint="default" w:ascii="Kalinga" w:hAnsi="Kalinga" w:cs="Kalinga"/>
+          <w:b/>
+          <w:bCs/>
+          <w:color w:val="auto"/>
+          <w:sz w:val="20"/>
+          <w:szCs w:val="20"/>
+        </w:rPr>
+        <w:t xml:space="preserve">: </w:t>
+      </w:r>
+      <w:r>
+        <w:rPr>
+          <w:rFonts w:hint="default" w:ascii="Kalinga" w:hAnsi="Kalinga" w:cs="Kalinga"/>
+          <w:b/>
+          <w:bCs/>
+          <w:color w:val="auto"/>
           <w:sz w:val="20"/>
           <w:szCs w:val="20"/>
           <w:lang w:val="en-US"/>
@@ -1286,227 +2203,617 @@
       </w:r>
       <w:r>
         <w:rPr>
-          <w:rFonts w:hint="default" w:ascii="Kalinga" w:hAnsi="Kalinga"/>
-          <w:b w:val="0"/>
-          <w:bCs w:val="0"/>
-          <w:sz w:val="20"/>
-          <w:szCs w:val="20"/>
-        </w:rPr>
-        <w:t>gaji_bulan_2_nama</w:t>
-      </w:r>
-      <w:r>
-        <w:rPr>
-          <w:rFonts w:hint="default" w:ascii="Kalinga" w:hAnsi="Kalinga"/>
-          <w:b w:val="0"/>
-          <w:bCs w:val="0"/>
+          <w:rFonts w:hint="default" w:ascii="Kalinga" w:hAnsi="Kalinga" w:cs="Kalinga"/>
+          <w:b/>
+          <w:bCs/>
+          <w:color w:val="auto"/>
+          <w:sz w:val="20"/>
+          <w:szCs w:val="20"/>
+        </w:rPr>
+        <w:t>tgl_call_memo</w:t>
+      </w:r>
+      <w:r>
+        <w:rPr>
+          <w:rFonts w:hint="default" w:ascii="Kalinga" w:hAnsi="Kalinga" w:cs="Kalinga"/>
+          <w:b/>
+          <w:bCs/>
+          <w:color w:val="auto"/>
           <w:sz w:val="20"/>
           <w:szCs w:val="20"/>
           <w:lang w:val="en-US"/>
         </w:rPr>
         <w:t>}}</w:t>
       </w:r>
-      <w:r>
-        <w:rPr>
-          <w:rFonts w:hint="default" w:ascii="Kalinga" w:hAnsi="Kalinga"/>
-          <w:b w:val="0"/>
-          <w:bCs w:val="0"/>
-          <w:sz w:val="20"/>
-          <w:szCs w:val="20"/>
-        </w:rPr>
-        <w:tab/>
-      </w:r>
-      <w:r>
-        <w:rPr>
-          <w:rFonts w:hint="default" w:ascii="Kalinga" w:hAnsi="Kalinga"/>
-          <w:b w:val="0"/>
-          <w:bCs w:val="0"/>
-          <w:sz w:val="20"/>
-          <w:szCs w:val="20"/>
-        </w:rPr>
-        <w:tab/>
-      </w:r>
-      <w:r>
-        <w:rPr>
-          <w:rFonts w:hint="default" w:ascii="Kalinga" w:hAnsi="Kalinga"/>
-          <w:b w:val="0"/>
-          <w:bCs w:val="0"/>
-          <w:sz w:val="20"/>
-          <w:szCs w:val="20"/>
-          <w:lang w:val="en-US"/>
-        </w:rPr>
-        <w:tab/>
-      </w:r>
-      <w:r>
-        <w:rPr>
-          <w:rFonts w:hint="default" w:ascii="Kalinga" w:hAnsi="Kalinga"/>
-          <w:b w:val="0"/>
-          <w:bCs w:val="0"/>
-          <w:sz w:val="20"/>
-          <w:szCs w:val="20"/>
-        </w:rPr>
-        <w:t xml:space="preserve">Rp. </w:t>
-      </w:r>
-      <w:r>
-        <w:rPr>
-          <w:rFonts w:hint="default" w:ascii="Kalinga" w:hAnsi="Kalinga"/>
-          <w:b w:val="0"/>
-          <w:bCs w:val="0"/>
-          <w:sz w:val="20"/>
-          <w:szCs w:val="20"/>
-          <w:lang w:val="en-US"/>
-        </w:rPr>
-        <w:t>{{gaji_bulan_2}}</w:t>
-      </w:r>
-      <w:r>
-        <w:rPr>
-          <w:rFonts w:hint="default" w:ascii="Kalinga" w:hAnsi="Kalinga"/>
-          <w:b w:val="0"/>
-          <w:bCs w:val="0"/>
-          <w:sz w:val="20"/>
-          <w:szCs w:val="20"/>
-        </w:rPr>
-        <w:t>,-</w:t>
-      </w:r>
-      <w:r>
-        <w:rPr>
-          <w:rFonts w:hint="default" w:ascii="Kalinga" w:hAnsi="Kalinga"/>
-          <w:b w:val="0"/>
-          <w:bCs w:val="0"/>
-          <w:sz w:val="20"/>
-          <w:szCs w:val="20"/>
-          <w:lang w:val="en-US"/>
-        </w:rPr>
-        <w:t>.</w:t>
-      </w:r>
-    </w:p>
-    <w:p>
-      <w:pPr>
-        <w:pStyle w:val="6"/>
+    </w:p>
+    <w:p>
+      <w:pPr>
+        <w:spacing w:after="0" w:line="240" w:lineRule="auto"/>
+        <w:jc w:val="both"/>
+        <w:rPr>
+          <w:rFonts w:hint="default" w:ascii="Kalinga" w:hAnsi="Kalinga" w:cs="Kalinga"/>
+          <w:b/>
+          <w:bCs/>
+          <w:color w:val="auto"/>
+          <w:sz w:val="20"/>
+          <w:szCs w:val="20"/>
+        </w:rPr>
+      </w:pPr>
+      <w:r>
+        <w:rPr>
+          <w:rFonts w:hint="default" w:ascii="Kalinga" w:hAnsi="Kalinga" w:cs="Kalinga"/>
+          <w:b/>
+          <w:bCs/>
+          <w:color w:val="auto"/>
+          <w:sz w:val="20"/>
+          <w:szCs w:val="20"/>
+        </w:rPr>
+        <w:t xml:space="preserve">Yang diverifikasi </w:t>
+      </w:r>
+      <w:r>
+        <w:rPr>
+          <w:rFonts w:hint="default" w:ascii="Kalinga" w:hAnsi="Kalinga" w:cs="Kalinga"/>
+          <w:b/>
+          <w:bCs/>
+          <w:color w:val="auto"/>
+          <w:sz w:val="20"/>
+          <w:szCs w:val="20"/>
+        </w:rPr>
+        <w:tab/>
+      </w:r>
+      <w:r>
+        <w:rPr>
+          <w:rFonts w:hint="default" w:ascii="Kalinga" w:hAnsi="Kalinga" w:cs="Kalinga"/>
+          <w:b/>
+          <w:bCs/>
+          <w:color w:val="auto"/>
+          <w:sz w:val="20"/>
+          <w:szCs w:val="20"/>
+        </w:rPr>
+        <w:t xml:space="preserve">: </w:t>
+      </w:r>
+      <w:r>
+        <w:rPr>
+          <w:rFonts w:hint="default" w:ascii="Kalinga" w:hAnsi="Kalinga" w:cs="Kalinga"/>
+          <w:b/>
+          <w:bCs/>
+          <w:color w:val="auto"/>
+          <w:sz w:val="20"/>
+          <w:szCs w:val="20"/>
+          <w:lang w:val="en-US"/>
+        </w:rPr>
+        <w:t>{{</w:t>
+      </w:r>
+      <w:r>
+        <w:rPr>
+          <w:rFonts w:hint="default" w:ascii="Kalinga" w:hAnsi="Kalinga" w:cs="Kalinga"/>
+          <w:b/>
+          <w:bCs/>
+          <w:color w:val="auto"/>
+          <w:sz w:val="20"/>
+          <w:szCs w:val="20"/>
+        </w:rPr>
+        <w:t>nama_rekan_kerja</w:t>
+      </w:r>
+      <w:r>
+        <w:rPr>
+          <w:rFonts w:hint="default" w:ascii="Kalinga" w:hAnsi="Kalinga" w:cs="Kalinga"/>
+          <w:b/>
+          <w:bCs/>
+          <w:color w:val="auto"/>
+          <w:sz w:val="20"/>
+          <w:szCs w:val="20"/>
+          <w:lang w:val="en-US"/>
+        </w:rPr>
+        <w:t>}}</w:t>
+      </w:r>
+      <w:r>
+        <w:rPr>
+          <w:rFonts w:hint="default" w:ascii="Kalinga" w:hAnsi="Kalinga" w:cs="Kalinga"/>
+          <w:b/>
+          <w:bCs/>
+          <w:color w:val="auto"/>
+          <w:sz w:val="20"/>
+          <w:szCs w:val="20"/>
+        </w:rPr>
+        <w:t xml:space="preserve"> (Rekan Kerja)</w:t>
+      </w:r>
+    </w:p>
+    <w:p>
+      <w:pPr>
+        <w:spacing w:after="0" w:line="240" w:lineRule="auto"/>
+        <w:jc w:val="both"/>
+        <w:rPr>
+          <w:rFonts w:hint="default" w:ascii="Kalinga" w:hAnsi="Kalinga" w:cs="Kalinga"/>
+          <w:b/>
+          <w:bCs/>
+          <w:color w:val="auto"/>
+          <w:sz w:val="20"/>
+          <w:szCs w:val="20"/>
+        </w:rPr>
+      </w:pPr>
+      <w:r>
+        <w:rPr>
+          <w:rFonts w:hint="default" w:ascii="Kalinga" w:hAnsi="Kalinga" w:cs="Kalinga"/>
+          <w:b/>
+          <w:bCs/>
+          <w:color w:val="auto"/>
+          <w:sz w:val="20"/>
+          <w:szCs w:val="20"/>
+        </w:rPr>
+        <w:t xml:space="preserve">Bentuk Call </w:t>
+      </w:r>
+      <w:r>
+        <w:rPr>
+          <w:rFonts w:hint="default" w:ascii="Kalinga" w:hAnsi="Kalinga" w:cs="Kalinga"/>
+          <w:b/>
+          <w:bCs/>
+          <w:color w:val="auto"/>
+          <w:sz w:val="20"/>
+          <w:szCs w:val="20"/>
+        </w:rPr>
+        <w:tab/>
+      </w:r>
+      <w:r>
+        <w:rPr>
+          <w:rFonts w:hint="default" w:ascii="Kalinga" w:hAnsi="Kalinga" w:cs="Kalinga"/>
+          <w:b/>
+          <w:bCs/>
+          <w:color w:val="auto"/>
+          <w:sz w:val="20"/>
+          <w:szCs w:val="20"/>
+        </w:rPr>
+        <w:tab/>
+      </w:r>
+      <w:r>
+        <w:rPr>
+          <w:rFonts w:hint="default" w:ascii="Kalinga" w:hAnsi="Kalinga" w:cs="Kalinga"/>
+          <w:b/>
+          <w:bCs/>
+          <w:color w:val="auto"/>
+          <w:sz w:val="20"/>
+          <w:szCs w:val="20"/>
+        </w:rPr>
+        <w:t>: Wawancara via Telepon (</w:t>
+      </w:r>
+      <w:r>
+        <w:rPr>
+          <w:rFonts w:hint="default" w:ascii="Kalinga" w:hAnsi="Kalinga" w:cs="Kalinga"/>
+          <w:b/>
+          <w:bCs/>
+          <w:color w:val="auto"/>
+          <w:sz w:val="20"/>
+          <w:szCs w:val="20"/>
+          <w:lang w:val="en-US"/>
+        </w:rPr>
+        <w:t>{{</w:t>
+      </w:r>
+      <w:r>
+        <w:rPr>
+          <w:rFonts w:hint="default" w:ascii="Kalinga" w:hAnsi="Kalinga" w:cs="Kalinga"/>
+          <w:b/>
+          <w:bCs/>
+          <w:color w:val="auto"/>
+          <w:sz w:val="20"/>
+          <w:szCs w:val="20"/>
+        </w:rPr>
+        <w:t>no_</w:t>
+      </w:r>
+      <w:r>
+        <w:rPr>
+          <w:rFonts w:hint="default" w:ascii="Kalinga" w:hAnsi="Kalinga" w:cs="Kalinga"/>
+          <w:b/>
+          <w:bCs/>
+          <w:color w:val="auto"/>
+          <w:sz w:val="20"/>
+          <w:szCs w:val="20"/>
+          <w:lang w:val="en-US"/>
+        </w:rPr>
+        <w:t>hp</w:t>
+      </w:r>
+      <w:r>
+        <w:rPr>
+          <w:rFonts w:hint="default" w:ascii="Kalinga" w:hAnsi="Kalinga" w:cs="Kalinga"/>
+          <w:b/>
+          <w:bCs/>
+          <w:color w:val="auto"/>
+          <w:sz w:val="20"/>
+          <w:szCs w:val="20"/>
+        </w:rPr>
+        <w:t>_rekan_kerja</w:t>
+      </w:r>
+      <w:r>
+        <w:rPr>
+          <w:rFonts w:hint="default" w:ascii="Kalinga" w:hAnsi="Kalinga" w:cs="Kalinga"/>
+          <w:b/>
+          <w:bCs/>
+          <w:color w:val="auto"/>
+          <w:sz w:val="20"/>
+          <w:szCs w:val="20"/>
+          <w:lang w:val="en-US"/>
+        </w:rPr>
+        <w:t>}}</w:t>
+      </w:r>
+      <w:r>
+        <w:rPr>
+          <w:rFonts w:hint="default" w:ascii="Kalinga" w:hAnsi="Kalinga" w:cs="Kalinga"/>
+          <w:b/>
+          <w:bCs/>
+          <w:color w:val="auto"/>
+          <w:sz w:val="20"/>
+          <w:szCs w:val="20"/>
+        </w:rPr>
+        <w:t>)</w:t>
+      </w:r>
+    </w:p>
+    <w:p>
+      <w:pPr>
+        <w:spacing w:after="0" w:line="240" w:lineRule="auto"/>
+        <w:jc w:val="both"/>
+        <w:rPr>
+          <w:rFonts w:hint="default" w:ascii="Kalinga" w:hAnsi="Kalinga" w:cs="Kalinga"/>
+          <w:b/>
+          <w:bCs/>
+          <w:color w:val="auto"/>
+          <w:sz w:val="20"/>
+          <w:szCs w:val="20"/>
+        </w:rPr>
+      </w:pPr>
+      <w:r>
+        <w:rPr>
+          <w:rFonts w:hint="default" w:ascii="Kalinga" w:hAnsi="Kalinga" w:cs="Kalinga"/>
+          <w:b/>
+          <w:bCs/>
+          <w:color w:val="auto"/>
+          <w:sz w:val="20"/>
+          <w:szCs w:val="20"/>
+        </w:rPr>
+        <w:t xml:space="preserve">Tujuan Call </w:t>
+      </w:r>
+      <w:r>
+        <w:rPr>
+          <w:rFonts w:hint="default" w:ascii="Kalinga" w:hAnsi="Kalinga" w:cs="Kalinga"/>
+          <w:b/>
+          <w:bCs/>
+          <w:color w:val="auto"/>
+          <w:sz w:val="20"/>
+          <w:szCs w:val="20"/>
+        </w:rPr>
+        <w:tab/>
+      </w:r>
+      <w:r>
+        <w:rPr>
+          <w:rFonts w:hint="default" w:ascii="Kalinga" w:hAnsi="Kalinga" w:cs="Kalinga"/>
+          <w:b/>
+          <w:bCs/>
+          <w:color w:val="auto"/>
+          <w:sz w:val="20"/>
+          <w:szCs w:val="20"/>
+        </w:rPr>
+        <w:tab/>
+      </w:r>
+      <w:r>
+        <w:rPr>
+          <w:rFonts w:hint="default" w:ascii="Kalinga" w:hAnsi="Kalinga" w:cs="Kalinga"/>
+          <w:b/>
+          <w:bCs/>
+          <w:color w:val="auto"/>
+          <w:sz w:val="20"/>
+          <w:szCs w:val="20"/>
+        </w:rPr>
+        <w:t>: Konfirmasi Gaji Pemohon</w:t>
+      </w:r>
+    </w:p>
+    <w:p>
+      <w:pPr>
+        <w:spacing w:after="0" w:line="240" w:lineRule="auto"/>
+        <w:jc w:val="both"/>
+        <w:rPr>
+          <w:rFonts w:hint="default" w:ascii="Kalinga" w:hAnsi="Kalinga" w:cs="Kalinga"/>
+          <w:color w:val="auto"/>
+          <w:sz w:val="20"/>
+          <w:szCs w:val="20"/>
+          <w:lang w:val="en-US"/>
+        </w:rPr>
+      </w:pPr>
+      <w:r>
+        <w:rPr>
+          <w:rFonts w:hint="default" w:ascii="Kalinga" w:hAnsi="Kalinga" w:cs="Kalinga"/>
+          <w:b/>
+          <w:bCs/>
+          <w:color w:val="auto"/>
+          <w:sz w:val="20"/>
+          <w:szCs w:val="20"/>
+        </w:rPr>
+        <w:t>Informa</w:t>
+      </w:r>
+      <w:r>
+        <w:rPr>
+          <w:rFonts w:hint="default" w:ascii="Kalinga" w:hAnsi="Kalinga"/>
+          <w:b/>
+          <w:bCs/>
+          <w:color w:val="auto"/>
+          <w:sz w:val="20"/>
+          <w:szCs w:val="20"/>
+        </w:rPr>
+        <w:t>si yang diberikan</w:t>
+      </w:r>
+      <w:r>
+        <w:rPr>
+          <w:rFonts w:hint="default" w:ascii="Kalinga" w:hAnsi="Kalinga"/>
+          <w:b/>
+          <w:bCs/>
+          <w:color w:val="auto"/>
+          <w:sz w:val="20"/>
+          <w:szCs w:val="20"/>
+        </w:rPr>
+        <w:tab/>
+      </w:r>
+      <w:r>
+        <w:rPr>
+          <w:rFonts w:hint="default" w:ascii="Kalinga" w:hAnsi="Kalinga"/>
+          <w:b/>
+          <w:bCs/>
+          <w:color w:val="auto"/>
+          <w:sz w:val="20"/>
+          <w:szCs w:val="20"/>
+        </w:rPr>
+        <w:t>:</w:t>
+      </w:r>
+    </w:p>
+    <w:bookmarkEnd w:id="38"/>
+    <w:p>
+      <w:pPr>
+        <w:spacing w:after="0" w:line="240" w:lineRule="auto"/>
+        <w:jc w:val="both"/>
+        <w:rPr>
+          <w:rFonts w:hint="default" w:ascii="Kalinga" w:hAnsi="Kalinga"/>
+          <w:b w:val="0"/>
+          <w:bCs w:val="0"/>
+          <w:sz w:val="20"/>
+          <w:szCs w:val="20"/>
+        </w:rPr>
+      </w:pPr>
+      <w:bookmarkStart w:id="39" w:name="OLE_LINK33"/>
+      <w:r>
+        <w:rPr>
+          <w:rFonts w:hint="default" w:ascii="Kalinga" w:hAnsi="Kalinga"/>
+          <w:b w:val="0"/>
+          <w:bCs w:val="0"/>
+          <w:sz w:val="20"/>
+          <w:szCs w:val="20"/>
+        </w:rPr>
+        <w:t>{{#list_verifikasi_rekan_kerja}}</w:t>
+      </w:r>
+    </w:p>
+    <w:p>
+      <w:pPr>
         <w:numPr>
           <w:ilvl w:val="0"/>
           <w:numId w:val="1"/>
         </w:numPr>
-        <w:spacing w:line="240" w:lineRule="auto"/>
-        <w:ind w:left="660" w:leftChars="0" w:right="160" w:rightChars="0" w:hanging="280" w:firstLineChars="0"/>
+        <w:spacing w:after="0" w:line="240" w:lineRule="auto"/>
+        <w:ind w:left="440" w:leftChars="0" w:hanging="360" w:firstLineChars="0"/>
+        <w:jc w:val="both"/>
+        <w:rPr>
+          <w:rFonts w:hint="default" w:ascii="Kalinga" w:hAnsi="Kalinga"/>
+          <w:b w:val="0"/>
+          <w:bCs w:val="0"/>
+          <w:sz w:val="20"/>
+          <w:szCs w:val="20"/>
+        </w:rPr>
+      </w:pPr>
+      <w:r>
+        <w:rPr>
+          <w:rFonts w:hint="default" w:ascii="Kalinga" w:hAnsi="Kalinga"/>
+          <w:b w:val="0"/>
+          <w:bCs w:val="0"/>
+          <w:sz w:val="20"/>
+          <w:szCs w:val="20"/>
+        </w:rPr>
+        <w:t>{{text}}</w:t>
+      </w:r>
+    </w:p>
+    <w:p>
+      <w:pPr>
+        <w:spacing w:after="0" w:line="240" w:lineRule="auto"/>
         <w:jc w:val="both"/>
         <w:rPr>
           <w:rFonts w:ascii="Kalinga" w:hAnsi="Kalinga" w:cs="Kalinga"/>
           <w:b w:val="0"/>
           <w:bCs w:val="0"/>
-          <w:color w:val="auto"/>
-          <w:sz w:val="20"/>
-          <w:szCs w:val="20"/>
-        </w:rPr>
-      </w:pPr>
-      <w:r>
-        <w:rPr>
-          <w:rFonts w:hint="default" w:ascii="Kalinga" w:hAnsi="Kalinga"/>
-          <w:b w:val="0"/>
-          <w:bCs w:val="0"/>
-          <w:sz w:val="20"/>
-          <w:szCs w:val="20"/>
-        </w:rPr>
-        <w:t xml:space="preserve">Gaji Bulan </w:t>
-      </w:r>
-      <w:r>
-        <w:rPr>
-          <w:rFonts w:hint="default" w:ascii="Kalinga" w:hAnsi="Kalinga"/>
-          <w:b w:val="0"/>
-          <w:bCs w:val="0"/>
-          <w:sz w:val="20"/>
-          <w:szCs w:val="20"/>
-          <w:lang w:val="en-US"/>
-        </w:rPr>
-        <w:t>{{</w:t>
-      </w:r>
-      <w:r>
-        <w:rPr>
-          <w:rFonts w:hint="default" w:ascii="Kalinga" w:hAnsi="Kalinga"/>
-          <w:b w:val="0"/>
-          <w:bCs w:val="0"/>
-          <w:sz w:val="20"/>
-          <w:szCs w:val="20"/>
-        </w:rPr>
-        <w:t>gaji_bulan_3_nama</w:t>
-      </w:r>
-      <w:r>
-        <w:rPr>
-          <w:rFonts w:hint="default" w:ascii="Kalinga" w:hAnsi="Kalinga"/>
-          <w:b w:val="0"/>
-          <w:bCs w:val="0"/>
+          <w:sz w:val="20"/>
+          <w:szCs w:val="20"/>
+        </w:rPr>
+      </w:pPr>
+      <w:r>
+        <w:rPr>
+          <w:rFonts w:hint="default" w:ascii="Kalinga" w:hAnsi="Kalinga"/>
+          <w:b w:val="0"/>
+          <w:bCs w:val="0"/>
+          <w:sz w:val="20"/>
+          <w:szCs w:val="20"/>
+        </w:rPr>
+        <w:t>{{/list_verifikasi_rekan_kerja}}</w:t>
+      </w:r>
+    </w:p>
+    <w:p>
+      <w:pPr>
+        <w:spacing w:after="0" w:line="240" w:lineRule="auto"/>
+        <w:jc w:val="both"/>
+        <w:rPr>
+          <w:rFonts w:ascii="Kalinga" w:hAnsi="Kalinga" w:cs="Kalinga"/>
+          <w:b/>
+          <w:bCs/>
+          <w:sz w:val="20"/>
+          <w:szCs w:val="20"/>
+        </w:rPr>
+      </w:pPr>
+    </w:p>
+    <w:p>
+      <w:pPr>
+        <w:spacing w:after="0" w:line="240" w:lineRule="auto"/>
+        <w:jc w:val="both"/>
+        <w:rPr>
+          <w:rFonts w:hint="default" w:ascii="Kalinga" w:hAnsi="Kalinga"/>
+          <w:b/>
+          <w:bCs/>
+          <w:sz w:val="20"/>
+          <w:szCs w:val="20"/>
+          <w:lang w:val="en-US"/>
+        </w:rPr>
+      </w:pPr>
+      <w:r>
+        <w:rPr>
+          <w:rFonts w:hint="default" w:ascii="Kalinga" w:hAnsi="Kalinga"/>
+          <w:b/>
+          <w:bCs/>
+          <w:sz w:val="20"/>
+          <w:szCs w:val="20"/>
+        </w:rPr>
+        <w:t xml:space="preserve">Tgl. Call Memo </w:t>
+      </w:r>
+      <w:r>
+        <w:rPr>
+          <w:rFonts w:hint="default" w:ascii="Kalinga" w:hAnsi="Kalinga"/>
+          <w:b/>
+          <w:bCs/>
+          <w:sz w:val="20"/>
+          <w:szCs w:val="20"/>
+        </w:rPr>
+        <w:tab/>
+      </w:r>
+      <w:r>
+        <w:rPr>
+          <w:rFonts w:hint="default" w:ascii="Kalinga" w:hAnsi="Kalinga"/>
+          <w:b/>
+          <w:bCs/>
+          <w:sz w:val="20"/>
+          <w:szCs w:val="20"/>
+        </w:rPr>
+        <w:tab/>
+      </w:r>
+      <w:r>
+        <w:rPr>
+          <w:rFonts w:hint="default" w:ascii="Kalinga" w:hAnsi="Kalinga"/>
+          <w:b/>
+          <w:bCs/>
+          <w:sz w:val="20"/>
+          <w:szCs w:val="20"/>
+        </w:rPr>
+        <w:t>:</w:t>
+      </w:r>
+      <w:r>
+        <w:rPr>
+          <w:rFonts w:hint="default" w:ascii="Kalinga" w:hAnsi="Kalinga"/>
+          <w:b/>
+          <w:bCs/>
+          <w:sz w:val="20"/>
+          <w:szCs w:val="20"/>
+          <w:lang w:val="en-US"/>
+        </w:rPr>
+        <w:t xml:space="preserve"> {{</w:t>
+      </w:r>
+      <w:r>
+        <w:rPr>
+          <w:rFonts w:hint="default" w:ascii="Kalinga" w:hAnsi="Kalinga"/>
+          <w:b/>
+          <w:bCs/>
+          <w:sz w:val="20"/>
+          <w:szCs w:val="20"/>
+        </w:rPr>
+        <w:t>tgl_call_memo</w:t>
+      </w:r>
+      <w:r>
+        <w:rPr>
+          <w:rFonts w:hint="default" w:ascii="Kalinga" w:hAnsi="Kalinga"/>
+          <w:b/>
+          <w:bCs/>
           <w:sz w:val="20"/>
           <w:szCs w:val="20"/>
           <w:lang w:val="en-US"/>
         </w:rPr>
         <w:t>}}</w:t>
       </w:r>
-      <w:r>
-        <w:rPr>
-          <w:rFonts w:hint="default" w:ascii="Kalinga" w:hAnsi="Kalinga"/>
-          <w:b w:val="0"/>
-          <w:bCs w:val="0"/>
-          <w:sz w:val="20"/>
-          <w:szCs w:val="20"/>
-        </w:rPr>
-        <w:tab/>
-      </w:r>
-      <w:r>
-        <w:rPr>
-          <w:rFonts w:hint="default" w:ascii="Kalinga" w:hAnsi="Kalinga"/>
-          <w:b w:val="0"/>
-          <w:bCs w:val="0"/>
-          <w:sz w:val="20"/>
-          <w:szCs w:val="20"/>
-        </w:rPr>
-        <w:tab/>
-      </w:r>
-      <w:r>
-        <w:rPr>
-          <w:rFonts w:hint="default" w:ascii="Kalinga" w:hAnsi="Kalinga"/>
-          <w:b w:val="0"/>
-          <w:bCs w:val="0"/>
-          <w:sz w:val="20"/>
-          <w:szCs w:val="20"/>
-          <w:lang w:val="en-US"/>
-        </w:rPr>
-        <w:tab/>
-      </w:r>
-      <w:r>
-        <w:rPr>
-          <w:rFonts w:hint="default" w:ascii="Kalinga" w:hAnsi="Kalinga"/>
-          <w:b w:val="0"/>
-          <w:bCs w:val="0"/>
-          <w:sz w:val="20"/>
-          <w:szCs w:val="20"/>
-        </w:rPr>
-        <w:t xml:space="preserve">Rp. </w:t>
-      </w:r>
-      <w:r>
-        <w:rPr>
-          <w:rFonts w:hint="default" w:ascii="Kalinga" w:hAnsi="Kalinga"/>
-          <w:b w:val="0"/>
-          <w:bCs w:val="0"/>
-          <w:sz w:val="20"/>
-          <w:szCs w:val="20"/>
-          <w:lang w:val="en-US"/>
-        </w:rPr>
-        <w:t>{{gaji_bulan_3}}</w:t>
-      </w:r>
-      <w:r>
-        <w:rPr>
-          <w:rFonts w:hint="default" w:ascii="Kalinga" w:hAnsi="Kalinga"/>
-          <w:b w:val="0"/>
-          <w:bCs w:val="0"/>
-          <w:sz w:val="20"/>
-          <w:szCs w:val="20"/>
-        </w:rPr>
-        <w:t>,-</w:t>
-      </w:r>
-      <w:r>
-        <w:rPr>
-          <w:rFonts w:hint="default" w:ascii="Kalinga" w:hAnsi="Kalinga"/>
-          <w:b w:val="0"/>
-          <w:bCs w:val="0"/>
+    </w:p>
+    <w:p>
+      <w:pPr>
+        <w:spacing w:after="0" w:line="240" w:lineRule="auto"/>
+        <w:jc w:val="both"/>
+        <w:rPr>
+          <w:rFonts w:hint="default" w:ascii="Kalinga" w:hAnsi="Kalinga"/>
+          <w:b/>
+          <w:bCs/>
+          <w:sz w:val="20"/>
+          <w:szCs w:val="20"/>
+          <w:lang w:val="en-US"/>
+        </w:rPr>
+      </w:pPr>
+      <w:r>
+        <w:rPr>
+          <w:rFonts w:hint="default" w:ascii="Kalinga" w:hAnsi="Kalinga"/>
+          <w:b/>
+          <w:bCs/>
+          <w:sz w:val="20"/>
+          <w:szCs w:val="20"/>
+        </w:rPr>
+        <w:t xml:space="preserve">Bentuk Call </w:t>
+      </w:r>
+      <w:r>
+        <w:rPr>
+          <w:rFonts w:hint="default" w:ascii="Kalinga" w:hAnsi="Kalinga"/>
+          <w:b/>
+          <w:bCs/>
+          <w:sz w:val="20"/>
+          <w:szCs w:val="20"/>
+        </w:rPr>
+        <w:tab/>
+      </w:r>
+      <w:r>
+        <w:rPr>
+          <w:rFonts w:hint="default" w:ascii="Kalinga" w:hAnsi="Kalinga"/>
+          <w:b/>
+          <w:bCs/>
+          <w:sz w:val="20"/>
+          <w:szCs w:val="20"/>
+        </w:rPr>
+        <w:tab/>
+      </w:r>
+      <w:r>
+        <w:rPr>
+          <w:rFonts w:hint="default" w:ascii="Kalinga" w:hAnsi="Kalinga"/>
+          <w:b/>
+          <w:bCs/>
+          <w:sz w:val="20"/>
+          <w:szCs w:val="20"/>
+        </w:rPr>
+        <w:t>:</w:t>
+      </w:r>
+      <w:r>
+        <w:rPr>
+          <w:rFonts w:hint="default" w:ascii="Kalinga" w:hAnsi="Kalinga"/>
+          <w:b/>
+          <w:bCs/>
+          <w:sz w:val="20"/>
+          <w:szCs w:val="20"/>
+          <w:lang w:val="en-US"/>
+        </w:rPr>
+        <w:t xml:space="preserve"> </w:t>
+      </w:r>
+      <w:r>
+        <w:rPr>
+          <w:rFonts w:hint="default" w:ascii="Kalinga" w:hAnsi="Kalinga"/>
+          <w:b/>
+          <w:bCs/>
+          <w:sz w:val="20"/>
+          <w:szCs w:val="20"/>
+        </w:rPr>
+        <w:t>Browsing Internet di alamat www.flagging.taspen.co.id</w:t>
+      </w:r>
+      <w:r>
+        <w:rPr>
+          <w:rFonts w:hint="default" w:ascii="Kalinga" w:hAnsi="Kalinga"/>
+          <w:b/>
+          <w:bCs/>
           <w:sz w:val="20"/>
           <w:szCs w:val="20"/>
           <w:lang w:val="en-US"/>
@@ -1517,391 +2824,20 @@
     <w:p>
       <w:pPr>
         <w:spacing w:after="0" w:line="240" w:lineRule="auto"/>
-        <w:ind w:left="440"/>
-        <w:jc w:val="both"/>
-        <w:rPr>
-          <w:rFonts w:ascii="Kalinga" w:hAnsi="Kalinga" w:cs="Kalinga"/>
-          <w:b w:val="0"/>
-          <w:bCs w:val="0"/>
-          <w:sz w:val="20"/>
-          <w:szCs w:val="20"/>
-        </w:rPr>
-      </w:pPr>
-    </w:p>
-    <w:p>
-      <w:pPr>
-        <w:spacing w:after="0" w:line="240" w:lineRule="auto"/>
-        <w:jc w:val="both"/>
-        <w:rPr>
-          <w:rFonts w:hint="default" w:ascii="Kalinga" w:hAnsi="Kalinga"/>
-          <w:b/>
-          <w:bCs/>
-          <w:sz w:val="20"/>
-          <w:szCs w:val="20"/>
-          <w:u w:val="single"/>
-          <w:lang w:val="en-US"/>
-        </w:rPr>
-      </w:pPr>
-      <w:r>
-        <w:rPr>
-          <w:rFonts w:hint="default" w:ascii="Kalinga" w:hAnsi="Kalinga"/>
-          <w:b/>
-          <w:bCs/>
-          <w:sz w:val="20"/>
-          <w:szCs w:val="20"/>
-          <w:u w:val="single"/>
-          <w:lang w:val="en-US"/>
-        </w:rPr>
-        <w:t>Verifikasi Pihak Ketiga</w:t>
-      </w:r>
-    </w:p>
-    <w:bookmarkEnd w:id="21"/>
-    <w:p>
-      <w:pPr>
-        <w:spacing w:after="0" w:line="240" w:lineRule="auto"/>
-        <w:jc w:val="both"/>
-        <w:rPr>
-          <w:rFonts w:hint="default" w:ascii="Kalinga" w:hAnsi="Kalinga" w:cs="Kalinga"/>
-          <w:b/>
-          <w:bCs/>
-          <w:color w:val="auto"/>
-          <w:sz w:val="20"/>
-          <w:szCs w:val="20"/>
-          <w:lang w:val="en-US"/>
-        </w:rPr>
-      </w:pPr>
-      <w:bookmarkStart w:id="35" w:name="OLE_LINK18"/>
-      <w:bookmarkStart w:id="36" w:name="OLE_LINK25"/>
-      <w:bookmarkStart w:id="37" w:name="OLE_LINK9"/>
-      <w:r>
-        <w:rPr>
-          <w:rFonts w:hint="default" w:ascii="Kalinga" w:hAnsi="Kalinga"/>
-          <w:b/>
-          <w:bCs/>
-          <w:sz w:val="20"/>
-          <w:szCs w:val="20"/>
-        </w:rPr>
-        <w:t>Tg</w:t>
-      </w:r>
-      <w:r>
-        <w:rPr>
-          <w:rFonts w:hint="default" w:ascii="Kalinga" w:hAnsi="Kalinga" w:cs="Kalinga"/>
-          <w:b/>
-          <w:bCs/>
-          <w:color w:val="auto"/>
-          <w:sz w:val="20"/>
-          <w:szCs w:val="20"/>
-        </w:rPr>
-        <w:t xml:space="preserve">l. Call Memo </w:t>
-      </w:r>
-      <w:r>
-        <w:rPr>
-          <w:rFonts w:hint="default" w:ascii="Kalinga" w:hAnsi="Kalinga" w:cs="Kalinga"/>
-          <w:b/>
-          <w:bCs/>
-          <w:color w:val="auto"/>
-          <w:sz w:val="20"/>
-          <w:szCs w:val="20"/>
-        </w:rPr>
-        <w:tab/>
-      </w:r>
-      <w:r>
-        <w:rPr>
-          <w:rFonts w:hint="default" w:ascii="Kalinga" w:hAnsi="Kalinga" w:cs="Kalinga"/>
-          <w:b/>
-          <w:bCs/>
-          <w:color w:val="auto"/>
-          <w:sz w:val="20"/>
-          <w:szCs w:val="20"/>
-        </w:rPr>
-        <w:tab/>
-      </w:r>
-      <w:r>
-        <w:rPr>
-          <w:rFonts w:hint="default" w:ascii="Kalinga" w:hAnsi="Kalinga" w:cs="Kalinga"/>
-          <w:b/>
-          <w:bCs/>
-          <w:color w:val="auto"/>
-          <w:sz w:val="20"/>
-          <w:szCs w:val="20"/>
-        </w:rPr>
-        <w:t xml:space="preserve">: </w:t>
-      </w:r>
-      <w:r>
-        <w:rPr>
-          <w:rFonts w:hint="default" w:ascii="Kalinga" w:hAnsi="Kalinga" w:cs="Kalinga"/>
-          <w:b/>
-          <w:bCs/>
-          <w:color w:val="auto"/>
-          <w:sz w:val="20"/>
-          <w:szCs w:val="20"/>
-          <w:lang w:val="en-US"/>
-        </w:rPr>
-        <w:t>{{</w:t>
-      </w:r>
-      <w:r>
-        <w:rPr>
-          <w:rFonts w:hint="default" w:ascii="Kalinga" w:hAnsi="Kalinga" w:cs="Kalinga"/>
-          <w:b/>
-          <w:bCs/>
-          <w:color w:val="auto"/>
-          <w:sz w:val="20"/>
-          <w:szCs w:val="20"/>
-        </w:rPr>
-        <w:t>tgl_call_memo</w:t>
-      </w:r>
-      <w:r>
-        <w:rPr>
-          <w:rFonts w:hint="default" w:ascii="Kalinga" w:hAnsi="Kalinga" w:cs="Kalinga"/>
-          <w:b/>
-          <w:bCs/>
-          <w:color w:val="auto"/>
-          <w:sz w:val="20"/>
-          <w:szCs w:val="20"/>
-          <w:lang w:val="en-US"/>
-        </w:rPr>
-        <w:t>}}</w:t>
-      </w:r>
-    </w:p>
-    <w:p>
-      <w:pPr>
-        <w:spacing w:after="0" w:line="240" w:lineRule="auto"/>
-        <w:jc w:val="both"/>
-        <w:rPr>
-          <w:rFonts w:hint="default" w:ascii="Kalinga" w:hAnsi="Kalinga" w:cs="Kalinga"/>
-          <w:b/>
-          <w:bCs/>
-          <w:color w:val="auto"/>
-          <w:sz w:val="20"/>
-          <w:szCs w:val="20"/>
-        </w:rPr>
-      </w:pPr>
-      <w:r>
-        <w:rPr>
-          <w:rFonts w:hint="default" w:ascii="Kalinga" w:hAnsi="Kalinga" w:cs="Kalinga"/>
-          <w:b/>
-          <w:bCs/>
-          <w:color w:val="auto"/>
-          <w:sz w:val="20"/>
-          <w:szCs w:val="20"/>
-        </w:rPr>
-        <w:t xml:space="preserve">Yang diverifikasi </w:t>
-      </w:r>
-      <w:r>
-        <w:rPr>
-          <w:rFonts w:hint="default" w:ascii="Kalinga" w:hAnsi="Kalinga" w:cs="Kalinga"/>
-          <w:b/>
-          <w:bCs/>
-          <w:color w:val="auto"/>
-          <w:sz w:val="20"/>
-          <w:szCs w:val="20"/>
-        </w:rPr>
-        <w:tab/>
-      </w:r>
-      <w:r>
-        <w:rPr>
-          <w:rFonts w:hint="default" w:ascii="Kalinga" w:hAnsi="Kalinga" w:cs="Kalinga"/>
-          <w:b/>
-          <w:bCs/>
-          <w:color w:val="auto"/>
-          <w:sz w:val="20"/>
-          <w:szCs w:val="20"/>
-        </w:rPr>
-        <w:t xml:space="preserve">: </w:t>
-      </w:r>
-      <w:r>
-        <w:rPr>
-          <w:rFonts w:hint="default" w:ascii="Kalinga" w:hAnsi="Kalinga" w:cs="Kalinga"/>
-          <w:b/>
-          <w:bCs/>
-          <w:color w:val="auto"/>
-          <w:sz w:val="20"/>
-          <w:szCs w:val="20"/>
-          <w:lang w:val="en-US"/>
-        </w:rPr>
-        <w:t>{{</w:t>
-      </w:r>
-      <w:r>
-        <w:rPr>
-          <w:rFonts w:hint="default" w:ascii="Kalinga" w:hAnsi="Kalinga" w:cs="Kalinga"/>
-          <w:b/>
-          <w:bCs/>
-          <w:color w:val="auto"/>
-          <w:sz w:val="20"/>
-          <w:szCs w:val="20"/>
-        </w:rPr>
-        <w:t>nama_bendahara</w:t>
-      </w:r>
-      <w:r>
-        <w:rPr>
-          <w:rFonts w:hint="default" w:ascii="Kalinga" w:hAnsi="Kalinga" w:cs="Kalinga"/>
-          <w:b/>
-          <w:bCs/>
-          <w:color w:val="auto"/>
-          <w:sz w:val="20"/>
-          <w:szCs w:val="20"/>
-          <w:lang w:val="en-US"/>
-        </w:rPr>
-        <w:t>}}</w:t>
-      </w:r>
-      <w:r>
-        <w:rPr>
-          <w:rFonts w:hint="default" w:ascii="Kalinga" w:hAnsi="Kalinga" w:cs="Kalinga"/>
-          <w:b/>
-          <w:bCs/>
-          <w:color w:val="auto"/>
-          <w:sz w:val="20"/>
-          <w:szCs w:val="20"/>
-        </w:rPr>
-        <w:t xml:space="preserve"> (Bendahara)</w:t>
-      </w:r>
-    </w:p>
-    <w:p>
-      <w:pPr>
-        <w:spacing w:after="0" w:line="240" w:lineRule="auto"/>
-        <w:jc w:val="both"/>
-        <w:rPr>
-          <w:rFonts w:hint="default" w:ascii="Kalinga" w:hAnsi="Kalinga" w:cs="Kalinga"/>
-          <w:b/>
-          <w:bCs/>
-          <w:color w:val="auto"/>
-          <w:sz w:val="20"/>
-          <w:szCs w:val="20"/>
-        </w:rPr>
-      </w:pPr>
-      <w:r>
-        <w:rPr>
-          <w:rFonts w:hint="default" w:ascii="Kalinga" w:hAnsi="Kalinga" w:cs="Kalinga"/>
-          <w:b/>
-          <w:bCs/>
-          <w:color w:val="auto"/>
-          <w:sz w:val="20"/>
-          <w:szCs w:val="20"/>
-        </w:rPr>
-        <w:t xml:space="preserve">Bentuk Call </w:t>
-      </w:r>
-      <w:r>
-        <w:rPr>
-          <w:rFonts w:hint="default" w:ascii="Kalinga" w:hAnsi="Kalinga" w:cs="Kalinga"/>
-          <w:b/>
-          <w:bCs/>
-          <w:color w:val="auto"/>
-          <w:sz w:val="20"/>
-          <w:szCs w:val="20"/>
-        </w:rPr>
-        <w:tab/>
-      </w:r>
-      <w:r>
-        <w:rPr>
-          <w:rFonts w:hint="default" w:ascii="Kalinga" w:hAnsi="Kalinga" w:cs="Kalinga"/>
-          <w:b/>
-          <w:bCs/>
-          <w:color w:val="auto"/>
-          <w:sz w:val="20"/>
-          <w:szCs w:val="20"/>
-        </w:rPr>
-        <w:tab/>
-      </w:r>
-      <w:r>
-        <w:rPr>
-          <w:rFonts w:hint="default" w:ascii="Kalinga" w:hAnsi="Kalinga" w:cs="Kalinga"/>
-          <w:b/>
-          <w:bCs/>
-          <w:color w:val="auto"/>
-          <w:sz w:val="20"/>
-          <w:szCs w:val="20"/>
-        </w:rPr>
-        <w:t>: Wawancara via Telepon (</w:t>
-      </w:r>
-      <w:r>
-        <w:rPr>
-          <w:rFonts w:hint="default" w:ascii="Kalinga" w:hAnsi="Kalinga" w:cs="Kalinga"/>
-          <w:b/>
-          <w:bCs/>
-          <w:color w:val="auto"/>
-          <w:sz w:val="20"/>
-          <w:szCs w:val="20"/>
-          <w:lang w:val="en-US"/>
-        </w:rPr>
-        <w:t>{{</w:t>
-      </w:r>
-      <w:r>
-        <w:rPr>
-          <w:rFonts w:hint="default" w:ascii="Kalinga" w:hAnsi="Kalinga" w:cs="Kalinga"/>
-          <w:b/>
-          <w:bCs/>
-          <w:color w:val="auto"/>
-          <w:sz w:val="20"/>
-          <w:szCs w:val="20"/>
-        </w:rPr>
-        <w:t>no_</w:t>
-      </w:r>
-      <w:r>
-        <w:rPr>
-          <w:rFonts w:hint="default" w:ascii="Kalinga" w:hAnsi="Kalinga" w:cs="Kalinga"/>
-          <w:b/>
-          <w:bCs/>
-          <w:color w:val="auto"/>
-          <w:sz w:val="20"/>
-          <w:szCs w:val="20"/>
-          <w:lang w:val="en-US"/>
-        </w:rPr>
-        <w:t>hp</w:t>
-      </w:r>
-      <w:r>
-        <w:rPr>
-          <w:rFonts w:hint="default" w:ascii="Kalinga" w:hAnsi="Kalinga" w:cs="Kalinga"/>
-          <w:b/>
-          <w:bCs/>
-          <w:color w:val="auto"/>
-          <w:sz w:val="20"/>
-          <w:szCs w:val="20"/>
-        </w:rPr>
-        <w:t>_bendahara</w:t>
-      </w:r>
-      <w:r>
-        <w:rPr>
-          <w:rFonts w:hint="default" w:ascii="Kalinga" w:hAnsi="Kalinga" w:cs="Kalinga"/>
-          <w:b/>
-          <w:bCs/>
-          <w:color w:val="auto"/>
-          <w:sz w:val="20"/>
-          <w:szCs w:val="20"/>
-          <w:lang w:val="en-US"/>
-        </w:rPr>
-        <w:t>}}</w:t>
-      </w:r>
-      <w:r>
-        <w:rPr>
-          <w:rFonts w:hint="default" w:ascii="Kalinga" w:hAnsi="Kalinga" w:cs="Kalinga"/>
-          <w:b/>
-          <w:bCs/>
-          <w:color w:val="auto"/>
-          <w:sz w:val="20"/>
-          <w:szCs w:val="20"/>
-        </w:rPr>
-        <w:t>)</w:t>
-      </w:r>
-    </w:p>
-    <w:p>
-      <w:pPr>
-        <w:spacing w:after="0" w:line="240" w:lineRule="auto"/>
-        <w:jc w:val="both"/>
-        <w:rPr>
-          <w:rFonts w:hint="default" w:ascii="Kalinga" w:hAnsi="Kalinga" w:cs="Kalinga"/>
-          <w:b/>
-          <w:bCs/>
-          <w:color w:val="auto"/>
-          <w:sz w:val="20"/>
-          <w:szCs w:val="20"/>
-        </w:rPr>
-      </w:pPr>
-      <w:r>
-        <w:rPr>
-          <w:rFonts w:hint="default" w:ascii="Kalinga" w:hAnsi="Kalinga" w:cs="Kalinga"/>
-          <w:b/>
-          <w:bCs/>
-          <w:color w:val="auto"/>
+        <w:jc w:val="both"/>
+        <w:rPr>
+          <w:rFonts w:hint="default" w:ascii="Kalinga" w:hAnsi="Kalinga"/>
+          <w:b/>
+          <w:bCs/>
+          <w:sz w:val="20"/>
+          <w:szCs w:val="20"/>
+        </w:rPr>
+      </w:pPr>
+      <w:r>
+        <w:rPr>
+          <w:rFonts w:hint="default" w:ascii="Kalinga" w:hAnsi="Kalinga"/>
+          <w:b/>
+          <w:bCs/>
           <w:sz w:val="20"/>
           <w:szCs w:val="20"/>
         </w:rPr>
@@ -1909,914 +2845,35 @@
       </w:r>
       <w:r>
         <w:rPr>
-          <w:rFonts w:hint="default" w:ascii="Kalinga" w:hAnsi="Kalinga" w:cs="Kalinga"/>
-          <w:b/>
-          <w:bCs/>
-          <w:color w:val="auto"/>
-          <w:sz w:val="20"/>
-          <w:szCs w:val="20"/>
-        </w:rPr>
-        <w:tab/>
-      </w:r>
-      <w:r>
-        <w:rPr>
-          <w:rFonts w:hint="default" w:ascii="Kalinga" w:hAnsi="Kalinga" w:cs="Kalinga"/>
-          <w:b/>
-          <w:bCs/>
-          <w:color w:val="auto"/>
-          <w:sz w:val="20"/>
-          <w:szCs w:val="20"/>
-        </w:rPr>
-        <w:tab/>
-      </w:r>
-      <w:r>
-        <w:rPr>
-          <w:rFonts w:hint="default" w:ascii="Kalinga" w:hAnsi="Kalinga" w:cs="Kalinga"/>
-          <w:b/>
-          <w:bCs/>
-          <w:color w:val="auto"/>
+          <w:rFonts w:hint="default" w:ascii="Kalinga" w:hAnsi="Kalinga"/>
+          <w:b/>
+          <w:bCs/>
+          <w:sz w:val="20"/>
+          <w:szCs w:val="20"/>
+        </w:rPr>
+        <w:tab/>
+      </w:r>
+      <w:r>
+        <w:rPr>
+          <w:rFonts w:hint="default" w:ascii="Kalinga" w:hAnsi="Kalinga"/>
+          <w:b/>
+          <w:bCs/>
+          <w:sz w:val="20"/>
+          <w:szCs w:val="20"/>
+        </w:rPr>
+        <w:tab/>
+      </w:r>
+      <w:r>
+        <w:rPr>
+          <w:rFonts w:hint="default" w:ascii="Kalinga" w:hAnsi="Kalinga"/>
+          <w:b/>
+          <w:bCs/>
           <w:sz w:val="20"/>
           <w:szCs w:val="20"/>
         </w:rPr>
         <w:t>: Konfirmasi Gaji Pemohon</w:t>
       </w:r>
     </w:p>
-    <w:p>
-      <w:pPr>
-        <w:spacing w:after="0" w:line="240" w:lineRule="auto"/>
-        <w:jc w:val="both"/>
-        <w:rPr>
-          <w:rFonts w:hint="default" w:ascii="Kalinga" w:hAnsi="Kalinga"/>
-          <w:b/>
-          <w:bCs/>
-          <w:sz w:val="20"/>
-          <w:szCs w:val="20"/>
-        </w:rPr>
-      </w:pPr>
-      <w:r>
-        <w:rPr>
-          <w:rFonts w:hint="default" w:ascii="Kalinga" w:hAnsi="Kalinga" w:cs="Kalinga"/>
-          <w:b/>
-          <w:bCs/>
-          <w:color w:val="auto"/>
-          <w:sz w:val="20"/>
-          <w:szCs w:val="20"/>
-        </w:rPr>
-        <w:t>Inform</w:t>
-      </w:r>
-      <w:r>
-        <w:rPr>
-          <w:rFonts w:hint="default" w:ascii="Kalinga" w:hAnsi="Kalinga"/>
-          <w:b/>
-          <w:bCs/>
-          <w:sz w:val="20"/>
-          <w:szCs w:val="20"/>
-        </w:rPr>
-        <w:t>asi yang diberikan:</w:t>
-      </w:r>
-    </w:p>
-    <w:bookmarkEnd w:id="35"/>
-    <w:bookmarkEnd w:id="36"/>
-    <w:bookmarkEnd w:id="37"/>
-    <w:p>
-      <w:pPr>
-        <w:spacing w:after="0" w:line="240" w:lineRule="auto"/>
-        <w:jc w:val="both"/>
-        <w:rPr>
-          <w:rFonts w:hint="default" w:ascii="Kalinga" w:hAnsi="Kalinga"/>
-          <w:b w:val="0"/>
-          <w:bCs w:val="0"/>
-          <w:color w:val="auto"/>
-          <w:sz w:val="20"/>
-          <w:szCs w:val="20"/>
-        </w:rPr>
-      </w:pPr>
-      <w:r>
-        <w:rPr>
-          <w:rFonts w:hint="default" w:ascii="Kalinga" w:hAnsi="Kalinga"/>
-          <w:b w:val="0"/>
-          <w:bCs w:val="0"/>
-          <w:color w:val="auto"/>
-          <w:sz w:val="20"/>
-          <w:szCs w:val="20"/>
-        </w:rPr>
-        <w:t>{{#list_verifikasi_bendahara}}</w:t>
-      </w:r>
-    </w:p>
-    <w:p>
-      <w:pPr>
-        <w:spacing w:after="0" w:line="240" w:lineRule="auto"/>
-        <w:jc w:val="both"/>
-        <w:rPr>
-          <w:rFonts w:hint="default" w:ascii="Kalinga" w:hAnsi="Kalinga"/>
-          <w:b w:val="0"/>
-          <w:bCs w:val="0"/>
-          <w:color w:val="auto"/>
-          <w:sz w:val="20"/>
-          <w:szCs w:val="20"/>
-        </w:rPr>
-      </w:pPr>
-      <w:r>
-        <w:rPr>
-          <w:rFonts w:hint="default" w:ascii="Kalinga" w:hAnsi="Kalinga"/>
-          <w:b w:val="0"/>
-          <w:bCs w:val="0"/>
-          <w:color w:val="auto"/>
-          <w:sz w:val="20"/>
-          <w:szCs w:val="20"/>
-        </w:rPr>
-        <w:t>-{{text}}</w:t>
-      </w:r>
-    </w:p>
-    <w:p>
-      <w:pPr>
-        <w:spacing w:after="0" w:line="240" w:lineRule="auto"/>
-        <w:jc w:val="both"/>
-        <w:rPr>
-          <w:rFonts w:ascii="Kalinga" w:hAnsi="Kalinga" w:cs="Kalinga"/>
-          <w:b w:val="0"/>
-          <w:bCs w:val="0"/>
-          <w:color w:val="auto"/>
-          <w:sz w:val="20"/>
-          <w:szCs w:val="20"/>
-        </w:rPr>
-      </w:pPr>
-      <w:r>
-        <w:rPr>
-          <w:rFonts w:hint="default" w:ascii="Kalinga" w:hAnsi="Kalinga"/>
-          <w:b w:val="0"/>
-          <w:bCs w:val="0"/>
-          <w:color w:val="auto"/>
-          <w:sz w:val="20"/>
-          <w:szCs w:val="20"/>
-        </w:rPr>
-        <w:t>{{/list_verifikasi_bendahara}}</w:t>
-      </w:r>
-    </w:p>
-    <w:p>
-      <w:pPr>
-        <w:spacing w:after="0" w:line="240" w:lineRule="auto"/>
-        <w:jc w:val="both"/>
-        <w:rPr>
-          <w:rFonts w:ascii="Kalinga" w:hAnsi="Kalinga" w:cs="Kalinga"/>
-          <w:b/>
-          <w:bCs/>
-          <w:color w:val="auto"/>
-          <w:sz w:val="20"/>
-          <w:szCs w:val="20"/>
-        </w:rPr>
-      </w:pPr>
-    </w:p>
-    <w:p>
-      <w:pPr>
-        <w:spacing w:after="0" w:line="240" w:lineRule="auto"/>
-        <w:jc w:val="both"/>
-        <w:rPr>
-          <w:rFonts w:hint="default" w:ascii="Kalinga" w:hAnsi="Kalinga" w:cs="Kalinga"/>
-          <w:b/>
-          <w:bCs/>
-          <w:color w:val="auto"/>
-          <w:sz w:val="20"/>
-          <w:szCs w:val="20"/>
-          <w:lang w:val="en-US"/>
-        </w:rPr>
-      </w:pPr>
-      <w:bookmarkStart w:id="38" w:name="OLE_LINK59"/>
-      <w:r>
-        <w:rPr>
-          <w:rFonts w:hint="default" w:ascii="Kalinga" w:hAnsi="Kalinga"/>
-          <w:b/>
-          <w:bCs/>
-          <w:color w:val="auto"/>
-          <w:sz w:val="20"/>
-          <w:szCs w:val="20"/>
-        </w:rPr>
-        <w:t>T</w:t>
-      </w:r>
-      <w:r>
-        <w:rPr>
-          <w:rFonts w:hint="default" w:ascii="Kalinga" w:hAnsi="Kalinga" w:cs="Kalinga"/>
-          <w:b/>
-          <w:bCs/>
-          <w:color w:val="auto"/>
-          <w:sz w:val="20"/>
-          <w:szCs w:val="20"/>
-        </w:rPr>
-        <w:t xml:space="preserve">gl. Call Memo </w:t>
-      </w:r>
-      <w:r>
-        <w:rPr>
-          <w:rFonts w:hint="default" w:ascii="Kalinga" w:hAnsi="Kalinga" w:cs="Kalinga"/>
-          <w:b/>
-          <w:bCs/>
-          <w:color w:val="auto"/>
-          <w:sz w:val="20"/>
-          <w:szCs w:val="20"/>
-        </w:rPr>
-        <w:tab/>
-      </w:r>
-      <w:r>
-        <w:rPr>
-          <w:rFonts w:hint="default" w:ascii="Kalinga" w:hAnsi="Kalinga" w:cs="Kalinga"/>
-          <w:b/>
-          <w:bCs/>
-          <w:color w:val="auto"/>
-          <w:sz w:val="20"/>
-          <w:szCs w:val="20"/>
-        </w:rPr>
-        <w:tab/>
-      </w:r>
-      <w:r>
-        <w:rPr>
-          <w:rFonts w:hint="default" w:ascii="Kalinga" w:hAnsi="Kalinga" w:cs="Kalinga"/>
-          <w:b/>
-          <w:bCs/>
-          <w:color w:val="auto"/>
-          <w:sz w:val="20"/>
-          <w:szCs w:val="20"/>
-        </w:rPr>
-        <w:t xml:space="preserve">: </w:t>
-      </w:r>
-      <w:r>
-        <w:rPr>
-          <w:rFonts w:hint="default" w:ascii="Kalinga" w:hAnsi="Kalinga" w:cs="Kalinga"/>
-          <w:b/>
-          <w:bCs/>
-          <w:color w:val="auto"/>
-          <w:sz w:val="20"/>
-          <w:szCs w:val="20"/>
-          <w:lang w:val="en-US"/>
-        </w:rPr>
-        <w:t>{{</w:t>
-      </w:r>
-      <w:r>
-        <w:rPr>
-          <w:rFonts w:hint="default" w:ascii="Kalinga" w:hAnsi="Kalinga" w:cs="Kalinga"/>
-          <w:b/>
-          <w:bCs/>
-          <w:color w:val="auto"/>
-          <w:sz w:val="20"/>
-          <w:szCs w:val="20"/>
-        </w:rPr>
-        <w:t>tgl_call_memo</w:t>
-      </w:r>
-      <w:r>
-        <w:rPr>
-          <w:rFonts w:hint="default" w:ascii="Kalinga" w:hAnsi="Kalinga" w:cs="Kalinga"/>
-          <w:b/>
-          <w:bCs/>
-          <w:color w:val="auto"/>
-          <w:sz w:val="20"/>
-          <w:szCs w:val="20"/>
-          <w:lang w:val="en-US"/>
-        </w:rPr>
-        <w:t>}}</w:t>
-      </w:r>
-    </w:p>
-    <w:p>
-      <w:pPr>
-        <w:spacing w:after="0" w:line="240" w:lineRule="auto"/>
-        <w:jc w:val="both"/>
-        <w:rPr>
-          <w:rFonts w:hint="default" w:ascii="Kalinga" w:hAnsi="Kalinga" w:cs="Kalinga"/>
-          <w:b/>
-          <w:bCs/>
-          <w:color w:val="auto"/>
-          <w:sz w:val="20"/>
-          <w:szCs w:val="20"/>
-        </w:rPr>
-      </w:pPr>
-      <w:r>
-        <w:rPr>
-          <w:rFonts w:hint="default" w:ascii="Kalinga" w:hAnsi="Kalinga" w:cs="Kalinga"/>
-          <w:b/>
-          <w:bCs/>
-          <w:color w:val="auto"/>
-          <w:sz w:val="20"/>
-          <w:szCs w:val="20"/>
-        </w:rPr>
-        <w:t xml:space="preserve">Yang diverifikasi </w:t>
-      </w:r>
-      <w:r>
-        <w:rPr>
-          <w:rFonts w:hint="default" w:ascii="Kalinga" w:hAnsi="Kalinga" w:cs="Kalinga"/>
-          <w:b/>
-          <w:bCs/>
-          <w:color w:val="auto"/>
-          <w:sz w:val="20"/>
-          <w:szCs w:val="20"/>
-        </w:rPr>
-        <w:tab/>
-      </w:r>
-      <w:r>
-        <w:rPr>
-          <w:rFonts w:hint="default" w:ascii="Kalinga" w:hAnsi="Kalinga" w:cs="Kalinga"/>
-          <w:b/>
-          <w:bCs/>
-          <w:color w:val="auto"/>
-          <w:sz w:val="20"/>
-          <w:szCs w:val="20"/>
-        </w:rPr>
-        <w:t xml:space="preserve">: </w:t>
-      </w:r>
-      <w:r>
-        <w:rPr>
-          <w:rFonts w:hint="default" w:ascii="Kalinga" w:hAnsi="Kalinga" w:cs="Kalinga"/>
-          <w:b/>
-          <w:bCs/>
-          <w:color w:val="auto"/>
-          <w:sz w:val="20"/>
-          <w:szCs w:val="20"/>
-          <w:lang w:val="en-US"/>
-        </w:rPr>
-        <w:t>{{</w:t>
-      </w:r>
-      <w:r>
-        <w:rPr>
-          <w:rFonts w:hint="default" w:ascii="Kalinga" w:hAnsi="Kalinga" w:cs="Kalinga"/>
-          <w:b/>
-          <w:bCs/>
-          <w:color w:val="auto"/>
-          <w:sz w:val="20"/>
-          <w:szCs w:val="20"/>
-        </w:rPr>
-        <w:t>nama_rekan_kerja</w:t>
-      </w:r>
-      <w:r>
-        <w:rPr>
-          <w:rFonts w:hint="default" w:ascii="Kalinga" w:hAnsi="Kalinga" w:cs="Kalinga"/>
-          <w:b/>
-          <w:bCs/>
-          <w:color w:val="auto"/>
-          <w:sz w:val="20"/>
-          <w:szCs w:val="20"/>
-          <w:lang w:val="en-US"/>
-        </w:rPr>
-        <w:t>}}</w:t>
-      </w:r>
-      <w:r>
-        <w:rPr>
-          <w:rFonts w:hint="default" w:ascii="Kalinga" w:hAnsi="Kalinga" w:cs="Kalinga"/>
-          <w:b/>
-          <w:bCs/>
-          <w:color w:val="auto"/>
-          <w:sz w:val="20"/>
-          <w:szCs w:val="20"/>
-        </w:rPr>
-        <w:t xml:space="preserve"> (Rekan Kerja)</w:t>
-      </w:r>
-    </w:p>
-    <w:p>
-      <w:pPr>
-        <w:spacing w:after="0" w:line="240" w:lineRule="auto"/>
-        <w:jc w:val="both"/>
-        <w:rPr>
-          <w:rFonts w:hint="default" w:ascii="Kalinga" w:hAnsi="Kalinga" w:cs="Kalinga"/>
-          <w:b/>
-          <w:bCs/>
-          <w:color w:val="auto"/>
-          <w:sz w:val="20"/>
-          <w:szCs w:val="20"/>
-        </w:rPr>
-      </w:pPr>
-      <w:r>
-        <w:rPr>
-          <w:rFonts w:hint="default" w:ascii="Kalinga" w:hAnsi="Kalinga" w:cs="Kalinga"/>
-          <w:b/>
-          <w:bCs/>
-          <w:color w:val="auto"/>
-          <w:sz w:val="20"/>
-          <w:szCs w:val="20"/>
-        </w:rPr>
-        <w:t xml:space="preserve">Bentuk Call </w:t>
-      </w:r>
-      <w:r>
-        <w:rPr>
-          <w:rFonts w:hint="default" w:ascii="Kalinga" w:hAnsi="Kalinga" w:cs="Kalinga"/>
-          <w:b/>
-          <w:bCs/>
-          <w:color w:val="auto"/>
-          <w:sz w:val="20"/>
-          <w:szCs w:val="20"/>
-        </w:rPr>
-        <w:tab/>
-      </w:r>
-      <w:r>
-        <w:rPr>
-          <w:rFonts w:hint="default" w:ascii="Kalinga" w:hAnsi="Kalinga" w:cs="Kalinga"/>
-          <w:b/>
-          <w:bCs/>
-          <w:color w:val="auto"/>
-          <w:sz w:val="20"/>
-          <w:szCs w:val="20"/>
-        </w:rPr>
-        <w:tab/>
-      </w:r>
-      <w:r>
-        <w:rPr>
-          <w:rFonts w:hint="default" w:ascii="Kalinga" w:hAnsi="Kalinga" w:cs="Kalinga"/>
-          <w:b/>
-          <w:bCs/>
-          <w:color w:val="auto"/>
-          <w:sz w:val="20"/>
-          <w:szCs w:val="20"/>
-        </w:rPr>
-        <w:t>: Wawancara via Telepon (</w:t>
-      </w:r>
-      <w:r>
-        <w:rPr>
-          <w:rFonts w:hint="default" w:ascii="Kalinga" w:hAnsi="Kalinga" w:cs="Kalinga"/>
-          <w:b/>
-          <w:bCs/>
-          <w:color w:val="auto"/>
-          <w:sz w:val="20"/>
-          <w:szCs w:val="20"/>
-          <w:lang w:val="en-US"/>
-        </w:rPr>
-        <w:t>{{</w:t>
-      </w:r>
-      <w:r>
-        <w:rPr>
-          <w:rFonts w:hint="default" w:ascii="Kalinga" w:hAnsi="Kalinga" w:cs="Kalinga"/>
-          <w:b/>
-          <w:bCs/>
-          <w:color w:val="auto"/>
-          <w:sz w:val="20"/>
-          <w:szCs w:val="20"/>
-        </w:rPr>
-        <w:t>no_</w:t>
-      </w:r>
-      <w:r>
-        <w:rPr>
-          <w:rFonts w:hint="default" w:ascii="Kalinga" w:hAnsi="Kalinga" w:cs="Kalinga"/>
-          <w:b/>
-          <w:bCs/>
-          <w:color w:val="auto"/>
-          <w:sz w:val="20"/>
-          <w:szCs w:val="20"/>
-          <w:lang w:val="en-US"/>
-        </w:rPr>
-        <w:t>hp</w:t>
-      </w:r>
-      <w:r>
-        <w:rPr>
-          <w:rFonts w:hint="default" w:ascii="Kalinga" w:hAnsi="Kalinga" w:cs="Kalinga"/>
-          <w:b/>
-          <w:bCs/>
-          <w:color w:val="auto"/>
-          <w:sz w:val="20"/>
-          <w:szCs w:val="20"/>
-        </w:rPr>
-        <w:t>_rekan_kerja</w:t>
-      </w:r>
-      <w:r>
-        <w:rPr>
-          <w:rFonts w:hint="default" w:ascii="Kalinga" w:hAnsi="Kalinga" w:cs="Kalinga"/>
-          <w:b/>
-          <w:bCs/>
-          <w:color w:val="auto"/>
-          <w:sz w:val="20"/>
-          <w:szCs w:val="20"/>
-          <w:lang w:val="en-US"/>
-        </w:rPr>
-        <w:t>}}</w:t>
-      </w:r>
-      <w:r>
-        <w:rPr>
-          <w:rFonts w:hint="default" w:ascii="Kalinga" w:hAnsi="Kalinga" w:cs="Kalinga"/>
-          <w:b/>
-          <w:bCs/>
-          <w:color w:val="auto"/>
-          <w:sz w:val="20"/>
-          <w:szCs w:val="20"/>
-        </w:rPr>
-        <w:t>)</w:t>
-      </w:r>
-    </w:p>
-    <w:p>
-      <w:pPr>
-        <w:spacing w:after="0" w:line="240" w:lineRule="auto"/>
-        <w:jc w:val="both"/>
-        <w:rPr>
-          <w:rFonts w:hint="default" w:ascii="Kalinga" w:hAnsi="Kalinga" w:cs="Kalinga"/>
-          <w:b/>
-          <w:bCs/>
-          <w:color w:val="auto"/>
-          <w:sz w:val="20"/>
-          <w:szCs w:val="20"/>
-        </w:rPr>
-      </w:pPr>
-      <w:r>
-        <w:rPr>
-          <w:rFonts w:hint="default" w:ascii="Kalinga" w:hAnsi="Kalinga" w:cs="Kalinga"/>
-          <w:b/>
-          <w:bCs/>
-          <w:color w:val="auto"/>
-          <w:sz w:val="20"/>
-          <w:szCs w:val="20"/>
-        </w:rPr>
-        <w:t xml:space="preserve">Tujuan Call </w:t>
-      </w:r>
-      <w:r>
-        <w:rPr>
-          <w:rFonts w:hint="default" w:ascii="Kalinga" w:hAnsi="Kalinga" w:cs="Kalinga"/>
-          <w:b/>
-          <w:bCs/>
-          <w:color w:val="auto"/>
-          <w:sz w:val="20"/>
-          <w:szCs w:val="20"/>
-        </w:rPr>
-        <w:tab/>
-      </w:r>
-      <w:r>
-        <w:rPr>
-          <w:rFonts w:hint="default" w:ascii="Kalinga" w:hAnsi="Kalinga" w:cs="Kalinga"/>
-          <w:b/>
-          <w:bCs/>
-          <w:color w:val="auto"/>
-          <w:sz w:val="20"/>
-          <w:szCs w:val="20"/>
-        </w:rPr>
-        <w:tab/>
-      </w:r>
-      <w:r>
-        <w:rPr>
-          <w:rFonts w:hint="default" w:ascii="Kalinga" w:hAnsi="Kalinga" w:cs="Kalinga"/>
-          <w:b/>
-          <w:bCs/>
-          <w:color w:val="auto"/>
-          <w:sz w:val="20"/>
-          <w:szCs w:val="20"/>
-        </w:rPr>
-        <w:t>: Konfirmasi Gaji Pemohon</w:t>
-      </w:r>
-    </w:p>
-    <w:p>
-      <w:pPr>
-        <w:spacing w:after="0" w:line="240" w:lineRule="auto"/>
-        <w:jc w:val="both"/>
-        <w:rPr>
-          <w:rFonts w:hint="default" w:ascii="Kalinga" w:hAnsi="Kalinga" w:cs="Kalinga"/>
-          <w:color w:val="auto"/>
-          <w:sz w:val="20"/>
-          <w:szCs w:val="20"/>
-          <w:lang w:val="en-US"/>
-        </w:rPr>
-      </w:pPr>
-      <w:r>
-        <w:rPr>
-          <w:rFonts w:hint="default" w:ascii="Kalinga" w:hAnsi="Kalinga" w:cs="Kalinga"/>
-          <w:b/>
-          <w:bCs/>
-          <w:color w:val="auto"/>
-          <w:sz w:val="20"/>
-          <w:szCs w:val="20"/>
-        </w:rPr>
-        <w:t>Informa</w:t>
-      </w:r>
-      <w:r>
-        <w:rPr>
-          <w:rFonts w:hint="default" w:ascii="Kalinga" w:hAnsi="Kalinga"/>
-          <w:b/>
-          <w:bCs/>
-          <w:color w:val="auto"/>
-          <w:sz w:val="20"/>
-          <w:szCs w:val="20"/>
-        </w:rPr>
-        <w:t>si yang diberikan</w:t>
-      </w:r>
-      <w:r>
-        <w:rPr>
-          <w:rFonts w:hint="default" w:ascii="Kalinga" w:hAnsi="Kalinga"/>
-          <w:b/>
-          <w:bCs/>
-          <w:color w:val="auto"/>
-          <w:sz w:val="20"/>
-          <w:szCs w:val="20"/>
-        </w:rPr>
-        <w:tab/>
-      </w:r>
-      <w:r>
-        <w:rPr>
-          <w:rFonts w:hint="default" w:ascii="Kalinga" w:hAnsi="Kalinga"/>
-          <w:b/>
-          <w:bCs/>
-          <w:color w:val="auto"/>
-          <w:sz w:val="20"/>
-          <w:szCs w:val="20"/>
-        </w:rPr>
-        <w:t>:</w:t>
-      </w:r>
-    </w:p>
-    <w:bookmarkEnd w:id="38"/>
-    <w:p>
-      <w:pPr>
-        <w:spacing w:after="0" w:line="240" w:lineRule="auto"/>
-        <w:jc w:val="both"/>
-        <w:rPr>
-          <w:rFonts w:hint="default" w:ascii="Kalinga" w:hAnsi="Kalinga"/>
-          <w:b w:val="0"/>
-          <w:bCs w:val="0"/>
-          <w:sz w:val="20"/>
-          <w:szCs w:val="20"/>
-        </w:rPr>
-      </w:pPr>
-      <w:bookmarkStart w:id="39" w:name="OLE_LINK33"/>
-      <w:r>
-        <w:rPr>
-          <w:rFonts w:hint="default" w:ascii="Kalinga" w:hAnsi="Kalinga"/>
-          <w:b w:val="0"/>
-          <w:bCs w:val="0"/>
-          <w:sz w:val="20"/>
-          <w:szCs w:val="20"/>
-        </w:rPr>
-        <w:t>{{#list_verifikasi_rekan_kerja}}</w:t>
-      </w:r>
-    </w:p>
-    <w:p>
-      <w:pPr>
-        <w:spacing w:after="0" w:line="240" w:lineRule="auto"/>
-        <w:jc w:val="both"/>
-        <w:rPr>
-          <w:rFonts w:hint="default" w:ascii="Kalinga" w:hAnsi="Kalinga"/>
-          <w:b w:val="0"/>
-          <w:bCs w:val="0"/>
-          <w:sz w:val="20"/>
-          <w:szCs w:val="20"/>
-        </w:rPr>
-      </w:pPr>
-      <w:r>
-        <w:rPr>
-          <w:rFonts w:hint="default" w:ascii="Kalinga" w:hAnsi="Kalinga"/>
-          <w:b w:val="0"/>
-          <w:bCs w:val="0"/>
-          <w:sz w:val="20"/>
-          <w:szCs w:val="20"/>
-        </w:rPr>
-        <w:t>-{{text}}</w:t>
-      </w:r>
-    </w:p>
-    <w:p>
-      <w:pPr>
-        <w:spacing w:after="0" w:line="240" w:lineRule="auto"/>
-        <w:jc w:val="both"/>
-        <w:rPr>
-          <w:rFonts w:ascii="Kalinga" w:hAnsi="Kalinga" w:cs="Kalinga"/>
-          <w:b w:val="0"/>
-          <w:bCs w:val="0"/>
-          <w:sz w:val="20"/>
-          <w:szCs w:val="20"/>
-        </w:rPr>
-      </w:pPr>
-      <w:r>
-        <w:rPr>
-          <w:rFonts w:hint="default" w:ascii="Kalinga" w:hAnsi="Kalinga"/>
-          <w:b w:val="0"/>
-          <w:bCs w:val="0"/>
-          <w:sz w:val="20"/>
-          <w:szCs w:val="20"/>
-        </w:rPr>
-        <w:t>{{/list_verifikasi_rekan_kerja}}</w:t>
-      </w:r>
-    </w:p>
-    <w:p>
-      <w:pPr>
-        <w:spacing w:after="0" w:line="240" w:lineRule="auto"/>
-        <w:jc w:val="both"/>
-        <w:rPr>
-          <w:rFonts w:ascii="Kalinga" w:hAnsi="Kalinga" w:cs="Kalinga"/>
-          <w:b/>
-          <w:bCs/>
-          <w:sz w:val="20"/>
-          <w:szCs w:val="20"/>
-        </w:rPr>
-      </w:pPr>
-    </w:p>
-    <w:p>
-      <w:pPr>
-        <w:spacing w:after="0" w:line="240" w:lineRule="auto"/>
-        <w:jc w:val="both"/>
-        <w:rPr>
-          <w:rFonts w:hint="default" w:ascii="Kalinga" w:hAnsi="Kalinga"/>
-          <w:b/>
-          <w:bCs/>
-          <w:sz w:val="20"/>
-          <w:szCs w:val="20"/>
-          <w:lang w:val="en-US"/>
-        </w:rPr>
-      </w:pPr>
-      <w:r>
-        <w:rPr>
-          <w:rFonts w:hint="default" w:ascii="Kalinga" w:hAnsi="Kalinga"/>
-          <w:b/>
-          <w:bCs/>
-          <w:sz w:val="20"/>
-          <w:szCs w:val="20"/>
-        </w:rPr>
-        <w:t xml:space="preserve">Tgl. Call Memo </w:t>
-      </w:r>
-      <w:r>
-        <w:rPr>
-          <w:rFonts w:hint="default" w:ascii="Kalinga" w:hAnsi="Kalinga"/>
-          <w:b/>
-          <w:bCs/>
-          <w:sz w:val="20"/>
-          <w:szCs w:val="20"/>
-        </w:rPr>
-        <w:tab/>
-      </w:r>
-      <w:r>
-        <w:rPr>
-          <w:rFonts w:hint="default" w:ascii="Kalinga" w:hAnsi="Kalinga"/>
-          <w:b/>
-          <w:bCs/>
-          <w:sz w:val="20"/>
-          <w:szCs w:val="20"/>
-        </w:rPr>
-        <w:tab/>
-      </w:r>
-      <w:r>
-        <w:rPr>
-          <w:rFonts w:hint="default" w:ascii="Kalinga" w:hAnsi="Kalinga"/>
-          <w:b/>
-          <w:bCs/>
-          <w:sz w:val="20"/>
-          <w:szCs w:val="20"/>
-        </w:rPr>
-        <w:t>:</w:t>
-      </w:r>
-      <w:r>
-        <w:rPr>
-          <w:rFonts w:hint="default" w:ascii="Kalinga" w:hAnsi="Kalinga"/>
-          <w:b/>
-          <w:bCs/>
-          <w:sz w:val="20"/>
-          <w:szCs w:val="20"/>
-          <w:lang w:val="en-US"/>
-        </w:rPr>
-        <w:t xml:space="preserve"> {{</w:t>
-      </w:r>
-      <w:r>
-        <w:rPr>
-          <w:rFonts w:hint="default" w:ascii="Kalinga" w:hAnsi="Kalinga"/>
-          <w:b/>
-          <w:bCs/>
-          <w:sz w:val="20"/>
-          <w:szCs w:val="20"/>
-        </w:rPr>
-        <w:t>tgl_call_memo</w:t>
-      </w:r>
-      <w:r>
-        <w:rPr>
-          <w:rFonts w:hint="default" w:ascii="Kalinga" w:hAnsi="Kalinga"/>
-          <w:b/>
-          <w:bCs/>
-          <w:sz w:val="20"/>
-          <w:szCs w:val="20"/>
-          <w:lang w:val="en-US"/>
-        </w:rPr>
-        <w:t>}}</w:t>
-      </w:r>
-    </w:p>
-    <w:p>
-      <w:pPr>
-        <w:spacing w:after="0" w:line="240" w:lineRule="auto"/>
-        <w:jc w:val="both"/>
-        <w:rPr>
-          <w:rFonts w:hint="default" w:ascii="Kalinga" w:hAnsi="Kalinga"/>
-          <w:b/>
-          <w:bCs/>
-          <w:sz w:val="20"/>
-          <w:szCs w:val="20"/>
-          <w:lang w:val="en-US"/>
-        </w:rPr>
-      </w:pPr>
-      <w:r>
-        <w:rPr>
-          <w:rFonts w:hint="default" w:ascii="Kalinga" w:hAnsi="Kalinga"/>
-          <w:b/>
-          <w:bCs/>
-          <w:sz w:val="20"/>
-          <w:szCs w:val="20"/>
-        </w:rPr>
-        <w:t xml:space="preserve">Bentuk Call </w:t>
-      </w:r>
-      <w:r>
-        <w:rPr>
-          <w:rFonts w:hint="default" w:ascii="Kalinga" w:hAnsi="Kalinga"/>
-          <w:b/>
-          <w:bCs/>
-          <w:sz w:val="20"/>
-          <w:szCs w:val="20"/>
-        </w:rPr>
-        <w:tab/>
-      </w:r>
-      <w:r>
-        <w:rPr>
-          <w:rFonts w:hint="default" w:ascii="Kalinga" w:hAnsi="Kalinga"/>
-          <w:b/>
-          <w:bCs/>
-          <w:sz w:val="20"/>
-          <w:szCs w:val="20"/>
-        </w:rPr>
-        <w:tab/>
-      </w:r>
-      <w:r>
-        <w:rPr>
-          <w:rFonts w:hint="default" w:ascii="Kalinga" w:hAnsi="Kalinga"/>
-          <w:b/>
-          <w:bCs/>
-          <w:sz w:val="20"/>
-          <w:szCs w:val="20"/>
-        </w:rPr>
-        <w:t>:</w:t>
-      </w:r>
-      <w:r>
-        <w:rPr>
-          <w:rFonts w:hint="default" w:ascii="Kalinga" w:hAnsi="Kalinga"/>
-          <w:b/>
-          <w:bCs/>
-          <w:sz w:val="20"/>
-          <w:szCs w:val="20"/>
-          <w:lang w:val="en-US"/>
-        </w:rPr>
-        <w:t xml:space="preserve"> </w:t>
-      </w:r>
-      <w:r>
-        <w:rPr>
-          <w:rFonts w:hint="default" w:ascii="Kalinga" w:hAnsi="Kalinga"/>
-          <w:b/>
-          <w:bCs/>
-          <w:sz w:val="20"/>
-          <w:szCs w:val="20"/>
-        </w:rPr>
-        <w:t>Browsing Internet di alamat www.flagging.taspen.co.id</w:t>
-      </w:r>
-      <w:r>
-        <w:rPr>
-          <w:rFonts w:hint="default" w:ascii="Kalinga" w:hAnsi="Kalinga"/>
-          <w:b/>
-          <w:bCs/>
-          <w:sz w:val="20"/>
-          <w:szCs w:val="20"/>
-          <w:lang w:val="en-US"/>
-        </w:rPr>
-        <w:t>.</w:t>
-      </w:r>
-    </w:p>
-    <w:p>
-      <w:pPr>
-        <w:spacing w:after="0" w:line="240" w:lineRule="auto"/>
-        <w:jc w:val="both"/>
-        <w:rPr>
-          <w:rFonts w:hint="default" w:ascii="Kalinga" w:hAnsi="Kalinga"/>
-          <w:b/>
-          <w:bCs/>
-          <w:sz w:val="20"/>
-          <w:szCs w:val="20"/>
-        </w:rPr>
-      </w:pPr>
-      <w:r>
-        <w:rPr>
-          <w:rFonts w:hint="default" w:ascii="Kalinga" w:hAnsi="Kalinga"/>
-          <w:b/>
-          <w:bCs/>
-          <w:sz w:val="20"/>
-          <w:szCs w:val="20"/>
-        </w:rPr>
-        <w:t xml:space="preserve">Tujuan Call </w:t>
-      </w:r>
-      <w:r>
-        <w:rPr>
-          <w:rFonts w:hint="default" w:ascii="Kalinga" w:hAnsi="Kalinga"/>
-          <w:b/>
-          <w:bCs/>
-          <w:sz w:val="20"/>
-          <w:szCs w:val="20"/>
-        </w:rPr>
-        <w:tab/>
-      </w:r>
-      <w:r>
-        <w:rPr>
-          <w:rFonts w:hint="default" w:ascii="Kalinga" w:hAnsi="Kalinga"/>
-          <w:b/>
-          <w:bCs/>
-          <w:sz w:val="20"/>
-          <w:szCs w:val="20"/>
-        </w:rPr>
-        <w:tab/>
-      </w:r>
-      <w:r>
-        <w:rPr>
-          <w:rFonts w:hint="default" w:ascii="Kalinga" w:hAnsi="Kalinga"/>
-          <w:b/>
-          <w:bCs/>
-          <w:sz w:val="20"/>
-          <w:szCs w:val="20"/>
-        </w:rPr>
-        <w:t>: Konfirmasi Gaji Pemohon</w:t>
-      </w:r>
-    </w:p>
     <w:bookmarkEnd w:id="39"/>
     <w:p>
       <w:pPr>
@@ -2843,25 +2900,30 @@
     </w:p>
     <w:p>
       <w:pPr>
-        <w:spacing w:after="0" w:line="240" w:lineRule="auto"/>
-        <w:jc w:val="both"/>
-        <w:rPr>
-          <w:rFonts w:hint="default" w:ascii="Kalinga" w:hAnsi="Kalinga"/>
-          <w:b w:val="0"/>
-          <w:bCs w:val="0"/>
-          <w:sz w:val="20"/>
-          <w:szCs w:val="20"/>
-        </w:rPr>
-      </w:pPr>
-      <w:r>
-        <w:rPr>
-          <w:rFonts w:hint="default" w:ascii="Kalinga" w:hAnsi="Kalinga"/>
-          <w:b w:val="0"/>
-          <w:bCs w:val="0"/>
-          <w:sz w:val="20"/>
-          <w:szCs w:val="20"/>
-        </w:rPr>
-        <w:t>-{{text}}</w:t>
+        <w:numPr>
+          <w:ilvl w:val="0"/>
+          <w:numId w:val="1"/>
+        </w:numPr>
+        <w:spacing w:after="0" w:line="240" w:lineRule="auto"/>
+        <w:ind w:left="440" w:leftChars="0" w:hanging="360" w:firstLineChars="0"/>
+        <w:jc w:val="both"/>
+        <w:rPr>
+          <w:rFonts w:hint="default" w:ascii="Kalinga" w:hAnsi="Kalinga"/>
+          <w:b w:val="0"/>
+          <w:bCs w:val="0"/>
+          <w:sz w:val="20"/>
+          <w:szCs w:val="20"/>
+        </w:rPr>
+      </w:pPr>
+      <w:r>
+        <w:rPr>
+          <w:rFonts w:hint="default" w:ascii="Kalinga" w:hAnsi="Kalinga"/>
+          <w:b w:val="0"/>
+          <w:bCs w:val="0"/>
+          <w:sz w:val="20"/>
+          <w:szCs w:val="20"/>
+        </w:rPr>
+        <w:t>{{text}}</w:t>
       </w:r>
     </w:p>
     <w:p>
@@ -3310,23 +3372,24 @@
       <w:pPr>
         <w:numPr>
           <w:ilvl w:val="0"/>
-          <w:numId w:val="0"/>
+          <w:numId w:val="1"/>
         </w:numPr>
         <w:spacing w:after="0" w:line="240" w:lineRule="auto"/>
-        <w:jc w:val="both"/>
-        <w:rPr>
-          <w:rFonts w:hint="default" w:ascii="Kalinga" w:hAnsi="Kalinga"/>
-          <w:sz w:val="20"/>
-          <w:szCs w:val="20"/>
-        </w:rPr>
-      </w:pPr>
-      <w:r>
-        <w:rPr>
-          <w:rFonts w:hint="default" w:ascii="Kalinga" w:hAnsi="Kalinga"/>
-          <w:sz w:val="20"/>
-          <w:szCs w:val="20"/>
-        </w:rPr>
-        <w:t>-{{text}}</w:t>
+        <w:ind w:left="440" w:leftChars="0" w:hanging="360" w:firstLineChars="0"/>
+        <w:jc w:val="both"/>
+        <w:rPr>
+          <w:rFonts w:hint="default" w:ascii="Kalinga" w:hAnsi="Kalinga"/>
+          <w:sz w:val="20"/>
+          <w:szCs w:val="20"/>
+        </w:rPr>
+      </w:pPr>
+      <w:r>
+        <w:rPr>
+          <w:rFonts w:hint="default" w:ascii="Kalinga" w:hAnsi="Kalinga"/>
+          <w:sz w:val="20"/>
+          <w:szCs w:val="20"/>
+        </w:rPr>
+        <w:t>{{text}}</w:t>
       </w:r>
     </w:p>
     <w:p>
@@ -3351,8 +3414,6 @@
         </w:rPr>
         <w:t>{{/list_verifikasi_kerabat}}</w:t>
       </w:r>
-      <w:bookmarkStart w:id="52" w:name="_GoBack"/>
-      <w:bookmarkEnd w:id="52"/>
     </w:p>
     <w:p>
       <w:pPr>
@@ -3936,6 +3997,36 @@
     </w:p>
     <w:p>
       <w:pPr>
+        <w:numPr>
+          <w:ilvl w:val="0"/>
+          <w:numId w:val="1"/>
+        </w:numPr>
+        <w:spacing w:after="0" w:line="240" w:lineRule="auto"/>
+        <w:ind w:left="440" w:leftChars="0" w:hanging="360" w:firstLineChars="0"/>
+        <w:jc w:val="both"/>
+        <w:rPr>
+          <w:rFonts w:hint="default" w:ascii="Kalinga" w:hAnsi="Kalinga"/>
+          <w:b w:val="0"/>
+          <w:bCs w:val="0"/>
+          <w:color w:val="auto"/>
+          <w:sz w:val="20"/>
+          <w:szCs w:val="20"/>
+        </w:rPr>
+      </w:pPr>
+      <w:r>
+        <w:rPr>
+          <w:rFonts w:hint="default" w:ascii="Kalinga" w:hAnsi="Kalinga"/>
+          <w:b w:val="0"/>
+          <w:bCs w:val="0"/>
+          <w:color w:val="auto"/>
+          <w:sz w:val="20"/>
+          <w:szCs w:val="20"/>
+        </w:rPr>
+        <w:t>Fasilitas Kredit {{jenis_kredit}} di {{nama_bank}} maks Rp. {{plafon_maks}} outs Rp. {{outstanding}} angsuran Rp. {{angsuran}} Coll {{kolektibilitas}}. {{alasan}}</w:t>
+      </w:r>
+    </w:p>
+    <w:p>
+      <w:pPr>
         <w:spacing w:after="0" w:line="240" w:lineRule="auto"/>
         <w:ind w:left="0" w:leftChars="0" w:firstLine="0" w:firstLineChars="0"/>
         <w:jc w:val="both"/>
@@ -3957,7 +4048,7 @@
           <w:sz w:val="20"/>
           <w:szCs w:val="20"/>
         </w:rPr>
-        <w:t>-Fasilitas Kredit {{jenis_kredit}} di {{nama_bank}} maks Rp. {{plafon_maks}} outs Rp. {{outstanding}} angsuran Rp. {{angsuran}} Coll {{kolektibilitas}}. {{alasan}}</w:t>
+        <w:t>{{/list_fasilitas_kredit}}</w:t>
       </w:r>
     </w:p>
     <w:p>
@@ -3983,59 +4074,37 @@
           <w:sz w:val="20"/>
           <w:szCs w:val="20"/>
         </w:rPr>
-        <w:t>{{/list_fasilitas_kredit}}</w:t>
-      </w:r>
-    </w:p>
-    <w:p>
-      <w:pPr>
-        <w:spacing w:after="0" w:line="240" w:lineRule="auto"/>
-        <w:ind w:left="0" w:leftChars="0" w:firstLine="0" w:firstLineChars="0"/>
-        <w:jc w:val="both"/>
-        <w:rPr>
-          <w:rFonts w:hint="default" w:ascii="Kalinga" w:hAnsi="Kalinga"/>
-          <w:b w:val="0"/>
-          <w:bCs w:val="0"/>
-          <w:color w:val="auto"/>
-          <w:sz w:val="20"/>
-          <w:szCs w:val="20"/>
-        </w:rPr>
-      </w:pPr>
-      <w:r>
-        <w:rPr>
-          <w:rFonts w:hint="default" w:ascii="Kalinga" w:hAnsi="Kalinga"/>
-          <w:b w:val="0"/>
-          <w:bCs w:val="0"/>
-          <w:color w:val="auto"/>
-          <w:sz w:val="20"/>
-          <w:szCs w:val="20"/>
-        </w:rPr>
         <w:t>{{^list_fasilitas_kredit}}</w:t>
       </w:r>
     </w:p>
     <w:p>
       <w:pPr>
-        <w:spacing w:after="0" w:line="240" w:lineRule="auto"/>
-        <w:ind w:left="0" w:leftChars="0" w:firstLine="0" w:firstLineChars="0"/>
-        <w:jc w:val="both"/>
-        <w:rPr>
-          <w:rFonts w:hint="default" w:ascii="Kalinga" w:hAnsi="Kalinga"/>
-          <w:b w:val="0"/>
-          <w:bCs w:val="0"/>
-          <w:color w:val="auto"/>
-          <w:sz w:val="20"/>
-          <w:szCs w:val="20"/>
-        </w:rPr>
-      </w:pPr>
-      <w:r>
-        <w:rPr>
-          <w:rFonts w:hint="default" w:ascii="Kalinga" w:hAnsi="Kalinga"/>
-          <w:b w:val="0"/>
-          <w:bCs w:val="0"/>
-          <w:color w:val="auto"/>
-          <w:sz w:val="20"/>
-          <w:szCs w:val="20"/>
-        </w:rPr>
-        <w:t>-Nihil - Tidak ada fasilitas kredit</w:t>
+        <w:numPr>
+          <w:ilvl w:val="0"/>
+          <w:numId w:val="1"/>
+        </w:numPr>
+        <w:spacing w:after="0" w:line="240" w:lineRule="auto"/>
+        <w:ind w:left="440" w:leftChars="0" w:hanging="360" w:firstLineChars="0"/>
+        <w:jc w:val="both"/>
+        <w:rPr>
+          <w:rFonts w:hint="default" w:ascii="Kalinga" w:hAnsi="Kalinga"/>
+          <w:b w:val="0"/>
+          <w:bCs w:val="0"/>
+          <w:color w:val="auto"/>
+          <w:sz w:val="20"/>
+          <w:szCs w:val="20"/>
+        </w:rPr>
+      </w:pPr>
+      <w:r>
+        <w:rPr>
+          <w:rFonts w:hint="default" w:ascii="Kalinga" w:hAnsi="Kalinga"/>
+          <w:b w:val="0"/>
+          <w:bCs w:val="0"/>
+          <w:color w:val="auto"/>
+          <w:sz w:val="20"/>
+          <w:szCs w:val="20"/>
+        </w:rPr>
+        <w:t>Nihil - Tidak ada fasilitas kredit</w:t>
       </w:r>
     </w:p>
     <w:p>
@@ -4616,8 +4685,8 @@
         </w:rPr>
       </w:pPr>
       <w:bookmarkStart w:id="40" w:name="OLE_LINK53"/>
-      <w:bookmarkStart w:id="41" w:name="OLE_LINK12"/>
-      <w:bookmarkStart w:id="42" w:name="OLE_LINK32"/>
+      <w:bookmarkStart w:id="41" w:name="OLE_LINK32"/>
+      <w:bookmarkStart w:id="42" w:name="OLE_LINK12"/>
       <w:bookmarkStart w:id="43" w:name="OLE_LINK57"/>
       <w:bookmarkStart w:id="44" w:name="OLE_LINK16"/>
     </w:p>
@@ -5051,13 +5120,12 @@
     </w:p>
     <w:p>
       <w:pPr>
-        <w:pStyle w:val="6"/>
         <w:numPr>
           <w:ilvl w:val="0"/>
           <w:numId w:val="1"/>
         </w:numPr>
-        <w:spacing w:line="240" w:lineRule="auto"/>
-        <w:ind w:left="360" w:leftChars="0" w:right="160" w:rightChars="0" w:hanging="280" w:firstLineChars="0"/>
+        <w:spacing w:after="0" w:line="240" w:lineRule="auto"/>
+        <w:ind w:left="440" w:leftChars="0" w:hanging="360" w:firstLineChars="0"/>
         <w:jc w:val="both"/>
         <w:rPr>
           <w:rFonts w:ascii="Kalinga" w:hAnsi="Kalinga" w:cs="Kalinga"/>
@@ -5100,13 +5168,13 @@
           <w:szCs w:val="20"/>
         </w:rPr>
       </w:pPr>
-      <w:bookmarkStart w:id="45" w:name="OLE_LINK40"/>
-      <w:bookmarkStart w:id="46" w:name="OLE_LINK13"/>
-      <w:bookmarkStart w:id="47" w:name="OLE_LINK58"/>
-      <w:bookmarkStart w:id="48" w:name="OLE_LINK24"/>
-      <w:bookmarkStart w:id="49" w:name="OLE_LINK23"/>
-      <w:bookmarkStart w:id="50" w:name="OLE_LINK64"/>
-      <w:bookmarkStart w:id="51" w:name="OLE_LINK70"/>
+      <w:bookmarkStart w:id="45" w:name="OLE_LINK24"/>
+      <w:bookmarkStart w:id="46" w:name="OLE_LINK40"/>
+      <w:bookmarkStart w:id="47" w:name="OLE_LINK13"/>
+      <w:bookmarkStart w:id="48" w:name="OLE_LINK58"/>
+      <w:bookmarkStart w:id="49" w:name="OLE_LINK70"/>
+      <w:bookmarkStart w:id="50" w:name="OLE_LINK23"/>
+      <w:bookmarkStart w:id="51" w:name="OLE_LINK64"/>
       <w:r>
         <w:rPr>
           <w:rFonts w:ascii="Kalinga" w:hAnsi="Kalinga" w:cs="Kalinga"/>
@@ -5166,13 +5234,12 @@
     </w:p>
     <w:p>
       <w:pPr>
-        <w:pStyle w:val="6"/>
         <w:numPr>
           <w:ilvl w:val="0"/>
           <w:numId w:val="1"/>
         </w:numPr>
-        <w:spacing w:line="240" w:lineRule="auto"/>
-        <w:ind w:left="360" w:leftChars="0" w:right="160" w:rightChars="0" w:hanging="280" w:firstLineChars="0"/>
+        <w:spacing w:after="0" w:line="240" w:lineRule="auto"/>
+        <w:ind w:left="440" w:leftChars="0" w:hanging="360" w:firstLineChars="0"/>
         <w:jc w:val="both"/>
         <w:rPr>
           <w:rFonts w:ascii="Kalinga" w:hAnsi="Kalinga" w:cs="Kalinga"/>
@@ -5180,6 +5247,8 @@
           <w:szCs w:val="20"/>
         </w:rPr>
       </w:pPr>
+      <w:bookmarkStart w:id="52" w:name="_GoBack"/>
+      <w:bookmarkEnd w:id="52"/>
       <w:r>
         <w:rPr>
           <w:rFonts w:hint="default" w:ascii="Kalinga" w:hAnsi="Kalinga"/>
@@ -5254,9 +5323,9 @@
 <file path=word/numbering.xml><?xml version="1.0" encoding="utf-8"?>
 <w:numbering xmlns:wpc="http://schemas.microsoft.com/office/word/2010/wordprocessingCanvas" xmlns:mc="http://schemas.openxmlformats.org/markup-compatibility/2006" xmlns:o="urn:schemas-microsoft-com:office:office" xmlns:r="http://schemas.openxmlformats.org/officeDocument/2006/relationships" xmlns:m="http://schemas.openxmlformats.org/officeDocument/2006/math" xmlns:v="urn:schemas-microsoft-com:vml" xmlns:wp14="http://schemas.microsoft.com/office/word/2010/wordprocessingDrawing" xmlns:wp="http://schemas.openxmlformats.org/drawingml/2006/wordprocessingDrawing" xmlns:w10="urn:schemas-microsoft-com:office:word" xmlns:w="http://schemas.openxmlformats.org/wordprocessingml/2006/main" xmlns:w14="http://schemas.microsoft.com/office/word/2010/wordml" xmlns:wpg="http://schemas.microsoft.com/office/word/2010/wordprocessingGroup" xmlns:wpi="http://schemas.microsoft.com/office/word/2010/wordprocessingInk" xmlns:wne="http://schemas.microsoft.com/office/word/2006/wordml" xmlns:wps="http://schemas.microsoft.com/office/word/2010/wordprocessingShape" xmlns:wpsCustomData="http://www.wps.cn/officeDocument/2013/wpsCustomData" mc:Ignorable="w14 wp14">
   <w:abstractNum w:abstractNumId="0">
-    <w:nsid w:val="7E9B36FC"/>
+    <w:nsid w:val="EBD8491B"/>
     <w:multiLevelType w:val="multilevel"/>
-    <w:tmpl w:val="7E9B36FC"/>
+    <w:tmpl w:val="EBD8491B"/>
     <w:lvl w:ilvl="0" w:tentative="0">
       <w:start w:val="1"/>
       <w:numFmt w:val="bullet"/>
@@ -5366,8 +5435,124 @@
       </w:rPr>
     </w:lvl>
   </w:abstractNum>
+  <w:abstractNum w:abstractNumId="1">
+    <w:nsid w:val="7E9B36FC"/>
+    <w:multiLevelType w:val="multilevel"/>
+    <w:tmpl w:val="7E9B36FC"/>
+    <w:lvl w:ilvl="0" w:tentative="0">
+      <w:start w:val="1"/>
+      <w:numFmt w:val="bullet"/>
+      <w:lvlText w:val="-"/>
+      <w:lvlJc w:val="left"/>
+      <w:pPr>
+        <w:ind w:left="720" w:hanging="360"/>
+      </w:pPr>
+      <w:rPr>
+        <w:rFonts w:hint="default" w:ascii="Cambria" w:hAnsi="Cambria" w:eastAsia="Calibri" w:cs="Arial"/>
+      </w:rPr>
+    </w:lvl>
+    <w:lvl w:ilvl="1" w:tentative="0">
+      <w:start w:val="1"/>
+      <w:numFmt w:val="bullet"/>
+      <w:lvlText w:val="o"/>
+      <w:lvlJc w:val="left"/>
+      <w:pPr>
+        <w:ind w:left="1440" w:hanging="360"/>
+      </w:pPr>
+      <w:rPr>
+        <w:rFonts w:hint="default" w:ascii="Courier New" w:hAnsi="Courier New" w:cs="Courier New"/>
+      </w:rPr>
+    </w:lvl>
+    <w:lvl w:ilvl="2" w:tentative="0">
+      <w:start w:val="1"/>
+      <w:numFmt w:val="bullet"/>
+      <w:lvlText w:val=""/>
+      <w:lvlJc w:val="left"/>
+      <w:pPr>
+        <w:ind w:left="2160" w:hanging="360"/>
+      </w:pPr>
+      <w:rPr>
+        <w:rFonts w:hint="default" w:ascii="Wingdings" w:hAnsi="Wingdings"/>
+      </w:rPr>
+    </w:lvl>
+    <w:lvl w:ilvl="3" w:tentative="0">
+      <w:start w:val="1"/>
+      <w:numFmt w:val="bullet"/>
+      <w:lvlText w:val=""/>
+      <w:lvlJc w:val="left"/>
+      <w:pPr>
+        <w:ind w:left="2880" w:hanging="360"/>
+      </w:pPr>
+      <w:rPr>
+        <w:rFonts w:hint="default" w:ascii="Symbol" w:hAnsi="Symbol"/>
+      </w:rPr>
+    </w:lvl>
+    <w:lvl w:ilvl="4" w:tentative="0">
+      <w:start w:val="1"/>
+      <w:numFmt w:val="bullet"/>
+      <w:lvlText w:val="o"/>
+      <w:lvlJc w:val="left"/>
+      <w:pPr>
+        <w:ind w:left="3600" w:hanging="360"/>
+      </w:pPr>
+      <w:rPr>
+        <w:rFonts w:hint="default" w:ascii="Courier New" w:hAnsi="Courier New" w:cs="Courier New"/>
+      </w:rPr>
+    </w:lvl>
+    <w:lvl w:ilvl="5" w:tentative="0">
+      <w:start w:val="1"/>
+      <w:numFmt w:val="bullet"/>
+      <w:lvlText w:val=""/>
+      <w:lvlJc w:val="left"/>
+      <w:pPr>
+        <w:ind w:left="4320" w:hanging="360"/>
+      </w:pPr>
+      <w:rPr>
+        <w:rFonts w:hint="default" w:ascii="Wingdings" w:hAnsi="Wingdings"/>
+      </w:rPr>
+    </w:lvl>
+    <w:lvl w:ilvl="6" w:tentative="0">
+      <w:start w:val="1"/>
+      <w:numFmt w:val="bullet"/>
+      <w:lvlText w:val=""/>
+      <w:lvlJc w:val="left"/>
+      <w:pPr>
+        <w:ind w:left="5040" w:hanging="360"/>
+      </w:pPr>
+      <w:rPr>
+        <w:rFonts w:hint="default" w:ascii="Symbol" w:hAnsi="Symbol"/>
+      </w:rPr>
+    </w:lvl>
+    <w:lvl w:ilvl="7" w:tentative="0">
+      <w:start w:val="1"/>
+      <w:numFmt w:val="bullet"/>
+      <w:lvlText w:val="o"/>
+      <w:lvlJc w:val="left"/>
+      <w:pPr>
+        <w:ind w:left="5760" w:hanging="360"/>
+      </w:pPr>
+      <w:rPr>
+        <w:rFonts w:hint="default" w:ascii="Courier New" w:hAnsi="Courier New" w:cs="Courier New"/>
+      </w:rPr>
+    </w:lvl>
+    <w:lvl w:ilvl="8" w:tentative="0">
+      <w:start w:val="1"/>
+      <w:numFmt w:val="bullet"/>
+      <w:lvlText w:val=""/>
+      <w:lvlJc w:val="left"/>
+      <w:pPr>
+        <w:ind w:left="6480" w:hanging="360"/>
+      </w:pPr>
+      <w:rPr>
+        <w:rFonts w:hint="default" w:ascii="Wingdings" w:hAnsi="Wingdings"/>
+      </w:rPr>
+    </w:lvl>
+  </w:abstractNum>
   <w:num w:numId="1">
     <w:abstractNumId w:val="0"/>
+  </w:num>
+  <w:num w:numId="2">
+    <w:abstractNumId w:val="1"/>
   </w:num>
 </w:numbering>
 </file>

</xml_diff>